<commit_message>
Add social media photos
</commit_message>
<xml_diff>
--- a/app/docx_templates/menora_life_followup.docx
+++ b/app/docx_templates/menora_life_followup.docx
@@ -143,7 +143,33 @@
           <w:lang w:eastAsia="he-IL" w:bidi="he-IL"/>
           <w14:ligatures w14:val="none"/>
         </w:rPr>
-        <w:t>{{ db.ref_number }}</w:t>
+        <w:t xml:space="preserve">{{ </w:t>
+      </w:r>
+      <w:r>
+        <w:rPr>
+          <w:rFonts w:ascii="Arial" w:eastAsia="Times New Roman" w:hAnsi="Arial" w:cs="Arial"/>
+          <w:b/>
+          <w:bCs/>
+          <w:kern w:val="0"/>
+          <w:sz w:val="26"/>
+          <w:szCs w:val="26"/>
+          <w:lang w:eastAsia="he-IL" w:bidi="he-IL"/>
+          <w14:ligatures w14:val="none"/>
+        </w:rPr>
+        <w:t>reference_no or db.ref_number</w:t>
+      </w:r>
+      <w:r>
+        <w:rPr>
+          <w:rFonts w:ascii="Arial" w:eastAsia="Times New Roman" w:hAnsi="Arial" w:cs="Arial"/>
+          <w:b/>
+          <w:bCs/>
+          <w:kern w:val="0"/>
+          <w:sz w:val="26"/>
+          <w:szCs w:val="26"/>
+          <w:lang w:eastAsia="he-IL" w:bidi="he-IL"/>
+          <w14:ligatures w14:val="none"/>
+        </w:rPr>
+        <w:t>}}</w:t>
       </w:r>
     </w:p>
     <w:bookmarkEnd w:id="0"/>
@@ -1814,19 +1840,8 @@
           <w:szCs w:val="26"/>
           <w:lang w:bidi="he-IL"/>
         </w:rPr>
-        <w:t xml:space="preserve">if </w:t>
-      </w:r>
-      <w:proofErr w:type="spellStart"/>
-      <w:r>
-        <w:rPr>
-          <w:rFonts w:ascii="Arial" w:hAnsi="Arial" w:cs="Arial"/>
-          <w:sz w:val="26"/>
-          <w:szCs w:val="26"/>
-          <w:lang w:bidi="he-IL"/>
-        </w:rPr>
-        <w:t>social_photos</w:t>
-      </w:r>
-      <w:proofErr w:type="spellEnd"/>
+        <w:t>if social_photos</w:t>
+      </w:r>
       <w:r>
         <w:rPr>
           <w:rFonts w:ascii="Arial" w:hAnsi="Arial" w:cs="Arial"/>
@@ -1865,9 +1880,39 @@
           <w:szCs w:val="26"/>
           <w:lang w:bidi="he-IL"/>
         </w:rPr>
-        <w:t xml:space="preserve">for </w:t>
-      </w:r>
-      <w:proofErr w:type="spellStart"/>
+        <w:t>for img in social_photos</w:t>
+      </w:r>
+      <w:r>
+        <w:rPr>
+          <w:rFonts w:ascii="Arial" w:hAnsi="Arial" w:cs="Arial"/>
+          <w:sz w:val="26"/>
+          <w:szCs w:val="26"/>
+          <w:rtl/>
+          <w:lang w:bidi="he-IL"/>
+        </w:rPr>
+        <w:t xml:space="preserve"> %}</w:t>
+      </w:r>
+    </w:p>
+    <w:p>
+      <w:pPr>
+        <w:spacing w:line="360" w:lineRule="auto"/>
+        <w:rPr>
+          <w:rFonts w:ascii="Arial" w:hAnsi="Arial" w:cs="Arial"/>
+          <w:sz w:val="26"/>
+          <w:szCs w:val="26"/>
+          <w:lang w:bidi="he-IL"/>
+        </w:rPr>
+      </w:pPr>
+      <w:r>
+        <w:rPr>
+          <w:rFonts w:ascii="Arial" w:hAnsi="Arial" w:cs="Arial"/>
+          <w:sz w:val="26"/>
+          <w:szCs w:val="26"/>
+          <w:rtl/>
+          <w:lang w:bidi="he-IL"/>
+        </w:rPr>
+        <w:t xml:space="preserve">{{ </w:t>
+      </w:r>
       <w:r>
         <w:rPr>
           <w:rFonts w:ascii="Arial" w:hAnsi="Arial" w:cs="Arial"/>
@@ -1877,36 +1922,15 @@
         </w:rPr>
         <w:t>img</w:t>
       </w:r>
-      <w:proofErr w:type="spellEnd"/>
-      <w:r>
-        <w:rPr>
-          <w:rFonts w:ascii="Arial" w:hAnsi="Arial" w:cs="Arial"/>
-          <w:sz w:val="26"/>
-          <w:szCs w:val="26"/>
-          <w:lang w:bidi="he-IL"/>
-        </w:rPr>
-        <w:t xml:space="preserve"> in </w:t>
-      </w:r>
-      <w:proofErr w:type="spellStart"/>
-      <w:r>
-        <w:rPr>
-          <w:rFonts w:ascii="Arial" w:hAnsi="Arial" w:cs="Arial"/>
-          <w:sz w:val="26"/>
-          <w:szCs w:val="26"/>
-          <w:lang w:bidi="he-IL"/>
-        </w:rPr>
-        <w:t>social_photos</w:t>
-      </w:r>
-      <w:proofErr w:type="spellEnd"/>
-      <w:r>
-        <w:rPr>
-          <w:rFonts w:ascii="Arial" w:hAnsi="Arial" w:cs="Arial"/>
-          <w:sz w:val="26"/>
-          <w:szCs w:val="26"/>
-          <w:rtl/>
-          <w:lang w:bidi="he-IL"/>
-        </w:rPr>
-        <w:t xml:space="preserve"> %}</w:t>
+      <w:r>
+        <w:rPr>
+          <w:rFonts w:ascii="Arial" w:hAnsi="Arial" w:cs="Arial"/>
+          <w:sz w:val="26"/>
+          <w:szCs w:val="26"/>
+          <w:rtl/>
+          <w:lang w:bidi="he-IL"/>
+        </w:rPr>
+        <w:t xml:space="preserve"> }}</w:t>
       </w:r>
     </w:p>
     <w:p>
@@ -1927,51 +1951,8 @@
           <w:rtl/>
           <w:lang w:bidi="he-IL"/>
         </w:rPr>
-        <w:t xml:space="preserve">{{ </w:t>
-      </w:r>
-      <w:proofErr w:type="spellStart"/>
-      <w:r>
-        <w:rPr>
-          <w:rFonts w:ascii="Arial" w:hAnsi="Arial" w:cs="Arial"/>
-          <w:sz w:val="26"/>
-          <w:szCs w:val="26"/>
-          <w:lang w:bidi="he-IL"/>
-        </w:rPr>
-        <w:t>img</w:t>
-      </w:r>
-      <w:proofErr w:type="spellEnd"/>
-      <w:r>
-        <w:rPr>
-          <w:rFonts w:ascii="Arial" w:hAnsi="Arial" w:cs="Arial"/>
-          <w:sz w:val="26"/>
-          <w:szCs w:val="26"/>
-          <w:rtl/>
-          <w:lang w:bidi="he-IL"/>
-        </w:rPr>
-        <w:t xml:space="preserve"> }}</w:t>
-      </w:r>
-    </w:p>
-    <w:p>
-      <w:pPr>
-        <w:spacing w:line="360" w:lineRule="auto"/>
-        <w:rPr>
-          <w:rFonts w:ascii="Arial" w:hAnsi="Arial" w:cs="Arial"/>
-          <w:sz w:val="26"/>
-          <w:szCs w:val="26"/>
-          <w:lang w:bidi="he-IL"/>
-        </w:rPr>
-      </w:pPr>
-      <w:r>
-        <w:rPr>
-          <w:rFonts w:ascii="Arial" w:hAnsi="Arial" w:cs="Arial"/>
-          <w:sz w:val="26"/>
-          <w:szCs w:val="26"/>
-          <w:rtl/>
-          <w:lang w:bidi="he-IL"/>
-        </w:rPr>
         <w:t xml:space="preserve">{% </w:t>
       </w:r>
-      <w:proofErr w:type="spellStart"/>
       <w:r>
         <w:rPr>
           <w:rFonts w:ascii="Arial" w:hAnsi="Arial" w:cs="Arial"/>
@@ -1981,7 +1962,6 @@
         </w:rPr>
         <w:t>endfor</w:t>
       </w:r>
-      <w:proofErr w:type="spellEnd"/>
       <w:r>
         <w:rPr>
           <w:rFonts w:ascii="Arial" w:hAnsi="Arial" w:cs="Arial"/>
@@ -3233,7 +3213,7 @@
         </mc:Choice>
         <mc:Fallback>
           <w:pict>
-            <v:rect w14:anchorId="45C19930" id="Rectangle 1" o:spid="_x0000_s1026" style="position:absolute;margin-left:-5pt;margin-top:-.55pt;width:16.6pt;height:16.6pt;z-index:-251654144;visibility:visible;mso-wrap-style:square;mso-height-percent:0;mso-wrap-distance-left:9pt;mso-wrap-distance-top:0;mso-wrap-distance-right:9pt;mso-wrap-distance-bottom:0;mso-position-horizontal:absolute;mso-position-horizontal-relative:text;mso-position-vertical:absolute;mso-position-vertical-relative:text;mso-height-percent:0;mso-height-relative:margin;v-text-anchor:middle" o:gfxdata="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" fillcolor="#272727 [2749]" stroked="f" strokeweight="1pt"/>
+            <v:rect w14:anchorId="6BCD05F1" id="Rectangle 1" o:spid="_x0000_s1026" style="position:absolute;margin-left:-5pt;margin-top:-.55pt;width:16.6pt;height:16.6pt;z-index:-251654144;visibility:visible;mso-wrap-style:square;mso-height-percent:0;mso-wrap-distance-left:9pt;mso-wrap-distance-top:0;mso-wrap-distance-right:9pt;mso-wrap-distance-bottom:0;mso-position-horizontal:absolute;mso-position-horizontal-relative:text;mso-position-vertical:absolute;mso-position-vertical-relative:text;mso-height-percent:0;mso-height-relative:margin;v-text-anchor:middle" o:gfxdata="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" fillcolor="#272727 [2749]" stroked="f" strokeweight="1pt"/>
           </w:pict>
         </mc:Fallback>
       </mc:AlternateContent>

</xml_diff>

<commit_message>
Add city to editor
</commit_message>
<xml_diff>
--- a/app/docx_templates/menora_life_followup.docx
+++ b/app/docx_templates/menora_life_followup.docx
@@ -145,7 +145,6 @@
         </w:rPr>
         <w:t xml:space="preserve">{{ </w:t>
       </w:r>
-      <w:proofErr w:type="spellStart"/>
       <w:r>
         <w:rPr>
           <w:rFonts w:ascii="Arial" w:eastAsia="Times New Roman" w:hAnsi="Arial" w:cs="Arial"/>
@@ -157,37 +156,8 @@
           <w:lang w:eastAsia="he-IL" w:bidi="he-IL"/>
           <w14:ligatures w14:val="none"/>
         </w:rPr>
-        <w:t>reference_no</w:t>
-      </w:r>
-      <w:proofErr w:type="spellEnd"/>
-      <w:r>
-        <w:rPr>
-          <w:rFonts w:ascii="Arial" w:eastAsia="Times New Roman" w:hAnsi="Arial" w:cs="Arial"/>
-          <w:b/>
-          <w:bCs/>
-          <w:kern w:val="0"/>
-          <w:sz w:val="26"/>
-          <w:szCs w:val="26"/>
-          <w:lang w:eastAsia="he-IL" w:bidi="he-IL"/>
-          <w14:ligatures w14:val="none"/>
-        </w:rPr>
-        <w:t xml:space="preserve"> or </w:t>
-      </w:r>
-      <w:proofErr w:type="spellStart"/>
-      <w:r>
-        <w:rPr>
-          <w:rFonts w:ascii="Arial" w:eastAsia="Times New Roman" w:hAnsi="Arial" w:cs="Arial"/>
-          <w:b/>
-          <w:bCs/>
-          <w:kern w:val="0"/>
-          <w:sz w:val="26"/>
-          <w:szCs w:val="26"/>
-          <w:lang w:eastAsia="he-IL" w:bidi="he-IL"/>
-          <w14:ligatures w14:val="none"/>
-        </w:rPr>
-        <w:t>db.ref_number</w:t>
-      </w:r>
-      <w:proofErr w:type="spellEnd"/>
+        <w:t>reference_no or db.ref_number</w:t>
+      </w:r>
       <w:r>
         <w:rPr>
           <w:rFonts w:ascii="Arial" w:eastAsia="Times New Roman" w:hAnsi="Arial" w:cs="Arial"/>
@@ -452,20 +422,68 @@
         <w:ind w:left="2160" w:firstLine="720"/>
         <w:jc w:val="both"/>
         <w:rPr>
+          <w:rFonts w:ascii="Arial" w:eastAsia="Times New Roman" w:hAnsi="Arial" w:cs="Arial"/>
+          <w:kern w:val="0"/>
+          <w:sz w:val="26"/>
+          <w:szCs w:val="26"/>
+          <w:lang w:eastAsia="he-IL" w:bidi="he-IL"/>
+          <w14:ligatures w14:val="none"/>
+        </w:rPr>
+      </w:pPr>
+      <w:r>
+        <w:rPr>
+          <w:rFonts w:ascii="Arial" w:eastAsia="Times New Roman" w:hAnsi="Arial" w:cs="Arial"/>
+          <w:kern w:val="0"/>
+          <w:sz w:val="26"/>
+          <w:szCs w:val="26"/>
+          <w:lang w:eastAsia="he-IL" w:bidi="he-IL"/>
+          <w14:ligatures w14:val="none"/>
+        </w:rPr>
+        <w:t xml:space="preserve"> </w:t>
+      </w:r>
+      <w:r>
+        <w:rPr>
           <w:rFonts w:ascii="Arial" w:eastAsia="Times New Roman" w:hAnsi="Arial" w:cs="Arial" w:hint="cs"/>
           <w:kern w:val="0"/>
           <w:sz w:val="26"/>
           <w:szCs w:val="26"/>
-          <w:lang w:eastAsia="he-IL" w:bidi="he-IL"/>
-          <w14:ligatures w14:val="none"/>
-        </w:rPr>
-      </w:pPr>
+          <w:rtl/>
+          <w:lang w:eastAsia="he-IL" w:bidi="he-IL"/>
+          <w14:ligatures w14:val="none"/>
+        </w:rPr>
+        <w:t xml:space="preserve">הנפגע  </w:t>
+      </w:r>
       <w:r>
         <w:rPr>
           <w:rFonts w:ascii="Arial" w:eastAsia="Times New Roman" w:hAnsi="Arial" w:cs="Arial"/>
           <w:kern w:val="0"/>
           <w:sz w:val="26"/>
           <w:szCs w:val="26"/>
+          <w:rtl/>
+          <w:lang w:eastAsia="he-IL" w:bidi="he-IL"/>
+          <w14:ligatures w14:val="none"/>
+        </w:rPr>
+        <w:tab/>
+      </w:r>
+      <w:r>
+        <w:rPr>
+          <w:rFonts w:ascii="Arial" w:eastAsia="Times New Roman" w:hAnsi="Arial" w:cs="Arial" w:hint="cs"/>
+          <w:kern w:val="0"/>
+          <w:sz w:val="26"/>
+          <w:szCs w:val="26"/>
+          <w:rtl/>
+          <w:lang w:eastAsia="he-IL" w:bidi="he-IL"/>
+          <w14:ligatures w14:val="none"/>
+        </w:rPr>
+        <w:t xml:space="preserve">  :  </w:t>
+      </w:r>
+      <w:r>
+        <w:rPr>
+          <w:rFonts w:ascii="Arial" w:eastAsia="Times New Roman" w:hAnsi="Arial" w:cs="Arial" w:hint="cs"/>
+          <w:kern w:val="0"/>
+          <w:sz w:val="26"/>
+          <w:szCs w:val="26"/>
+          <w:rtl/>
           <w:lang w:eastAsia="he-IL" w:bidi="he-IL"/>
           <w14:ligatures w14:val="none"/>
         </w:rPr>
@@ -473,6 +491,17 @@
       </w:r>
       <w:r>
         <w:rPr>
+          <w:rFonts w:ascii="Arial" w:eastAsia="Times New Roman" w:hAnsi="Arial" w:cs="Arial"/>
+          <w:kern w:val="0"/>
+          <w:sz w:val="26"/>
+          <w:szCs w:val="26"/>
+          <w:lang w:eastAsia="he-IL" w:bidi="he-IL"/>
+          <w14:ligatures w14:val="none"/>
+        </w:rPr>
+        <w:t>{{db.full_name}}</w:t>
+      </w:r>
+      <w:r>
+        <w:rPr>
           <w:rFonts w:ascii="Arial" w:eastAsia="Times New Roman" w:hAnsi="Arial" w:cs="Arial" w:hint="cs"/>
           <w:kern w:val="0"/>
           <w:sz w:val="26"/>
@@ -481,7 +510,7 @@
           <w:lang w:eastAsia="he-IL" w:bidi="he-IL"/>
           <w14:ligatures w14:val="none"/>
         </w:rPr>
-        <w:t xml:space="preserve">הנפגע  </w:t>
+        <w:t xml:space="preserve">. </w:t>
       </w:r>
       <w:r>
         <w:rPr>
@@ -489,35 +518,10 @@
           <w:kern w:val="0"/>
           <w:sz w:val="26"/>
           <w:szCs w:val="26"/>
-          <w:rtl/>
-          <w:lang w:eastAsia="he-IL" w:bidi="he-IL"/>
-          <w14:ligatures w14:val="none"/>
-        </w:rPr>
-        <w:tab/>
-      </w:r>
-      <w:r>
-        <w:rPr>
-          <w:rFonts w:ascii="Arial" w:eastAsia="Times New Roman" w:hAnsi="Arial" w:cs="Arial" w:hint="cs"/>
-          <w:kern w:val="0"/>
-          <w:sz w:val="26"/>
-          <w:szCs w:val="26"/>
-          <w:rtl/>
-          <w:lang w:eastAsia="he-IL" w:bidi="he-IL"/>
-          <w14:ligatures w14:val="none"/>
-        </w:rPr>
-        <w:t xml:space="preserve">  :  </w:t>
-      </w:r>
-      <w:r>
-        <w:rPr>
-          <w:rFonts w:ascii="Arial" w:eastAsia="Times New Roman" w:hAnsi="Arial" w:cs="Arial" w:hint="cs"/>
-          <w:kern w:val="0"/>
-          <w:sz w:val="26"/>
-          <w:szCs w:val="26"/>
-          <w:rtl/>
-          <w:lang w:eastAsia="he-IL" w:bidi="he-IL"/>
-          <w14:ligatures w14:val="none"/>
-        </w:rPr>
-        <w:t xml:space="preserve"> </w:t>
+          <w:lang w:eastAsia="he-IL" w:bidi="he-IL"/>
+          <w14:ligatures w14:val="none"/>
+        </w:rPr>
+        <w:t>{{db.address}}</w:t>
       </w:r>
       <w:r>
         <w:rPr>
@@ -525,93 +529,10 @@
           <w:kern w:val="0"/>
           <w:sz w:val="26"/>
           <w:szCs w:val="26"/>
-          <w:lang w:eastAsia="he-IL" w:bidi="he-IL"/>
-          <w14:ligatures w14:val="none"/>
-        </w:rPr>
-        <w:t>{{</w:t>
-      </w:r>
-      <w:proofErr w:type="spellStart"/>
-      <w:r>
-        <w:rPr>
-          <w:rFonts w:ascii="Arial" w:eastAsia="Times New Roman" w:hAnsi="Arial" w:cs="Arial"/>
-          <w:kern w:val="0"/>
-          <w:sz w:val="26"/>
-          <w:szCs w:val="26"/>
-          <w:lang w:eastAsia="he-IL" w:bidi="he-IL"/>
-          <w14:ligatures w14:val="none"/>
-        </w:rPr>
-        <w:t>db.full_name</w:t>
-      </w:r>
-      <w:proofErr w:type="spellEnd"/>
-      <w:r>
-        <w:rPr>
-          <w:rFonts w:ascii="Arial" w:eastAsia="Times New Roman" w:hAnsi="Arial" w:cs="Arial"/>
-          <w:kern w:val="0"/>
-          <w:sz w:val="26"/>
-          <w:szCs w:val="26"/>
-          <w:lang w:eastAsia="he-IL" w:bidi="he-IL"/>
-          <w14:ligatures w14:val="none"/>
-        </w:rPr>
-        <w:t>}}</w:t>
-      </w:r>
-      <w:r>
-        <w:rPr>
-          <w:rFonts w:ascii="Arial" w:eastAsia="Times New Roman" w:hAnsi="Arial" w:cs="Arial" w:hint="cs"/>
-          <w:kern w:val="0"/>
-          <w:sz w:val="26"/>
-          <w:szCs w:val="26"/>
-          <w:rtl/>
-          <w:lang w:eastAsia="he-IL" w:bidi="he-IL"/>
-          <w14:ligatures w14:val="none"/>
-        </w:rPr>
-        <w:t xml:space="preserve">. </w:t>
-      </w:r>
-      <w:r>
-        <w:rPr>
-          <w:rFonts w:ascii="Arial" w:eastAsia="Times New Roman" w:hAnsi="Arial" w:cs="Arial"/>
-          <w:kern w:val="0"/>
-          <w:sz w:val="26"/>
-          <w:szCs w:val="26"/>
-          <w:lang w:eastAsia="he-IL" w:bidi="he-IL"/>
-          <w14:ligatures w14:val="none"/>
-        </w:rPr>
-        <w:t>{{</w:t>
-      </w:r>
-      <w:proofErr w:type="spellStart"/>
-      <w:r>
-        <w:rPr>
-          <w:rFonts w:ascii="Arial" w:eastAsia="Times New Roman" w:hAnsi="Arial" w:cs="Arial"/>
-          <w:kern w:val="0"/>
-          <w:sz w:val="26"/>
-          <w:szCs w:val="26"/>
-          <w:lang w:eastAsia="he-IL" w:bidi="he-IL"/>
-          <w14:ligatures w14:val="none"/>
-        </w:rPr>
-        <w:t>db.address</w:t>
-      </w:r>
-      <w:proofErr w:type="spellEnd"/>
-      <w:r>
-        <w:rPr>
-          <w:rFonts w:ascii="Arial" w:eastAsia="Times New Roman" w:hAnsi="Arial" w:cs="Arial"/>
-          <w:kern w:val="0"/>
-          <w:sz w:val="26"/>
-          <w:szCs w:val="26"/>
-          <w:lang w:eastAsia="he-IL" w:bidi="he-IL"/>
-          <w14:ligatures w14:val="none"/>
-        </w:rPr>
-        <w:t>}}</w:t>
-      </w:r>
-      <w:r>
-        <w:rPr>
-          <w:rFonts w:ascii="Arial" w:eastAsia="Times New Roman" w:hAnsi="Arial" w:cs="Arial" w:hint="cs"/>
-          <w:kern w:val="0"/>
-          <w:sz w:val="26"/>
-          <w:szCs w:val="26"/>
-          <w:rtl/>
           <w:lang w:val="en-ZA" w:eastAsia="he-IL" w:bidi="he-IL"/>
           <w14:ligatures w14:val="none"/>
         </w:rPr>
-        <w:t>.</w:t>
+        <w:t xml:space="preserve">  {{db.city}}</w:t>
       </w:r>
     </w:p>
     <w:p>
@@ -709,31 +630,7 @@
           <w:lang w:eastAsia="he-IL" w:bidi="he-IL"/>
           <w14:ligatures w14:val="none"/>
         </w:rPr>
-        <w:t>{{</w:t>
-      </w:r>
-      <w:proofErr w:type="spellStart"/>
-      <w:r>
-        <w:rPr>
-          <w:rFonts w:ascii="Arial" w:eastAsia="Times New Roman" w:hAnsi="Arial" w:cs="Arial"/>
-          <w:kern w:val="0"/>
-          <w:sz w:val="26"/>
-          <w:szCs w:val="26"/>
-          <w:lang w:eastAsia="he-IL" w:bidi="he-IL"/>
-          <w14:ligatures w14:val="none"/>
-        </w:rPr>
-        <w:t>db.id_number</w:t>
-      </w:r>
-      <w:proofErr w:type="spellEnd"/>
-      <w:r>
-        <w:rPr>
-          <w:rFonts w:ascii="Arial" w:eastAsia="Times New Roman" w:hAnsi="Arial" w:cs="Arial"/>
-          <w:kern w:val="0"/>
-          <w:sz w:val="26"/>
-          <w:szCs w:val="26"/>
-          <w:lang w:eastAsia="he-IL" w:bidi="he-IL"/>
-          <w14:ligatures w14:val="none"/>
-        </w:rPr>
-        <w:t>}}</w:t>
+        <w:t>{{db.id_number}}</w:t>
       </w:r>
     </w:p>
     <w:p>
@@ -831,31 +728,7 @@
           <w:lang w:eastAsia="he-IL" w:bidi="he-IL"/>
           <w14:ligatures w14:val="none"/>
         </w:rPr>
-        <w:t>{{</w:t>
-      </w:r>
-      <w:proofErr w:type="spellStart"/>
-      <w:r>
-        <w:rPr>
-          <w:rFonts w:ascii="Arial" w:eastAsia="Times New Roman" w:hAnsi="Arial" w:cs="Arial"/>
-          <w:kern w:val="0"/>
-          <w:sz w:val="26"/>
-          <w:szCs w:val="26"/>
-          <w:lang w:eastAsia="he-IL" w:bidi="he-IL"/>
-          <w14:ligatures w14:val="none"/>
-        </w:rPr>
-        <w:t>db.claim_number</w:t>
-      </w:r>
-      <w:proofErr w:type="spellEnd"/>
-      <w:r>
-        <w:rPr>
-          <w:rFonts w:ascii="Arial" w:eastAsia="Times New Roman" w:hAnsi="Arial" w:cs="Arial"/>
-          <w:kern w:val="0"/>
-          <w:sz w:val="26"/>
-          <w:szCs w:val="26"/>
-          <w:lang w:eastAsia="he-IL" w:bidi="he-IL"/>
-          <w14:ligatures w14:val="none"/>
-        </w:rPr>
-        <w:t>}}</w:t>
+        <w:t>{{db.claim_number}}</w:t>
       </w:r>
       <w:r>
         <w:rPr>
@@ -1005,7 +878,6 @@
         <w:tab/>
         <w:t xml:space="preserve">  :  {{ </w:t>
       </w:r>
-      <w:proofErr w:type="spellStart"/>
       <w:r>
         <w:rPr>
           <w:rFonts w:ascii="Arial" w:eastAsia="Times New Roman" w:hAnsi="Arial" w:cs="Arial"/>
@@ -1015,33 +887,8 @@
           <w:lang w:eastAsia="he-IL"/>
           <w14:ligatures w14:val="none"/>
         </w:rPr>
-        <w:t>ctx.injury_type</w:t>
-      </w:r>
-      <w:proofErr w:type="spellEnd"/>
-      <w:r>
-        <w:rPr>
-          <w:rFonts w:ascii="Arial" w:eastAsia="Times New Roman" w:hAnsi="Arial" w:cs="Arial"/>
-          <w:kern w:val="0"/>
-          <w:sz w:val="26"/>
-          <w:szCs w:val="26"/>
-          <w:lang w:eastAsia="he-IL"/>
-          <w14:ligatures w14:val="none"/>
-        </w:rPr>
-        <w:t xml:space="preserve"> or </w:t>
-      </w:r>
-      <w:proofErr w:type="spellStart"/>
-      <w:r>
-        <w:rPr>
-          <w:rFonts w:ascii="Arial" w:eastAsia="Times New Roman" w:hAnsi="Arial" w:cs="Arial"/>
-          <w:kern w:val="0"/>
-          <w:sz w:val="26"/>
-          <w:szCs w:val="26"/>
-          <w:lang w:eastAsia="he-IL"/>
-          <w14:ligatures w14:val="none"/>
-        </w:rPr>
-        <w:t>db.injury_type</w:t>
-      </w:r>
-      <w:proofErr w:type="spellEnd"/>
+        <w:t>ctx.injury_type or db.injury_type</w:t>
+      </w:r>
       <w:r>
         <w:rPr>
           <w:rFonts w:ascii="Arial" w:eastAsia="Times New Roman" w:hAnsi="Arial" w:cs="Arial"/>
@@ -1185,7 +1032,6 @@
         </w:rPr>
         <w:t xml:space="preserve">{{ </w:t>
       </w:r>
-      <w:proofErr w:type="spellStart"/>
       <w:r>
         <w:rPr>
           <w:rFonts w:ascii="Arial" w:eastAsia="Times New Roman" w:hAnsi="Arial" w:cs="Arial"/>
@@ -1197,7 +1043,6 @@
         </w:rPr>
         <w:t>db.phone</w:t>
       </w:r>
-      <w:proofErr w:type="spellEnd"/>
       <w:r>
         <w:rPr>
           <w:rFonts w:ascii="Arial" w:eastAsia="Times New Roman" w:hAnsi="Arial" w:cs="Arial"/>
@@ -1435,38 +1280,100 @@
           <w:szCs w:val="26"/>
           <w:lang w:bidi="he-IL"/>
         </w:rPr>
+        <w:t>{{ db.birth_year }}</w:t>
+      </w:r>
+      <w:r>
+        <w:rPr>
+          <w:rFonts w:ascii="Arial" w:hAnsi="Arial" w:cs="Arial" w:hint="cs"/>
+          <w:sz w:val="26"/>
+          <w:szCs w:val="26"/>
+          <w:rtl/>
+          <w:lang w:bidi="he-IL"/>
+        </w:rPr>
+        <w:t>,</w:t>
+      </w:r>
+      <w:r>
+        <w:rPr>
+          <w:rFonts w:ascii="Arial" w:hAnsi="Arial" w:cs="Arial" w:hint="cs"/>
+          <w:sz w:val="26"/>
+          <w:szCs w:val="26"/>
+          <w:rtl/>
+          <w:lang w:bidi="he-IL"/>
+        </w:rPr>
+        <w:t xml:space="preserve"> </w:t>
+      </w:r>
+      <w:r>
+        <w:rPr>
+          <w:rFonts w:ascii="Arial" w:hAnsi="Arial" w:cs="Arial"/>
+          <w:sz w:val="26"/>
+          <w:szCs w:val="26"/>
+          <w:rtl/>
+          <w:lang w:bidi="he-IL"/>
+        </w:rPr>
         <w:t xml:space="preserve">{{ </w:t>
       </w:r>
-      <w:proofErr w:type="spellStart"/>
-      <w:r>
-        <w:rPr>
-          <w:rFonts w:ascii="Arial" w:hAnsi="Arial" w:cs="Arial"/>
-          <w:sz w:val="26"/>
-          <w:szCs w:val="26"/>
-          <w:lang w:bidi="he-IL"/>
-        </w:rPr>
-        <w:t>db.birth_year</w:t>
-      </w:r>
-      <w:proofErr w:type="spellEnd"/>
-      <w:r>
-        <w:rPr>
-          <w:rFonts w:ascii="Arial" w:hAnsi="Arial" w:cs="Arial"/>
-          <w:sz w:val="26"/>
-          <w:szCs w:val="26"/>
+      <w:r>
+        <w:rPr>
+          <w:rFonts w:ascii="Arial" w:hAnsi="Arial" w:cs="Arial"/>
+          <w:sz w:val="26"/>
+          <w:szCs w:val="26"/>
+          <w:lang w:bidi="he-IL"/>
+        </w:rPr>
+        <w:t>db.background</w:t>
+      </w:r>
+      <w:r>
+        <w:rPr>
+          <w:rFonts w:ascii="Arial" w:hAnsi="Arial" w:cs="Arial"/>
+          <w:sz w:val="26"/>
+          <w:szCs w:val="26"/>
+          <w:rtl/>
           <w:lang w:bidi="he-IL"/>
         </w:rPr>
         <w:t xml:space="preserve"> }}</w:t>
       </w:r>
       <w:r>
         <w:rPr>
+          <w:rFonts w:ascii="Arial" w:hAnsi="Arial" w:cs="Arial"/>
+          <w:sz w:val="26"/>
+          <w:szCs w:val="26"/>
+          <w:lang w:bidi="he-IL"/>
+        </w:rPr>
+        <w:t>.</w:t>
+      </w:r>
+    </w:p>
+    <w:p>
+      <w:pPr>
+        <w:spacing w:line="360" w:lineRule="auto"/>
+        <w:rPr>
+          <w:rFonts w:ascii="Arial" w:hAnsi="Arial" w:cs="Arial"/>
+          <w:sz w:val="26"/>
+          <w:szCs w:val="26"/>
+          <w:rtl/>
+          <w:lang w:bidi="he-IL"/>
+        </w:rPr>
+      </w:pPr>
+      <w:r>
+        <w:rPr>
           <w:rFonts w:ascii="Arial" w:hAnsi="Arial" w:cs="Arial" w:hint="cs"/>
           <w:sz w:val="26"/>
           <w:szCs w:val="26"/>
           <w:rtl/>
           <w:lang w:bidi="he-IL"/>
         </w:rPr>
-        <w:t>,</w:t>
-      </w:r>
+        <w:t xml:space="preserve"> </w:t>
+      </w:r>
+    </w:p>
+    <w:p>
+      <w:pPr>
+        <w:spacing w:line="360" w:lineRule="auto"/>
+        <w:rPr>
+          <w:rFonts w:ascii="Arial" w:hAnsi="Arial" w:cs="Arial"/>
+          <w:sz w:val="26"/>
+          <w:szCs w:val="26"/>
+          <w:rtl/>
+          <w:lang w:bidi="he-IL"/>
+        </w:rPr>
+      </w:pPr>
       <w:r>
         <w:rPr>
           <w:rFonts w:ascii="Arial" w:hAnsi="Arial" w:cs="Arial" w:hint="cs"/>
@@ -1479,6 +1386,56 @@
       </w:r>
       <w:r>
         <w:rPr>
+          <w:rFonts w:ascii="Arial" w:hAnsi="Arial" w:cs="Arial" w:hint="cs"/>
+          <w:sz w:val="26"/>
+          <w:szCs w:val="26"/>
+          <w:rtl/>
+          <w:lang w:bidi="he-IL"/>
+        </w:rPr>
+        <w:t xml:space="preserve"> </w:t>
+      </w:r>
+    </w:p>
+    <w:p>
+      <w:pPr>
+        <w:spacing w:line="360" w:lineRule="auto"/>
+        <w:rPr>
+          <w:rFonts w:ascii="Arial" w:hAnsi="Arial" w:cs="Arial"/>
+          <w:b/>
+          <w:bCs/>
+          <w:sz w:val="26"/>
+          <w:szCs w:val="26"/>
+          <w:u w:val="single"/>
+          <w:rtl/>
+          <w:lang w:bidi="he-IL"/>
+        </w:rPr>
+      </w:pPr>
+      <w:r>
+        <w:rPr>
+          <w:rFonts w:ascii="Arial" w:hAnsi="Arial" w:cs="Arial" w:hint="cs"/>
+          <w:b/>
+          <w:bCs/>
+          <w:sz w:val="26"/>
+          <w:szCs w:val="26"/>
+          <w:u w:val="single"/>
+          <w:rtl/>
+          <w:lang w:bidi="he-IL"/>
+        </w:rPr>
+        <w:t>עיסוק</w:t>
+      </w:r>
+    </w:p>
+    <w:p>
+      <w:pPr>
+        <w:spacing w:line="360" w:lineRule="auto"/>
+        <w:rPr>
+          <w:rFonts w:ascii="Arial" w:hAnsi="Arial" w:cs="Arial"/>
+          <w:sz w:val="26"/>
+          <w:szCs w:val="26"/>
+          <w:rtl/>
+          <w:lang w:bidi="he-IL"/>
+        </w:rPr>
+      </w:pPr>
+      <w:r>
+        <w:rPr>
           <w:rFonts w:ascii="Arial" w:hAnsi="Arial" w:cs="Arial"/>
           <w:sz w:val="26"/>
           <w:szCs w:val="26"/>
@@ -1487,17 +1444,15 @@
         </w:rPr>
         <w:t xml:space="preserve">{{ </w:t>
       </w:r>
-      <w:proofErr w:type="spellStart"/>
-      <w:r>
-        <w:rPr>
-          <w:rFonts w:ascii="Arial" w:hAnsi="Arial" w:cs="Arial"/>
-          <w:sz w:val="26"/>
-          <w:szCs w:val="26"/>
-          <w:lang w:bidi="he-IL"/>
-        </w:rPr>
-        <w:t>db.background</w:t>
-      </w:r>
-      <w:proofErr w:type="spellEnd"/>
+      <w:r>
+        <w:rPr>
+          <w:rFonts w:ascii="Arial" w:hAnsi="Arial" w:cs="Arial"/>
+          <w:sz w:val="26"/>
+          <w:szCs w:val="26"/>
+          <w:lang w:bidi="he-IL"/>
+        </w:rPr>
+        <w:t>db.occupation</w:t>
+      </w:r>
       <w:r>
         <w:rPr>
           <w:rFonts w:ascii="Arial" w:hAnsi="Arial" w:cs="Arial"/>
@@ -1529,9 +1484,591 @@
           <w:lang w:bidi="he-IL"/>
         </w:rPr>
       </w:pPr>
+    </w:p>
+    <w:p>
+      <w:pPr>
+        <w:spacing w:line="360" w:lineRule="auto"/>
+        <w:rPr>
+          <w:rFonts w:ascii="Arial" w:hAnsi="Arial" w:cs="Arial"/>
+          <w:sz w:val="26"/>
+          <w:szCs w:val="26"/>
+          <w:rtl/>
+          <w:lang w:bidi="he-IL"/>
+        </w:rPr>
+      </w:pPr>
+    </w:p>
+    <w:p>
+      <w:pPr>
+        <w:spacing w:line="360" w:lineRule="auto"/>
+        <w:rPr>
+          <w:rFonts w:ascii="Arial" w:hAnsi="Arial" w:cs="Arial"/>
+          <w:sz w:val="26"/>
+          <w:szCs w:val="26"/>
+          <w:rtl/>
+          <w:lang w:bidi="he-IL"/>
+        </w:rPr>
+      </w:pPr>
+    </w:p>
+    <w:p>
+      <w:pPr>
+        <w:spacing w:line="360" w:lineRule="auto"/>
+        <w:rPr>
+          <w:rFonts w:ascii="Arial" w:hAnsi="Arial" w:cs="Arial"/>
+          <w:sz w:val="26"/>
+          <w:szCs w:val="26"/>
+          <w:rtl/>
+          <w:lang w:bidi="he-IL"/>
+        </w:rPr>
+      </w:pPr>
       <w:r>
         <w:rPr>
           <w:rFonts w:ascii="Arial" w:hAnsi="Arial" w:cs="Arial" w:hint="cs"/>
+          <w:b/>
+          <w:bCs/>
+          <w:sz w:val="26"/>
+          <w:szCs w:val="26"/>
+          <w:u w:val="single"/>
+          <w:rtl/>
+          <w:lang w:bidi="he-IL"/>
+        </w:rPr>
+        <w:t>חקירת רשויות</w:t>
+      </w:r>
+    </w:p>
+    <w:p>
+      <w:pPr>
+        <w:spacing w:line="360" w:lineRule="auto"/>
+        <w:rPr>
+          <w:rFonts w:ascii="Arial" w:hAnsi="Arial" w:cs="Arial"/>
+          <w:sz w:val="26"/>
+          <w:szCs w:val="26"/>
+          <w:rtl/>
+          <w:lang w:bidi="he-IL"/>
+        </w:rPr>
+      </w:pPr>
+      <w:r>
+        <w:rPr>
+          <w:rFonts w:ascii="Arial" w:hAnsi="Arial" w:cs="Arial"/>
+          <w:sz w:val="26"/>
+          <w:szCs w:val="26"/>
+          <w:lang w:bidi="he-IL"/>
+        </w:rPr>
+        <w:t>{{ db.authorities_1 }}</w:t>
+      </w:r>
+      <w:r>
+        <w:rPr>
+          <w:rFonts w:ascii="Arial" w:hAnsi="Arial" w:cs="Arial"/>
+          <w:sz w:val="26"/>
+          <w:szCs w:val="26"/>
+          <w:lang w:bidi="he-IL"/>
+        </w:rPr>
+        <w:br/>
+      </w:r>
+      <w:r>
+        <w:rPr>
+          <w:rFonts w:ascii="Arial" w:hAnsi="Arial" w:cs="Arial"/>
+          <w:sz w:val="26"/>
+          <w:szCs w:val="26"/>
+          <w:rtl/>
+          <w:lang w:bidi="he-IL"/>
+        </w:rPr>
+        <w:t xml:space="preserve">{{ </w:t>
+      </w:r>
+      <w:r>
+        <w:rPr>
+          <w:rFonts w:ascii="Arial" w:hAnsi="Arial" w:cs="Arial"/>
+          <w:sz w:val="26"/>
+          <w:szCs w:val="26"/>
+          <w:lang w:bidi="he-IL"/>
+        </w:rPr>
+        <w:t>authorities_table_photo</w:t>
+      </w:r>
+      <w:r>
+        <w:rPr>
+          <w:rFonts w:ascii="Arial" w:hAnsi="Arial" w:cs="Arial"/>
+          <w:sz w:val="26"/>
+          <w:szCs w:val="26"/>
+          <w:rtl/>
+          <w:lang w:bidi="he-IL"/>
+        </w:rPr>
+        <w:t xml:space="preserve"> }}</w:t>
+      </w:r>
+    </w:p>
+    <w:p>
+      <w:pPr>
+        <w:spacing w:line="360" w:lineRule="auto"/>
+        <w:rPr>
+          <w:rFonts w:ascii="Arial" w:hAnsi="Arial" w:cs="Arial"/>
+          <w:sz w:val="26"/>
+          <w:szCs w:val="26"/>
+          <w:rtl/>
+          <w:lang w:bidi="he-IL"/>
+        </w:rPr>
+      </w:pPr>
+    </w:p>
+    <w:p>
+      <w:pPr>
+        <w:spacing w:line="360" w:lineRule="auto"/>
+        <w:rPr>
+          <w:rFonts w:ascii="Arial" w:hAnsi="Arial" w:cs="Arial"/>
+          <w:sz w:val="26"/>
+          <w:szCs w:val="26"/>
+          <w:lang w:bidi="he-IL"/>
+        </w:rPr>
+      </w:pPr>
+      <w:r>
+        <w:rPr>
+          <w:rFonts w:ascii="Arial" w:hAnsi="Arial" w:cs="Arial"/>
+          <w:sz w:val="26"/>
+          <w:szCs w:val="26"/>
+          <w:lang w:bidi="he-IL"/>
+        </w:rPr>
+        <w:t>{{db.dnb}}</w:t>
+      </w:r>
+    </w:p>
+    <w:p>
+      <w:pPr>
+        <w:spacing w:line="360" w:lineRule="auto"/>
+        <w:rPr>
+          <w:rFonts w:ascii="Arial" w:hAnsi="Arial" w:cs="Arial"/>
+          <w:sz w:val="26"/>
+          <w:szCs w:val="26"/>
+          <w:rtl/>
+          <w:lang w:bidi="he-IL"/>
+        </w:rPr>
+      </w:pPr>
+    </w:p>
+    <w:p>
+      <w:pPr>
+        <w:spacing w:line="360" w:lineRule="auto"/>
+        <w:rPr>
+          <w:rFonts w:ascii="Arial" w:hAnsi="Arial" w:cs="Arial"/>
+          <w:sz w:val="26"/>
+          <w:szCs w:val="26"/>
+          <w:rtl/>
+          <w:lang w:bidi="he-IL"/>
+        </w:rPr>
+      </w:pPr>
+      <w:r>
+        <w:rPr>
+          <w:rFonts w:ascii="Arial" w:hAnsi="Arial" w:cs="Arial" w:hint="cs"/>
+          <w:b/>
+          <w:bCs/>
+          <w:sz w:val="26"/>
+          <w:szCs w:val="26"/>
+          <w:u w:val="single"/>
+          <w:rtl/>
+          <w:lang w:bidi="he-IL"/>
+        </w:rPr>
+        <w:t>חקירת רשויות</w:t>
+      </w:r>
+    </w:p>
+    <w:p>
+      <w:pPr>
+        <w:spacing w:line="360" w:lineRule="auto"/>
+        <w:rPr>
+          <w:rFonts w:ascii="Arial" w:hAnsi="Arial" w:cs="Arial"/>
+          <w:sz w:val="26"/>
+          <w:szCs w:val="26"/>
+          <w:rtl/>
+          <w:lang w:bidi="he-IL"/>
+        </w:rPr>
+      </w:pPr>
+      <w:r>
+        <w:rPr>
+          <w:rFonts w:ascii="Arial" w:hAnsi="Arial" w:cs="Arial"/>
+          <w:sz w:val="26"/>
+          <w:szCs w:val="26"/>
+          <w:lang w:bidi="he-IL"/>
+        </w:rPr>
+        <w:t xml:space="preserve">{{ </w:t>
+      </w:r>
+      <w:r>
+        <w:rPr>
+          <w:rFonts w:ascii="Arial" w:hAnsi="Arial" w:cs="Arial"/>
+          <w:sz w:val="26"/>
+          <w:szCs w:val="26"/>
+          <w:lang w:bidi="he-IL"/>
+        </w:rPr>
+        <w:t xml:space="preserve">db.authorities_2 </w:t>
+      </w:r>
+      <w:r>
+        <w:rPr>
+          <w:rFonts w:ascii="Arial" w:hAnsi="Arial" w:cs="Arial"/>
+          <w:sz w:val="26"/>
+          <w:szCs w:val="26"/>
+          <w:lang w:bidi="he-IL"/>
+        </w:rPr>
+        <w:t>}}</w:t>
+      </w:r>
+      <w:r>
+        <w:rPr>
+          <w:rFonts w:ascii="Arial" w:hAnsi="Arial" w:cs="Arial"/>
+          <w:sz w:val="26"/>
+          <w:szCs w:val="26"/>
+          <w:lang w:bidi="he-IL"/>
+        </w:rPr>
+        <w:br/>
+      </w:r>
+      <w:r>
+        <w:rPr>
+          <w:rFonts w:ascii="Arial" w:hAnsi="Arial" w:cs="Arial"/>
+          <w:sz w:val="26"/>
+          <w:szCs w:val="26"/>
+          <w:lang w:bidi="he-IL"/>
+        </w:rPr>
+        <w:br/>
+      </w:r>
+      <w:r>
+        <w:rPr>
+          <w:rFonts w:ascii="Arial" w:hAnsi="Arial" w:cs="Arial"/>
+          <w:sz w:val="26"/>
+          <w:szCs w:val="26"/>
+          <w:rtl/>
+          <w:lang w:bidi="he-IL"/>
+        </w:rPr>
+        <w:t xml:space="preserve">{{ </w:t>
+      </w:r>
+      <w:r>
+        <w:rPr>
+          <w:rFonts w:ascii="Arial" w:hAnsi="Arial" w:cs="Arial"/>
+          <w:sz w:val="26"/>
+          <w:szCs w:val="26"/>
+          <w:lang w:bidi="he-IL"/>
+        </w:rPr>
+        <w:t>authorities_table_photo_2</w:t>
+      </w:r>
+      <w:r>
+        <w:rPr>
+          <w:rFonts w:ascii="Arial" w:hAnsi="Arial" w:cs="Arial"/>
+          <w:sz w:val="26"/>
+          <w:szCs w:val="26"/>
+          <w:rtl/>
+          <w:lang w:bidi="he-IL"/>
+        </w:rPr>
+        <w:t xml:space="preserve"> }}</w:t>
+      </w:r>
+      <w:r>
+        <w:rPr>
+          <w:rFonts w:ascii="Arial" w:hAnsi="Arial" w:cs="Arial"/>
+          <w:sz w:val="26"/>
+          <w:szCs w:val="26"/>
+          <w:rtl/>
+          <w:lang w:bidi="he-IL"/>
+        </w:rPr>
+        <w:br/>
+      </w:r>
+      <w:r>
+        <w:rPr>
+          <w:rFonts w:ascii="Arial" w:hAnsi="Arial" w:cs="Arial"/>
+          <w:sz w:val="26"/>
+          <w:szCs w:val="26"/>
+          <w:rtl/>
+          <w:lang w:bidi="he-IL"/>
+        </w:rPr>
+        <w:br/>
+      </w:r>
+    </w:p>
+    <w:p>
+      <w:pPr>
+        <w:spacing w:line="360" w:lineRule="auto"/>
+        <w:rPr>
+          <w:rFonts w:ascii="Arial" w:hAnsi="Arial" w:cs="Arial"/>
+          <w:b/>
+          <w:bCs/>
+          <w:sz w:val="26"/>
+          <w:szCs w:val="26"/>
+          <w:u w:val="single"/>
+          <w:rtl/>
+          <w:lang w:bidi="he-IL"/>
+        </w:rPr>
+      </w:pPr>
+      <w:r>
+        <w:rPr>
+          <w:rFonts w:ascii="Arial" w:hAnsi="Arial" w:cs="Arial" w:hint="cs"/>
+          <w:b/>
+          <w:bCs/>
+          <w:sz w:val="26"/>
+          <w:szCs w:val="26"/>
+          <w:u w:val="single"/>
+          <w:rtl/>
+          <w:lang w:bidi="he-IL"/>
+        </w:rPr>
+        <w:t>ח</w:t>
+      </w:r>
+      <w:r>
+        <w:rPr>
+          <w:rFonts w:ascii="Arial" w:hAnsi="Arial" w:cs="Arial" w:hint="cs"/>
+          <w:b/>
+          <w:bCs/>
+          <w:sz w:val="26"/>
+          <w:szCs w:val="26"/>
+          <w:u w:val="single"/>
+          <w:rtl/>
+          <w:lang w:bidi="he-IL"/>
+        </w:rPr>
+        <w:t>קירות במאגרי מידע</w:t>
+      </w:r>
+    </w:p>
+    <w:p>
+      <w:pPr>
+        <w:spacing w:line="360" w:lineRule="auto"/>
+        <w:rPr>
+          <w:rFonts w:ascii="Arial" w:hAnsi="Arial" w:cs="Arial"/>
+          <w:sz w:val="26"/>
+          <w:szCs w:val="26"/>
+          <w:lang w:bidi="he-IL"/>
+        </w:rPr>
+      </w:pPr>
+      <w:r>
+        <w:rPr>
+          <w:rFonts w:ascii="Arial" w:hAnsi="Arial" w:cs="Arial" w:hint="cs"/>
+          <w:sz w:val="26"/>
+          <w:szCs w:val="26"/>
+          <w:rtl/>
+          <w:lang w:bidi="he-IL"/>
+        </w:rPr>
+        <w:t xml:space="preserve">בסריקה ברשת האינטרנט ובמדיה החברתית </w:t>
+      </w:r>
+      <w:r>
+        <w:rPr>
+          <w:rFonts w:ascii="Arial" w:hAnsi="Arial" w:cs="Arial"/>
+          <w:sz w:val="26"/>
+          <w:szCs w:val="26"/>
+          <w:lang w:bidi="he-IL"/>
+        </w:rPr>
+        <w:t>{{db.social_media}}</w:t>
+      </w:r>
+      <w:r>
+        <w:rPr>
+          <w:rFonts w:ascii="Arial" w:hAnsi="Arial" w:cs="Arial"/>
+          <w:sz w:val="26"/>
+          <w:szCs w:val="26"/>
+          <w:lang w:bidi="he-IL"/>
+        </w:rPr>
+        <w:br/>
+      </w:r>
+      <w:r>
+        <w:rPr>
+          <w:rFonts w:ascii="Arial" w:hAnsi="Arial" w:cs="Arial"/>
+          <w:sz w:val="26"/>
+          <w:szCs w:val="26"/>
+          <w:lang w:bidi="he-IL"/>
+        </w:rPr>
+        <w:br/>
+      </w:r>
+      <w:r>
+        <w:rPr>
+          <w:rFonts w:ascii="Arial" w:hAnsi="Arial" w:cs="Arial"/>
+          <w:sz w:val="26"/>
+          <w:szCs w:val="26"/>
+          <w:rtl/>
+          <w:lang w:bidi="he-IL"/>
+        </w:rPr>
+        <w:t xml:space="preserve">{% </w:t>
+      </w:r>
+      <w:r>
+        <w:rPr>
+          <w:rFonts w:ascii="Arial" w:hAnsi="Arial" w:cs="Arial"/>
+          <w:sz w:val="26"/>
+          <w:szCs w:val="26"/>
+          <w:lang w:bidi="he-IL"/>
+        </w:rPr>
+        <w:t>if social_photos</w:t>
+      </w:r>
+      <w:r>
+        <w:rPr>
+          <w:rFonts w:ascii="Arial" w:hAnsi="Arial" w:cs="Arial"/>
+          <w:sz w:val="26"/>
+          <w:szCs w:val="26"/>
+          <w:rtl/>
+          <w:lang w:bidi="he-IL"/>
+        </w:rPr>
+        <w:t xml:space="preserve"> %}</w:t>
+      </w:r>
+    </w:p>
+    <w:p>
+      <w:pPr>
+        <w:spacing w:line="360" w:lineRule="auto"/>
+        <w:rPr>
+          <w:rFonts w:ascii="Arial" w:hAnsi="Arial" w:cs="Arial"/>
+          <w:sz w:val="26"/>
+          <w:szCs w:val="26"/>
+          <w:lang w:bidi="he-IL"/>
+        </w:rPr>
+      </w:pPr>
+      <w:r>
+        <w:rPr>
+          <w:rFonts w:ascii="Arial" w:hAnsi="Arial" w:cs="Arial"/>
+          <w:sz w:val="26"/>
+          <w:szCs w:val="26"/>
+          <w:rtl/>
+          <w:lang w:bidi="he-IL"/>
+        </w:rPr>
+        <w:t xml:space="preserve">{% </w:t>
+      </w:r>
+      <w:r>
+        <w:rPr>
+          <w:rFonts w:ascii="Arial" w:hAnsi="Arial" w:cs="Arial"/>
+          <w:sz w:val="26"/>
+          <w:szCs w:val="26"/>
+          <w:lang w:bidi="he-IL"/>
+        </w:rPr>
+        <w:t>for img in social_photos</w:t>
+      </w:r>
+      <w:r>
+        <w:rPr>
+          <w:rFonts w:ascii="Arial" w:hAnsi="Arial" w:cs="Arial"/>
+          <w:sz w:val="26"/>
+          <w:szCs w:val="26"/>
+          <w:rtl/>
+          <w:lang w:bidi="he-IL"/>
+        </w:rPr>
+        <w:t xml:space="preserve"> %}</w:t>
+      </w:r>
+    </w:p>
+    <w:p>
+      <w:pPr>
+        <w:spacing w:line="360" w:lineRule="auto"/>
+        <w:rPr>
+          <w:rFonts w:ascii="Arial" w:hAnsi="Arial" w:cs="Arial"/>
+          <w:sz w:val="26"/>
+          <w:szCs w:val="26"/>
+          <w:lang w:bidi="he-IL"/>
+        </w:rPr>
+      </w:pPr>
+      <w:r>
+        <w:rPr>
+          <w:rFonts w:ascii="Arial" w:hAnsi="Arial" w:cs="Arial"/>
+          <w:sz w:val="26"/>
+          <w:szCs w:val="26"/>
+          <w:rtl/>
+          <w:lang w:bidi="he-IL"/>
+        </w:rPr>
+        <w:t xml:space="preserve">{{ </w:t>
+      </w:r>
+      <w:r>
+        <w:rPr>
+          <w:rFonts w:ascii="Arial" w:hAnsi="Arial" w:cs="Arial"/>
+          <w:sz w:val="26"/>
+          <w:szCs w:val="26"/>
+          <w:lang w:bidi="he-IL"/>
+        </w:rPr>
+        <w:t>img</w:t>
+      </w:r>
+      <w:r>
+        <w:rPr>
+          <w:rFonts w:ascii="Arial" w:hAnsi="Arial" w:cs="Arial"/>
+          <w:sz w:val="26"/>
+          <w:szCs w:val="26"/>
+          <w:rtl/>
+          <w:lang w:bidi="he-IL"/>
+        </w:rPr>
+        <w:t xml:space="preserve"> }}</w:t>
+      </w:r>
+    </w:p>
+    <w:p>
+      <w:pPr>
+        <w:spacing w:line="360" w:lineRule="auto"/>
+        <w:rPr>
+          <w:rFonts w:ascii="Arial" w:hAnsi="Arial" w:cs="Arial"/>
+          <w:sz w:val="26"/>
+          <w:szCs w:val="26"/>
+          <w:lang w:bidi="he-IL"/>
+        </w:rPr>
+      </w:pPr>
+      <w:r>
+        <w:rPr>
+          <w:rFonts w:ascii="Arial" w:hAnsi="Arial" w:cs="Arial"/>
+          <w:sz w:val="26"/>
+          <w:szCs w:val="26"/>
+          <w:rtl/>
+          <w:lang w:bidi="he-IL"/>
+        </w:rPr>
+        <w:t xml:space="preserve">{% </w:t>
+      </w:r>
+      <w:r>
+        <w:rPr>
+          <w:rFonts w:ascii="Arial" w:hAnsi="Arial" w:cs="Arial"/>
+          <w:sz w:val="26"/>
+          <w:szCs w:val="26"/>
+          <w:lang w:bidi="he-IL"/>
+        </w:rPr>
+        <w:t>endfor</w:t>
+      </w:r>
+      <w:r>
+        <w:rPr>
+          <w:rFonts w:ascii="Arial" w:hAnsi="Arial" w:cs="Arial"/>
+          <w:sz w:val="26"/>
+          <w:szCs w:val="26"/>
+          <w:rtl/>
+          <w:lang w:bidi="he-IL"/>
+        </w:rPr>
+        <w:t xml:space="preserve"> %}</w:t>
+      </w:r>
+    </w:p>
+    <w:p>
+      <w:pPr>
+        <w:spacing w:line="360" w:lineRule="auto"/>
+        <w:rPr>
+          <w:rFonts w:ascii="Arial" w:hAnsi="Arial" w:cs="Arial"/>
+          <w:sz w:val="26"/>
+          <w:szCs w:val="26"/>
+          <w:rtl/>
+          <w:lang w:bidi="he-IL"/>
+        </w:rPr>
+      </w:pPr>
+      <w:r>
+        <w:rPr>
+          <w:rFonts w:ascii="Arial" w:hAnsi="Arial" w:cs="Arial"/>
+          <w:sz w:val="26"/>
+          <w:szCs w:val="26"/>
+          <w:rtl/>
+          <w:lang w:bidi="he-IL"/>
+        </w:rPr>
+        <w:t xml:space="preserve">{% </w:t>
+      </w:r>
+      <w:r>
+        <w:rPr>
+          <w:rFonts w:ascii="Arial" w:hAnsi="Arial" w:cs="Arial"/>
+          <w:sz w:val="26"/>
+          <w:szCs w:val="26"/>
+          <w:lang w:bidi="he-IL"/>
+        </w:rPr>
+        <w:t>endif</w:t>
+      </w:r>
+      <w:r>
+        <w:rPr>
+          <w:rFonts w:ascii="Arial" w:hAnsi="Arial" w:cs="Arial"/>
+          <w:sz w:val="26"/>
+          <w:szCs w:val="26"/>
+          <w:rtl/>
+          <w:lang w:bidi="he-IL"/>
+        </w:rPr>
+        <w:t xml:space="preserve"> %}</w:t>
+      </w:r>
+    </w:p>
+    <w:p>
+      <w:pPr>
+        <w:spacing w:line="360" w:lineRule="auto"/>
+        <w:rPr>
+          <w:rFonts w:ascii="Arial" w:hAnsi="Arial" w:cs="Arial"/>
+          <w:sz w:val="26"/>
+          <w:szCs w:val="26"/>
+          <w:rtl/>
+          <w:lang w:bidi="he-IL"/>
+        </w:rPr>
+      </w:pPr>
+    </w:p>
+    <w:p>
+      <w:pPr>
+        <w:spacing w:line="360" w:lineRule="auto"/>
+        <w:rPr>
+          <w:lang w:bidi="he-IL"/>
+        </w:rPr>
+      </w:pPr>
+      <w:r>
+        <w:rPr>
+          <w:rFonts w:ascii="Arial" w:hAnsi="Arial" w:cs="Arial" w:hint="cs"/>
           <w:sz w:val="26"/>
           <w:szCs w:val="26"/>
           <w:rtl/>
@@ -1539,18 +2076,6 @@
         </w:rPr>
         <w:t xml:space="preserve"> </w:t>
       </w:r>
-    </w:p>
-    <w:p>
-      <w:pPr>
-        <w:spacing w:line="360" w:lineRule="auto"/>
-        <w:rPr>
-          <w:rFonts w:ascii="Arial" w:hAnsi="Arial" w:cs="Arial"/>
-          <w:sz w:val="26"/>
-          <w:szCs w:val="26"/>
-          <w:rtl/>
-          <w:lang w:bidi="he-IL"/>
-        </w:rPr>
-      </w:pPr>
       <w:r>
         <w:rPr>
           <w:rFonts w:ascii="Arial" w:hAnsi="Arial" w:cs="Arial" w:hint="cs"/>
@@ -1559,7 +2084,17 @@
           <w:rtl/>
           <w:lang w:bidi="he-IL"/>
         </w:rPr>
-        <w:t xml:space="preserve"> </w:t>
+        <w:t xml:space="preserve">זיהוי </w:t>
+      </w:r>
+      <w:r>
+        <w:rPr>
+          <w:rFonts w:ascii="Arial" w:hAnsi="Arial" w:cs="Arial"/>
+          <w:sz w:val="26"/>
+          <w:szCs w:val="26"/>
+          <w:rtl/>
+          <w:lang w:bidi="he-IL"/>
+        </w:rPr>
+        <w:t>–</w:t>
       </w:r>
       <w:r>
         <w:rPr>
@@ -1569,12 +2104,39 @@
           <w:rtl/>
           <w:lang w:bidi="he-IL"/>
         </w:rPr>
-        <w:t xml:space="preserve"> </w:t>
-      </w:r>
-    </w:p>
-    <w:p>
-      <w:pPr>
-        <w:spacing w:line="360" w:lineRule="auto"/>
+        <w:t xml:space="preserve"> הנפגע זוהה ע</w:t>
+      </w:r>
+      <w:r>
+        <w:rPr>
+          <w:rFonts w:ascii="Arial" w:hAnsi="Arial" w:cs="Arial" w:hint="cs"/>
+          <w:sz w:val="26"/>
+          <w:szCs w:val="26"/>
+          <w:rtl/>
+          <w:lang w:bidi="he-IL"/>
+        </w:rPr>
+        <w:t xml:space="preserve">פ"י </w:t>
+      </w:r>
+      <w:r>
+        <w:rPr>
+          <w:rFonts w:ascii="Arial" w:hAnsi="Arial" w:cs="Arial"/>
+          <w:sz w:val="26"/>
+          <w:szCs w:val="26"/>
+          <w:lang w:bidi="he-IL"/>
+        </w:rPr>
+        <w:t>{{db.social_media</w:t>
+      </w:r>
+      <w:r>
+        <w:rPr>
+          <w:rFonts w:ascii="Arial" w:hAnsi="Arial" w:cs="Arial"/>
+          <w:sz w:val="26"/>
+          <w:szCs w:val="26"/>
+          <w:lang w:bidi="he-IL"/>
+        </w:rPr>
+        <w:t>_identification}}</w:t>
+      </w:r>
+    </w:p>
+    <w:p>
+      <w:pPr>
         <w:rPr>
           <w:rFonts w:ascii="Arial" w:hAnsi="Arial" w:cs="Arial"/>
           <w:b/>
@@ -1588,6 +2150,33 @@
       </w:pPr>
       <w:r>
         <w:rPr>
+          <w:rFonts w:ascii="Arial" w:hAnsi="Arial" w:cs="Arial"/>
+          <w:b/>
+          <w:bCs/>
+          <w:sz w:val="26"/>
+          <w:szCs w:val="26"/>
+          <w:u w:val="single"/>
+          <w:rtl/>
+          <w:lang w:bidi="he-IL"/>
+        </w:rPr>
+        <w:br/>
+      </w:r>
+    </w:p>
+    <w:p>
+      <w:pPr>
+        <w:rPr>
+          <w:rFonts w:ascii="Arial" w:hAnsi="Arial" w:cs="Arial"/>
+          <w:b/>
+          <w:bCs/>
+          <w:sz w:val="26"/>
+          <w:szCs w:val="26"/>
+          <w:u w:val="single"/>
+          <w:rtl/>
+          <w:lang w:bidi="he-IL"/>
+        </w:rPr>
+      </w:pPr>
+      <w:r>
+        <w:rPr>
           <w:rFonts w:ascii="Arial" w:hAnsi="Arial" w:cs="Arial" w:hint="cs"/>
           <w:b/>
           <w:bCs/>
@@ -1597,108 +2186,8 @@
           <w:rtl/>
           <w:lang w:bidi="he-IL"/>
         </w:rPr>
-        <w:t>עיסוק</w:t>
-      </w:r>
-    </w:p>
-    <w:p>
-      <w:pPr>
-        <w:spacing w:line="360" w:lineRule="auto"/>
-        <w:rPr>
-          <w:rFonts w:ascii="Arial" w:hAnsi="Arial" w:cs="Arial"/>
-          <w:sz w:val="26"/>
-          <w:szCs w:val="26"/>
-          <w:rtl/>
-          <w:lang w:bidi="he-IL"/>
-        </w:rPr>
-      </w:pPr>
-      <w:r>
-        <w:rPr>
-          <w:rFonts w:ascii="Arial" w:hAnsi="Arial" w:cs="Arial"/>
-          <w:sz w:val="26"/>
-          <w:szCs w:val="26"/>
-          <w:rtl/>
-          <w:lang w:bidi="he-IL"/>
-        </w:rPr>
-        <w:t xml:space="preserve">{{ </w:t>
-      </w:r>
-      <w:proofErr w:type="spellStart"/>
-      <w:r>
-        <w:rPr>
-          <w:rFonts w:ascii="Arial" w:hAnsi="Arial" w:cs="Arial"/>
-          <w:sz w:val="26"/>
-          <w:szCs w:val="26"/>
-          <w:lang w:bidi="he-IL"/>
-        </w:rPr>
-        <w:t>db.occupation</w:t>
-      </w:r>
-      <w:proofErr w:type="spellEnd"/>
-      <w:r>
-        <w:rPr>
-          <w:rFonts w:ascii="Arial" w:hAnsi="Arial" w:cs="Arial"/>
-          <w:sz w:val="26"/>
-          <w:szCs w:val="26"/>
-          <w:rtl/>
-          <w:lang w:bidi="he-IL"/>
-        </w:rPr>
-        <w:t xml:space="preserve"> }}</w:t>
-      </w:r>
-      <w:r>
-        <w:rPr>
-          <w:rFonts w:ascii="Arial" w:hAnsi="Arial" w:cs="Arial"/>
-          <w:sz w:val="26"/>
-          <w:szCs w:val="26"/>
-          <w:lang w:bidi="he-IL"/>
-        </w:rPr>
-        <w:t>.</w:t>
-      </w:r>
-    </w:p>
-    <w:p>
-      <w:pPr>
-        <w:spacing w:line="360" w:lineRule="auto"/>
-        <w:rPr>
-          <w:rFonts w:ascii="Arial" w:hAnsi="Arial" w:cs="Arial"/>
-          <w:sz w:val="26"/>
-          <w:szCs w:val="26"/>
-          <w:rtl/>
-          <w:lang w:bidi="he-IL"/>
-        </w:rPr>
-      </w:pPr>
-    </w:p>
-    <w:p>
-      <w:pPr>
-        <w:spacing w:line="360" w:lineRule="auto"/>
-        <w:rPr>
-          <w:rFonts w:ascii="Arial" w:hAnsi="Arial" w:cs="Arial"/>
-          <w:sz w:val="26"/>
-          <w:szCs w:val="26"/>
-          <w:rtl/>
-          <w:lang w:bidi="he-IL"/>
-        </w:rPr>
-      </w:pPr>
-    </w:p>
-    <w:p>
-      <w:pPr>
-        <w:spacing w:line="360" w:lineRule="auto"/>
-        <w:rPr>
-          <w:rFonts w:ascii="Arial" w:hAnsi="Arial" w:cs="Arial"/>
-          <w:sz w:val="26"/>
-          <w:szCs w:val="26"/>
-          <w:rtl/>
-          <w:lang w:bidi="he-IL"/>
-        </w:rPr>
-      </w:pPr>
-    </w:p>
-    <w:p>
-      <w:pPr>
-        <w:spacing w:line="360" w:lineRule="auto"/>
-        <w:rPr>
-          <w:rFonts w:ascii="Arial" w:hAnsi="Arial" w:cs="Arial"/>
-          <w:sz w:val="26"/>
-          <w:szCs w:val="26"/>
-          <w:rtl/>
-          <w:lang w:bidi="he-IL"/>
-        </w:rPr>
-      </w:pPr>
+        <w:t>מ</w:t>
+      </w:r>
       <w:r>
         <w:rPr>
           <w:rFonts w:ascii="Arial" w:hAnsi="Arial" w:cs="Arial" w:hint="cs"/>
@@ -1708,147 +2197,9 @@
           <w:szCs w:val="26"/>
           <w:u w:val="single"/>
           <w:rtl/>
-          <w:lang w:bidi="he-IL"/>
-        </w:rPr>
-        <w:t>חקירת רשויות</w:t>
-      </w:r>
-    </w:p>
-    <w:p>
-      <w:pPr>
-        <w:spacing w:line="360" w:lineRule="auto"/>
-        <w:rPr>
-          <w:rFonts w:ascii="Arial" w:hAnsi="Arial" w:cs="Arial"/>
-          <w:sz w:val="26"/>
-          <w:szCs w:val="26"/>
-          <w:rtl/>
-          <w:lang w:bidi="he-IL"/>
-        </w:rPr>
-      </w:pPr>
-      <w:r>
-        <w:rPr>
-          <w:rFonts w:ascii="Arial" w:hAnsi="Arial" w:cs="Arial"/>
-          <w:sz w:val="26"/>
-          <w:szCs w:val="26"/>
-          <w:lang w:bidi="he-IL"/>
-        </w:rPr>
-        <w:t>{{ db.authorities_1 }}</w:t>
-      </w:r>
-      <w:r>
-        <w:rPr>
-          <w:rFonts w:ascii="Arial" w:hAnsi="Arial" w:cs="Arial"/>
-          <w:sz w:val="26"/>
-          <w:szCs w:val="26"/>
-          <w:lang w:bidi="he-IL"/>
-        </w:rPr>
-        <w:br/>
-      </w:r>
-      <w:r>
-        <w:rPr>
-          <w:rFonts w:ascii="Arial" w:hAnsi="Arial" w:cs="Arial"/>
-          <w:sz w:val="26"/>
-          <w:szCs w:val="26"/>
-          <w:rtl/>
-          <w:lang w:bidi="he-IL"/>
-        </w:rPr>
-        <w:t xml:space="preserve">{{ </w:t>
-      </w:r>
-      <w:proofErr w:type="spellStart"/>
-      <w:r>
-        <w:rPr>
-          <w:rFonts w:ascii="Arial" w:hAnsi="Arial" w:cs="Arial"/>
-          <w:sz w:val="26"/>
-          <w:szCs w:val="26"/>
-          <w:lang w:bidi="he-IL"/>
-        </w:rPr>
-        <w:t>authorities_table_photo</w:t>
-      </w:r>
-      <w:proofErr w:type="spellEnd"/>
-      <w:r>
-        <w:rPr>
-          <w:rFonts w:ascii="Arial" w:hAnsi="Arial" w:cs="Arial"/>
-          <w:sz w:val="26"/>
-          <w:szCs w:val="26"/>
-          <w:rtl/>
-          <w:lang w:bidi="he-IL"/>
-        </w:rPr>
-        <w:t xml:space="preserve"> }}</w:t>
-      </w:r>
-    </w:p>
-    <w:p>
-      <w:pPr>
-        <w:spacing w:line="360" w:lineRule="auto"/>
-        <w:rPr>
-          <w:rFonts w:ascii="Arial" w:hAnsi="Arial" w:cs="Arial"/>
-          <w:sz w:val="26"/>
-          <w:szCs w:val="26"/>
-          <w:rtl/>
-          <w:lang w:bidi="he-IL"/>
-        </w:rPr>
-      </w:pPr>
-    </w:p>
-    <w:p>
-      <w:pPr>
-        <w:spacing w:line="360" w:lineRule="auto"/>
-        <w:rPr>
-          <w:rFonts w:ascii="Arial" w:hAnsi="Arial" w:cs="Arial"/>
-          <w:sz w:val="26"/>
-          <w:szCs w:val="26"/>
-          <w:lang w:bidi="he-IL"/>
-        </w:rPr>
-      </w:pPr>
-      <w:r>
-        <w:rPr>
-          <w:rFonts w:ascii="Arial" w:hAnsi="Arial" w:cs="Arial"/>
-          <w:sz w:val="26"/>
-          <w:szCs w:val="26"/>
-          <w:lang w:bidi="he-IL"/>
-        </w:rPr>
-        <w:t>{{</w:t>
-      </w:r>
-      <w:proofErr w:type="spellStart"/>
-      <w:r>
-        <w:rPr>
-          <w:rFonts w:ascii="Arial" w:hAnsi="Arial" w:cs="Arial"/>
-          <w:sz w:val="26"/>
-          <w:szCs w:val="26"/>
-          <w:lang w:bidi="he-IL"/>
-        </w:rPr>
-        <w:t>db.dnb</w:t>
-      </w:r>
-      <w:proofErr w:type="spellEnd"/>
-      <w:r>
-        <w:rPr>
-          <w:rFonts w:ascii="Arial" w:hAnsi="Arial" w:cs="Arial"/>
-          <w:sz w:val="26"/>
-          <w:szCs w:val="26"/>
-          <w:lang w:bidi="he-IL"/>
-        </w:rPr>
-        <w:t>}}</w:t>
-      </w:r>
-    </w:p>
-    <w:p>
-      <w:pPr>
-        <w:spacing w:line="360" w:lineRule="auto"/>
-        <w:rPr>
-          <w:rFonts w:ascii="Arial" w:hAnsi="Arial" w:cs="Arial"/>
-          <w:sz w:val="26"/>
-          <w:szCs w:val="26"/>
-          <w:rtl/>
-          <w:lang w:bidi="he-IL"/>
-        </w:rPr>
-      </w:pPr>
-    </w:p>
-    <w:p>
-      <w:pPr>
-        <w:spacing w:line="360" w:lineRule="auto"/>
-        <w:rPr>
-          <w:rFonts w:ascii="Arial" w:hAnsi="Arial" w:cs="Arial"/>
-          <w:sz w:val="26"/>
-          <w:szCs w:val="26"/>
-          <w:rtl/>
-          <w:lang w:bidi="he-IL"/>
-        </w:rPr>
-      </w:pPr>
+        </w:rPr>
+        <w:t>עקב מי</w:t>
+      </w:r>
       <w:r>
         <w:rPr>
           <w:rFonts w:ascii="Arial" w:hAnsi="Arial" w:cs="Arial" w:hint="cs"/>
@@ -1860,118 +2211,9 @@
           <w:rtl/>
           <w:lang w:bidi="he-IL"/>
         </w:rPr>
-        <w:t>חקירת רשויות</w:t>
-      </w:r>
-    </w:p>
-    <w:p>
-      <w:pPr>
-        <w:spacing w:line="360" w:lineRule="auto"/>
-        <w:rPr>
-          <w:rFonts w:ascii="Arial" w:hAnsi="Arial" w:cs="Arial"/>
-          <w:sz w:val="26"/>
-          <w:szCs w:val="26"/>
-          <w:rtl/>
-          <w:lang w:bidi="he-IL"/>
-        </w:rPr>
-      </w:pPr>
-      <w:r>
-        <w:rPr>
-          <w:rFonts w:ascii="Arial" w:hAnsi="Arial" w:cs="Arial"/>
-          <w:sz w:val="26"/>
-          <w:szCs w:val="26"/>
-          <w:lang w:bidi="he-IL"/>
-        </w:rPr>
-        <w:t xml:space="preserve">{{ </w:t>
-      </w:r>
-      <w:r>
-        <w:rPr>
-          <w:rFonts w:ascii="Arial" w:hAnsi="Arial" w:cs="Arial"/>
-          <w:sz w:val="26"/>
-          <w:szCs w:val="26"/>
-          <w:lang w:bidi="he-IL"/>
-        </w:rPr>
-        <w:t xml:space="preserve">db.authorities_2 </w:t>
-      </w:r>
-      <w:r>
-        <w:rPr>
-          <w:rFonts w:ascii="Arial" w:hAnsi="Arial" w:cs="Arial"/>
-          <w:sz w:val="26"/>
-          <w:szCs w:val="26"/>
-          <w:lang w:bidi="he-IL"/>
-        </w:rPr>
-        <w:t>}}</w:t>
-      </w:r>
-      <w:r>
-        <w:rPr>
-          <w:rFonts w:ascii="Arial" w:hAnsi="Arial" w:cs="Arial"/>
-          <w:sz w:val="26"/>
-          <w:szCs w:val="26"/>
-          <w:lang w:bidi="he-IL"/>
-        </w:rPr>
-        <w:br/>
-      </w:r>
-      <w:r>
-        <w:rPr>
-          <w:rFonts w:ascii="Arial" w:hAnsi="Arial" w:cs="Arial"/>
-          <w:sz w:val="26"/>
-          <w:szCs w:val="26"/>
-          <w:lang w:bidi="he-IL"/>
-        </w:rPr>
-        <w:br/>
-      </w:r>
-      <w:r>
-        <w:rPr>
-          <w:rFonts w:ascii="Arial" w:hAnsi="Arial" w:cs="Arial"/>
-          <w:sz w:val="26"/>
-          <w:szCs w:val="26"/>
-          <w:rtl/>
-          <w:lang w:bidi="he-IL"/>
-        </w:rPr>
-        <w:t xml:space="preserve">{{ </w:t>
-      </w:r>
-      <w:r>
-        <w:rPr>
-          <w:rFonts w:ascii="Arial" w:hAnsi="Arial" w:cs="Arial"/>
-          <w:sz w:val="26"/>
-          <w:szCs w:val="26"/>
-          <w:lang w:bidi="he-IL"/>
-        </w:rPr>
-        <w:t>authorities_table_photo_2</w:t>
-      </w:r>
-      <w:r>
-        <w:rPr>
-          <w:rFonts w:ascii="Arial" w:hAnsi="Arial" w:cs="Arial"/>
-          <w:sz w:val="26"/>
-          <w:szCs w:val="26"/>
-          <w:rtl/>
-          <w:lang w:bidi="he-IL"/>
-        </w:rPr>
-        <w:t xml:space="preserve"> }}</w:t>
-      </w:r>
-      <w:r>
-        <w:rPr>
-          <w:rFonts w:ascii="Arial" w:hAnsi="Arial" w:cs="Arial"/>
-          <w:sz w:val="26"/>
-          <w:szCs w:val="26"/>
-          <w:rtl/>
-          <w:lang w:bidi="he-IL"/>
-        </w:rPr>
-        <w:br/>
-      </w:r>
-      <w:r>
-        <w:rPr>
-          <w:rFonts w:ascii="Arial" w:hAnsi="Arial" w:cs="Arial"/>
-          <w:sz w:val="26"/>
-          <w:szCs w:val="26"/>
-          <w:rtl/>
-          <w:lang w:bidi="he-IL"/>
-        </w:rPr>
-        <w:br/>
-      </w:r>
-    </w:p>
-    <w:p>
-      <w:pPr>
-        <w:spacing w:line="360" w:lineRule="auto"/>
+        <w:t xml:space="preserve">ום </w:t>
+      </w:r>
+      <w:r>
         <w:rPr>
           <w:rFonts w:ascii="Arial" w:hAnsi="Arial" w:cs="Arial"/>
           <w:b/>
@@ -1979,564 +2221,9 @@
           <w:sz w:val="26"/>
           <w:szCs w:val="26"/>
           <w:u w:val="single"/>
-          <w:rtl/>
-          <w:lang w:bidi="he-IL"/>
-        </w:rPr>
-      </w:pPr>
-      <w:r>
-        <w:rPr>
-          <w:rFonts w:ascii="Arial" w:hAnsi="Arial" w:cs="Arial" w:hint="cs"/>
-          <w:b/>
-          <w:bCs/>
-          <w:sz w:val="26"/>
-          <w:szCs w:val="26"/>
-          <w:u w:val="single"/>
-          <w:rtl/>
-          <w:lang w:bidi="he-IL"/>
-        </w:rPr>
-        <w:t>ח</w:t>
-      </w:r>
-      <w:r>
-        <w:rPr>
-          <w:rFonts w:ascii="Arial" w:hAnsi="Arial" w:cs="Arial" w:hint="cs"/>
-          <w:b/>
-          <w:bCs/>
-          <w:sz w:val="26"/>
-          <w:szCs w:val="26"/>
-          <w:u w:val="single"/>
-          <w:rtl/>
-          <w:lang w:bidi="he-IL"/>
-        </w:rPr>
-        <w:t>קירות במאגרי מידע</w:t>
-      </w:r>
-    </w:p>
-    <w:p>
-      <w:pPr>
-        <w:spacing w:line="360" w:lineRule="auto"/>
-        <w:rPr>
-          <w:rFonts w:ascii="Arial" w:hAnsi="Arial" w:cs="Arial"/>
-          <w:sz w:val="26"/>
-          <w:szCs w:val="26"/>
-          <w:lang w:bidi="he-IL"/>
-        </w:rPr>
-      </w:pPr>
-      <w:r>
-        <w:rPr>
-          <w:rFonts w:ascii="Arial" w:hAnsi="Arial" w:cs="Arial" w:hint="cs"/>
-          <w:sz w:val="26"/>
-          <w:szCs w:val="26"/>
-          <w:rtl/>
-          <w:lang w:bidi="he-IL"/>
-        </w:rPr>
-        <w:t xml:space="preserve">בסריקה ברשת האינטרנט ובמדיה החברתית </w:t>
-      </w:r>
-      <w:r>
-        <w:rPr>
-          <w:rFonts w:ascii="Arial" w:hAnsi="Arial" w:cs="Arial"/>
-          <w:sz w:val="26"/>
-          <w:szCs w:val="26"/>
-          <w:lang w:bidi="he-IL"/>
-        </w:rPr>
-        <w:t>{{</w:t>
-      </w:r>
-      <w:proofErr w:type="spellStart"/>
-      <w:r>
-        <w:rPr>
-          <w:rFonts w:ascii="Arial" w:hAnsi="Arial" w:cs="Arial"/>
-          <w:sz w:val="26"/>
-          <w:szCs w:val="26"/>
-          <w:lang w:bidi="he-IL"/>
-        </w:rPr>
-        <w:t>db.social_media</w:t>
-      </w:r>
-      <w:proofErr w:type="spellEnd"/>
-      <w:r>
-        <w:rPr>
-          <w:rFonts w:ascii="Arial" w:hAnsi="Arial" w:cs="Arial"/>
-          <w:sz w:val="26"/>
-          <w:szCs w:val="26"/>
-          <w:lang w:bidi="he-IL"/>
-        </w:rPr>
-        <w:t>}}</w:t>
-      </w:r>
-      <w:r>
-        <w:rPr>
-          <w:rFonts w:ascii="Arial" w:hAnsi="Arial" w:cs="Arial"/>
-          <w:sz w:val="26"/>
-          <w:szCs w:val="26"/>
-          <w:lang w:bidi="he-IL"/>
-        </w:rPr>
-        <w:br/>
-      </w:r>
-      <w:r>
-        <w:rPr>
-          <w:rFonts w:ascii="Arial" w:hAnsi="Arial" w:cs="Arial"/>
-          <w:sz w:val="26"/>
-          <w:szCs w:val="26"/>
-          <w:lang w:bidi="he-IL"/>
-        </w:rPr>
-        <w:br/>
-      </w:r>
-      <w:r>
-        <w:rPr>
-          <w:rFonts w:ascii="Arial" w:hAnsi="Arial" w:cs="Arial"/>
-          <w:sz w:val="26"/>
-          <w:szCs w:val="26"/>
-          <w:rtl/>
-          <w:lang w:bidi="he-IL"/>
-        </w:rPr>
-        <w:t xml:space="preserve">{% </w:t>
-      </w:r>
-      <w:r>
-        <w:rPr>
-          <w:rFonts w:ascii="Arial" w:hAnsi="Arial" w:cs="Arial"/>
-          <w:sz w:val="26"/>
-          <w:szCs w:val="26"/>
-          <w:lang w:bidi="he-IL"/>
-        </w:rPr>
-        <w:t xml:space="preserve">if </w:t>
-      </w:r>
-      <w:proofErr w:type="spellStart"/>
-      <w:r>
-        <w:rPr>
-          <w:rFonts w:ascii="Arial" w:hAnsi="Arial" w:cs="Arial"/>
-          <w:sz w:val="26"/>
-          <w:szCs w:val="26"/>
-          <w:lang w:bidi="he-IL"/>
-        </w:rPr>
-        <w:t>social_photos</w:t>
-      </w:r>
-      <w:proofErr w:type="spellEnd"/>
-      <w:r>
-        <w:rPr>
-          <w:rFonts w:ascii="Arial" w:hAnsi="Arial" w:cs="Arial"/>
-          <w:sz w:val="26"/>
-          <w:szCs w:val="26"/>
-          <w:rtl/>
-          <w:lang w:bidi="he-IL"/>
-        </w:rPr>
-        <w:t xml:space="preserve"> %}</w:t>
-      </w:r>
-    </w:p>
-    <w:p>
-      <w:pPr>
-        <w:spacing w:line="360" w:lineRule="auto"/>
-        <w:rPr>
-          <w:rFonts w:ascii="Arial" w:hAnsi="Arial" w:cs="Arial"/>
-          <w:sz w:val="26"/>
-          <w:szCs w:val="26"/>
-          <w:lang w:bidi="he-IL"/>
-        </w:rPr>
-      </w:pPr>
-      <w:r>
-        <w:rPr>
-          <w:rFonts w:ascii="Arial" w:hAnsi="Arial" w:cs="Arial"/>
-          <w:sz w:val="26"/>
-          <w:szCs w:val="26"/>
-          <w:rtl/>
-          <w:lang w:bidi="he-IL"/>
-        </w:rPr>
-        <w:t xml:space="preserve">{% </w:t>
-      </w:r>
-      <w:r>
-        <w:rPr>
-          <w:rFonts w:ascii="Arial" w:hAnsi="Arial" w:cs="Arial"/>
-          <w:sz w:val="26"/>
-          <w:szCs w:val="26"/>
-          <w:lang w:bidi="he-IL"/>
-        </w:rPr>
-        <w:t xml:space="preserve">for </w:t>
-      </w:r>
-      <w:proofErr w:type="spellStart"/>
-      <w:r>
-        <w:rPr>
-          <w:rFonts w:ascii="Arial" w:hAnsi="Arial" w:cs="Arial"/>
-          <w:sz w:val="26"/>
-          <w:szCs w:val="26"/>
-          <w:lang w:bidi="he-IL"/>
-        </w:rPr>
-        <w:t>img</w:t>
-      </w:r>
-      <w:proofErr w:type="spellEnd"/>
-      <w:r>
-        <w:rPr>
-          <w:rFonts w:ascii="Arial" w:hAnsi="Arial" w:cs="Arial"/>
-          <w:sz w:val="26"/>
-          <w:szCs w:val="26"/>
-          <w:lang w:bidi="he-IL"/>
-        </w:rPr>
-        <w:t xml:space="preserve"> in </w:t>
-      </w:r>
-      <w:proofErr w:type="spellStart"/>
-      <w:r>
-        <w:rPr>
-          <w:rFonts w:ascii="Arial" w:hAnsi="Arial" w:cs="Arial"/>
-          <w:sz w:val="26"/>
-          <w:szCs w:val="26"/>
-          <w:lang w:bidi="he-IL"/>
-        </w:rPr>
-        <w:t>social_photos</w:t>
-      </w:r>
-      <w:proofErr w:type="spellEnd"/>
-      <w:r>
-        <w:rPr>
-          <w:rFonts w:ascii="Arial" w:hAnsi="Arial" w:cs="Arial"/>
-          <w:sz w:val="26"/>
-          <w:szCs w:val="26"/>
-          <w:rtl/>
-          <w:lang w:bidi="he-IL"/>
-        </w:rPr>
-        <w:t xml:space="preserve"> %}</w:t>
-      </w:r>
-    </w:p>
-    <w:p>
-      <w:pPr>
-        <w:spacing w:line="360" w:lineRule="auto"/>
-        <w:rPr>
-          <w:rFonts w:ascii="Arial" w:hAnsi="Arial" w:cs="Arial"/>
-          <w:sz w:val="26"/>
-          <w:szCs w:val="26"/>
-          <w:lang w:bidi="he-IL"/>
-        </w:rPr>
-      </w:pPr>
-      <w:r>
-        <w:rPr>
-          <w:rFonts w:ascii="Arial" w:hAnsi="Arial" w:cs="Arial"/>
-          <w:sz w:val="26"/>
-          <w:szCs w:val="26"/>
-          <w:rtl/>
-          <w:lang w:bidi="he-IL"/>
-        </w:rPr>
-        <w:t xml:space="preserve">{{ </w:t>
-      </w:r>
-      <w:proofErr w:type="spellStart"/>
-      <w:r>
-        <w:rPr>
-          <w:rFonts w:ascii="Arial" w:hAnsi="Arial" w:cs="Arial"/>
-          <w:sz w:val="26"/>
-          <w:szCs w:val="26"/>
-          <w:lang w:bidi="he-IL"/>
-        </w:rPr>
-        <w:t>img</w:t>
-      </w:r>
-      <w:proofErr w:type="spellEnd"/>
-      <w:r>
-        <w:rPr>
-          <w:rFonts w:ascii="Arial" w:hAnsi="Arial" w:cs="Arial"/>
-          <w:sz w:val="26"/>
-          <w:szCs w:val="26"/>
-          <w:rtl/>
-          <w:lang w:bidi="he-IL"/>
-        </w:rPr>
-        <w:t xml:space="preserve"> }}</w:t>
-      </w:r>
-    </w:p>
-    <w:p>
-      <w:pPr>
-        <w:spacing w:line="360" w:lineRule="auto"/>
-        <w:rPr>
-          <w:rFonts w:ascii="Arial" w:hAnsi="Arial" w:cs="Arial"/>
-          <w:sz w:val="26"/>
-          <w:szCs w:val="26"/>
-          <w:lang w:bidi="he-IL"/>
-        </w:rPr>
-      </w:pPr>
-      <w:r>
-        <w:rPr>
-          <w:rFonts w:ascii="Arial" w:hAnsi="Arial" w:cs="Arial"/>
-          <w:sz w:val="26"/>
-          <w:szCs w:val="26"/>
-          <w:rtl/>
-          <w:lang w:bidi="he-IL"/>
-        </w:rPr>
-        <w:t xml:space="preserve">{% </w:t>
-      </w:r>
-      <w:proofErr w:type="spellStart"/>
-      <w:r>
-        <w:rPr>
-          <w:rFonts w:ascii="Arial" w:hAnsi="Arial" w:cs="Arial"/>
-          <w:sz w:val="26"/>
-          <w:szCs w:val="26"/>
-          <w:lang w:bidi="he-IL"/>
-        </w:rPr>
-        <w:t>endfor</w:t>
-      </w:r>
-      <w:proofErr w:type="spellEnd"/>
-      <w:r>
-        <w:rPr>
-          <w:rFonts w:ascii="Arial" w:hAnsi="Arial" w:cs="Arial"/>
-          <w:sz w:val="26"/>
-          <w:szCs w:val="26"/>
-          <w:rtl/>
-          <w:lang w:bidi="he-IL"/>
-        </w:rPr>
-        <w:t xml:space="preserve"> %}</w:t>
-      </w:r>
-    </w:p>
-    <w:p>
-      <w:pPr>
-        <w:spacing w:line="360" w:lineRule="auto"/>
-        <w:rPr>
-          <w:rFonts w:ascii="Arial" w:hAnsi="Arial" w:cs="Arial"/>
-          <w:sz w:val="26"/>
-          <w:szCs w:val="26"/>
-          <w:rtl/>
-          <w:lang w:bidi="he-IL"/>
-        </w:rPr>
-      </w:pPr>
-      <w:r>
-        <w:rPr>
-          <w:rFonts w:ascii="Arial" w:hAnsi="Arial" w:cs="Arial"/>
-          <w:sz w:val="26"/>
-          <w:szCs w:val="26"/>
-          <w:rtl/>
-          <w:lang w:bidi="he-IL"/>
-        </w:rPr>
-        <w:t xml:space="preserve">{% </w:t>
-      </w:r>
-      <w:r>
-        <w:rPr>
-          <w:rFonts w:ascii="Arial" w:hAnsi="Arial" w:cs="Arial"/>
-          <w:sz w:val="26"/>
-          <w:szCs w:val="26"/>
-          <w:lang w:bidi="he-IL"/>
-        </w:rPr>
-        <w:t>endif</w:t>
-      </w:r>
-      <w:r>
-        <w:rPr>
-          <w:rFonts w:ascii="Arial" w:hAnsi="Arial" w:cs="Arial"/>
-          <w:sz w:val="26"/>
-          <w:szCs w:val="26"/>
-          <w:rtl/>
-          <w:lang w:bidi="he-IL"/>
-        </w:rPr>
-        <w:t xml:space="preserve"> %}</w:t>
-      </w:r>
-    </w:p>
-    <w:p>
-      <w:pPr>
-        <w:spacing w:line="360" w:lineRule="auto"/>
-        <w:rPr>
-          <w:rFonts w:ascii="Arial" w:hAnsi="Arial" w:cs="Arial"/>
-          <w:sz w:val="26"/>
-          <w:szCs w:val="26"/>
-          <w:rtl/>
-          <w:lang w:bidi="he-IL"/>
-        </w:rPr>
-      </w:pPr>
-    </w:p>
-    <w:p>
-      <w:pPr>
-        <w:spacing w:line="360" w:lineRule="auto"/>
-        <w:rPr>
-          <w:lang w:bidi="he-IL"/>
-        </w:rPr>
-      </w:pPr>
-      <w:r>
-        <w:rPr>
-          <w:rFonts w:ascii="Arial" w:hAnsi="Arial" w:cs="Arial" w:hint="cs"/>
-          <w:sz w:val="26"/>
-          <w:szCs w:val="26"/>
-          <w:rtl/>
-          <w:lang w:bidi="he-IL"/>
-        </w:rPr>
-        <w:t xml:space="preserve"> </w:t>
-      </w:r>
-      <w:r>
-        <w:rPr>
-          <w:rFonts w:ascii="Arial" w:hAnsi="Arial" w:cs="Arial" w:hint="cs"/>
-          <w:sz w:val="26"/>
-          <w:szCs w:val="26"/>
-          <w:rtl/>
-          <w:lang w:bidi="he-IL"/>
-        </w:rPr>
-        <w:t xml:space="preserve">זיהוי </w:t>
-      </w:r>
-      <w:r>
-        <w:rPr>
-          <w:rFonts w:ascii="Arial" w:hAnsi="Arial" w:cs="Arial"/>
-          <w:sz w:val="26"/>
-          <w:szCs w:val="26"/>
-          <w:rtl/>
-          <w:lang w:bidi="he-IL"/>
-        </w:rPr>
-        <w:t>–</w:t>
-      </w:r>
-      <w:r>
-        <w:rPr>
-          <w:rFonts w:ascii="Arial" w:hAnsi="Arial" w:cs="Arial" w:hint="cs"/>
-          <w:sz w:val="26"/>
-          <w:szCs w:val="26"/>
-          <w:rtl/>
-          <w:lang w:bidi="he-IL"/>
-        </w:rPr>
-        <w:t xml:space="preserve"> הנפגע זוהה ע</w:t>
-      </w:r>
-      <w:r>
-        <w:rPr>
-          <w:rFonts w:ascii="Arial" w:hAnsi="Arial" w:cs="Arial" w:hint="cs"/>
-          <w:sz w:val="26"/>
-          <w:szCs w:val="26"/>
-          <w:rtl/>
-          <w:lang w:bidi="he-IL"/>
-        </w:rPr>
-        <w:t xml:space="preserve">פ"י </w:t>
-      </w:r>
-      <w:r>
-        <w:rPr>
-          <w:rFonts w:ascii="Arial" w:hAnsi="Arial" w:cs="Arial"/>
-          <w:sz w:val="26"/>
-          <w:szCs w:val="26"/>
-          <w:lang w:bidi="he-IL"/>
-        </w:rPr>
-        <w:t>{{</w:t>
-      </w:r>
-      <w:proofErr w:type="spellStart"/>
-      <w:r>
-        <w:rPr>
-          <w:rFonts w:ascii="Arial" w:hAnsi="Arial" w:cs="Arial"/>
-          <w:sz w:val="26"/>
-          <w:szCs w:val="26"/>
-          <w:lang w:bidi="he-IL"/>
-        </w:rPr>
-        <w:t>db.social_media</w:t>
-      </w:r>
-      <w:r>
-        <w:rPr>
-          <w:rFonts w:ascii="Arial" w:hAnsi="Arial" w:cs="Arial"/>
-          <w:sz w:val="26"/>
-          <w:szCs w:val="26"/>
-          <w:lang w:bidi="he-IL"/>
-        </w:rPr>
-        <w:t>_identification</w:t>
-      </w:r>
-      <w:proofErr w:type="spellEnd"/>
-      <w:r>
-        <w:rPr>
-          <w:rFonts w:ascii="Arial" w:hAnsi="Arial" w:cs="Arial"/>
-          <w:sz w:val="26"/>
-          <w:szCs w:val="26"/>
-          <w:lang w:bidi="he-IL"/>
-        </w:rPr>
-        <w:t>}}</w:t>
-      </w:r>
-    </w:p>
-    <w:p>
-      <w:pPr>
-        <w:rPr>
-          <w:rFonts w:ascii="Arial" w:hAnsi="Arial" w:cs="Arial"/>
-          <w:b/>
-          <w:bCs/>
-          <w:sz w:val="26"/>
-          <w:szCs w:val="26"/>
-          <w:u w:val="single"/>
-          <w:rtl/>
-          <w:lang w:bidi="he-IL"/>
-        </w:rPr>
-      </w:pPr>
-      <w:r>
-        <w:rPr>
-          <w:rFonts w:ascii="Arial" w:hAnsi="Arial" w:cs="Arial"/>
-          <w:b/>
-          <w:bCs/>
-          <w:sz w:val="26"/>
-          <w:szCs w:val="26"/>
-          <w:u w:val="single"/>
-          <w:rtl/>
-          <w:lang w:bidi="he-IL"/>
-        </w:rPr>
-        <w:br/>
-      </w:r>
-    </w:p>
-    <w:p>
-      <w:pPr>
-        <w:rPr>
-          <w:rFonts w:ascii="Arial" w:hAnsi="Arial" w:cs="Arial"/>
-          <w:b/>
-          <w:bCs/>
-          <w:sz w:val="26"/>
-          <w:szCs w:val="26"/>
-          <w:u w:val="single"/>
-          <w:rtl/>
-          <w:lang w:bidi="he-IL"/>
-        </w:rPr>
-      </w:pPr>
-      <w:r>
-        <w:rPr>
-          <w:rFonts w:ascii="Arial" w:hAnsi="Arial" w:cs="Arial" w:hint="cs"/>
-          <w:b/>
-          <w:bCs/>
-          <w:sz w:val="26"/>
-          <w:szCs w:val="26"/>
-          <w:u w:val="single"/>
-          <w:rtl/>
-          <w:lang w:bidi="he-IL"/>
-        </w:rPr>
-        <w:t>מ</w:t>
-      </w:r>
-      <w:r>
-        <w:rPr>
-          <w:rFonts w:ascii="Arial" w:hAnsi="Arial" w:cs="Arial" w:hint="cs"/>
-          <w:b/>
-          <w:bCs/>
-          <w:sz w:val="26"/>
-          <w:szCs w:val="26"/>
-          <w:u w:val="single"/>
-          <w:rtl/>
-        </w:rPr>
-        <w:t>עקב מי</w:t>
-      </w:r>
-      <w:r>
-        <w:rPr>
-          <w:rFonts w:ascii="Arial" w:hAnsi="Arial" w:cs="Arial" w:hint="cs"/>
-          <w:b/>
-          <w:bCs/>
-          <w:sz w:val="26"/>
-          <w:szCs w:val="26"/>
-          <w:u w:val="single"/>
-          <w:rtl/>
-          <w:lang w:bidi="he-IL"/>
-        </w:rPr>
-        <w:t xml:space="preserve">ום </w:t>
-      </w:r>
-      <w:r>
-        <w:rPr>
-          <w:rFonts w:ascii="Arial" w:hAnsi="Arial" w:cs="Arial"/>
-          <w:b/>
-          <w:bCs/>
-          <w:sz w:val="26"/>
-          <w:szCs w:val="26"/>
-          <w:u w:val="single"/>
-          <w:lang w:bidi="he-IL"/>
-        </w:rPr>
-        <w:t>{{</w:t>
-      </w:r>
-      <w:proofErr w:type="spellStart"/>
-      <w:r>
-        <w:rPr>
-          <w:rFonts w:ascii="Arial" w:hAnsi="Arial" w:cs="Arial"/>
-          <w:b/>
-          <w:bCs/>
-          <w:sz w:val="26"/>
-          <w:szCs w:val="26"/>
-          <w:u w:val="single"/>
-          <w:lang w:bidi="he-IL"/>
-        </w:rPr>
-        <w:t>db.tracking_date</w:t>
-      </w:r>
-      <w:proofErr w:type="spellEnd"/>
-      <w:r>
-        <w:rPr>
-          <w:rFonts w:ascii="Arial" w:hAnsi="Arial" w:cs="Arial"/>
-          <w:b/>
-          <w:bCs/>
-          <w:sz w:val="26"/>
-          <w:szCs w:val="26"/>
-          <w:u w:val="single"/>
-          <w:lang w:bidi="he-IL"/>
-        </w:rPr>
-        <w:t>}}</w:t>
+          <w:lang w:bidi="he-IL"/>
+        </w:rPr>
+        <w:t>{{db.tracking_date}}</w:t>
       </w:r>
       <w:r>
         <w:rPr>
@@ -2607,27 +2294,7 @@
           <w:szCs w:val="26"/>
           <w:lang w:bidi="he-IL"/>
         </w:rPr>
-        <w:t>{{</w:t>
-      </w:r>
-      <w:proofErr w:type="spellStart"/>
-      <w:r>
-        <w:rPr>
-          <w:rFonts w:ascii="Arial" w:hAnsi="Arial" w:cs="Arial"/>
-          <w:sz w:val="26"/>
-          <w:szCs w:val="26"/>
-          <w:lang w:bidi="he-IL"/>
-        </w:rPr>
-        <w:t>db.start_time</w:t>
-      </w:r>
-      <w:proofErr w:type="spellEnd"/>
-      <w:r>
-        <w:rPr>
-          <w:rFonts w:ascii="Arial" w:hAnsi="Arial" w:cs="Arial"/>
-          <w:sz w:val="26"/>
-          <w:szCs w:val="26"/>
-          <w:lang w:bidi="he-IL"/>
-        </w:rPr>
-        <w:t>}}</w:t>
+        <w:t>{{db.start_time}}</w:t>
       </w:r>
       <w:r>
         <w:rPr>
@@ -2695,19 +2362,8 @@
           <w:szCs w:val="26"/>
           <w:lang w:bidi="he-IL"/>
         </w:rPr>
-        <w:t xml:space="preserve">for row in </w:t>
-      </w:r>
-      <w:proofErr w:type="spellStart"/>
-      <w:r>
-        <w:rPr>
-          <w:rFonts w:ascii="Arial" w:hAnsi="Arial" w:cs="Arial"/>
-          <w:sz w:val="26"/>
-          <w:szCs w:val="26"/>
-          <w:lang w:bidi="he-IL"/>
-        </w:rPr>
-        <w:t>tracking_rows</w:t>
-      </w:r>
-      <w:proofErr w:type="spellEnd"/>
+        <w:t>for row in tracking_rows</w:t>
+      </w:r>
       <w:r>
         <w:rPr>
           <w:rFonts w:ascii="Arial" w:hAnsi="Arial" w:cs="Arial"/>
@@ -2765,7 +2421,6 @@
               </w:rPr>
               <w:t xml:space="preserve">{{ </w:t>
             </w:r>
-            <w:proofErr w:type="spellStart"/>
             <w:r>
               <w:rPr>
                 <w:rFonts w:ascii="Arial" w:hAnsi="Arial" w:cs="Arial"/>
@@ -2775,7 +2430,6 @@
               </w:rPr>
               <w:t>row.time</w:t>
             </w:r>
-            <w:proofErr w:type="spellEnd"/>
             <w:r>
               <w:rPr>
                 <w:rFonts w:ascii="Arial" w:hAnsi="Arial" w:cs="Arial"/>
@@ -2812,7 +2466,6 @@
               </w:rPr>
               <w:t xml:space="preserve">{{ </w:t>
             </w:r>
-            <w:proofErr w:type="spellStart"/>
             <w:r>
               <w:rPr>
                 <w:rFonts w:ascii="Arial" w:hAnsi="Arial" w:cs="Arial"/>
@@ -2822,7 +2475,6 @@
               </w:rPr>
               <w:t>row.text</w:t>
             </w:r>
-            <w:proofErr w:type="spellEnd"/>
             <w:r>
               <w:rPr>
                 <w:rFonts w:ascii="Arial" w:hAnsi="Arial" w:cs="Arial"/>
@@ -2858,7 +2510,6 @@
         </w:rPr>
         <w:t xml:space="preserve">{% </w:t>
       </w:r>
-      <w:proofErr w:type="spellStart"/>
       <w:r>
         <w:rPr>
           <w:rFonts w:ascii="Arial" w:hAnsi="Arial" w:cs="Arial"/>
@@ -2868,7 +2519,6 @@
         </w:rPr>
         <w:t>endfor</w:t>
       </w:r>
-      <w:proofErr w:type="spellEnd"/>
       <w:r>
         <w:rPr>
           <w:rFonts w:ascii="Arial" w:hAnsi="Arial" w:cs="Arial"/>
@@ -2907,18 +2557,8 @@
           <w:sz w:val="26"/>
           <w:szCs w:val="26"/>
         </w:rPr>
-        <w:t>{{</w:t>
-      </w:r>
-      <w:proofErr w:type="spellStart"/>
-      <w:r>
-        <w:rPr>
-          <w:rFonts w:asciiTheme="minorBidi" w:hAnsiTheme="minorBidi"/>
-          <w:sz w:val="26"/>
-          <w:szCs w:val="26"/>
-        </w:rPr>
-        <w:t>db.end_time</w:t>
-      </w:r>
-      <w:proofErr w:type="spellEnd"/>
+        <w:t>{{db.end_time</w:t>
+      </w:r>
       <w:r>
         <w:rPr>
           <w:rFonts w:asciiTheme="minorBidi" w:hAnsiTheme="minorBidi"/>
@@ -3135,27 +2775,7 @@
           <w:szCs w:val="26"/>
           <w:lang w:bidi="he-IL"/>
         </w:rPr>
-        <w:t>{{</w:t>
-      </w:r>
-      <w:proofErr w:type="spellStart"/>
-      <w:r>
-        <w:rPr>
-          <w:rFonts w:ascii="Arial" w:hAnsi="Arial" w:cs="Arial"/>
-          <w:sz w:val="26"/>
-          <w:szCs w:val="26"/>
-          <w:lang w:bidi="he-IL"/>
-        </w:rPr>
-        <w:t>db.summary</w:t>
-      </w:r>
-      <w:proofErr w:type="spellEnd"/>
-      <w:r>
-        <w:rPr>
-          <w:rFonts w:ascii="Arial" w:hAnsi="Arial" w:cs="Arial"/>
-          <w:sz w:val="26"/>
-          <w:szCs w:val="26"/>
-          <w:lang w:bidi="he-IL"/>
-        </w:rPr>
-        <w:t>}}</w:t>
+        <w:t>{{db.summary}}</w:t>
       </w:r>
       <w:r>
         <w:rPr>

</xml_diff>

<commit_message>
Update lex for life followup
</commit_message>
<xml_diff>
--- a/app/docx_templates/menora_life_followup.docx
+++ b/app/docx_templates/menora_life_followup.docx
@@ -33,7 +33,6 @@
         <w:t xml:space="preserve">                  </w:t>
       </w:r>
       <w:bookmarkStart w:id="0" w:name="_Hlk214468209"/>
-      <w:proofErr w:type="gramStart"/>
       <w:r>
         <w:rPr>
           <w:rFonts w:ascii="Arial" w:eastAsia="Times New Roman" w:hAnsi="Arial" w:cs="Arial"/>
@@ -45,21 +44,7 @@
           <w:lang w:eastAsia="he-IL" w:bidi="he-IL"/>
           <w14:ligatures w14:val="none"/>
         </w:rPr>
-        <w:t>{{ now</w:t>
-      </w:r>
-      <w:proofErr w:type="gramEnd"/>
-      <w:r>
-        <w:rPr>
-          <w:rFonts w:ascii="Arial" w:eastAsia="Times New Roman" w:hAnsi="Arial" w:cs="Arial"/>
-          <w:b/>
-          <w:bCs/>
-          <w:kern w:val="0"/>
-          <w:sz w:val="26"/>
-          <w:szCs w:val="26"/>
-          <w:lang w:eastAsia="he-IL" w:bidi="he-IL"/>
-          <w14:ligatures w14:val="none"/>
-        </w:rPr>
-        <w:t xml:space="preserve"> }}</w:t>
+        <w:t>{{ now }}</w:t>
       </w:r>
     </w:p>
     <w:p>
@@ -160,7 +145,6 @@
         </w:rPr>
         <w:t xml:space="preserve">{{ </w:t>
       </w:r>
-      <w:proofErr w:type="spellStart"/>
       <w:r>
         <w:rPr>
           <w:rFonts w:ascii="Arial" w:eastAsia="Times New Roman" w:hAnsi="Arial" w:cs="Arial"/>
@@ -172,37 +156,8 @@
           <w:lang w:eastAsia="he-IL" w:bidi="he-IL"/>
           <w14:ligatures w14:val="none"/>
         </w:rPr>
-        <w:t>reference_no</w:t>
-      </w:r>
-      <w:proofErr w:type="spellEnd"/>
-      <w:r>
-        <w:rPr>
-          <w:rFonts w:ascii="Arial" w:eastAsia="Times New Roman" w:hAnsi="Arial" w:cs="Arial"/>
-          <w:b/>
-          <w:bCs/>
-          <w:kern w:val="0"/>
-          <w:sz w:val="26"/>
-          <w:szCs w:val="26"/>
-          <w:lang w:eastAsia="he-IL" w:bidi="he-IL"/>
-          <w14:ligatures w14:val="none"/>
-        </w:rPr>
-        <w:t xml:space="preserve"> or </w:t>
-      </w:r>
-      <w:proofErr w:type="spellStart"/>
-      <w:r>
-        <w:rPr>
-          <w:rFonts w:ascii="Arial" w:eastAsia="Times New Roman" w:hAnsi="Arial" w:cs="Arial"/>
-          <w:b/>
-          <w:bCs/>
-          <w:kern w:val="0"/>
-          <w:sz w:val="26"/>
-          <w:szCs w:val="26"/>
-          <w:lang w:eastAsia="he-IL" w:bidi="he-IL"/>
-          <w14:ligatures w14:val="none"/>
-        </w:rPr>
-        <w:t>db.ref_number</w:t>
-      </w:r>
-      <w:proofErr w:type="spellEnd"/>
+        <w:t>reference_no or db.ref_number</w:t>
+      </w:r>
       <w:r>
         <w:rPr>
           <w:rFonts w:ascii="Arial" w:eastAsia="Times New Roman" w:hAnsi="Arial" w:cs="Arial"/>
@@ -484,10 +439,69 @@
           <w:lang w:eastAsia="he-IL" w:bidi="he-IL"/>
           <w14:ligatures w14:val="none"/>
         </w:rPr>
+        <w:t>{{lex.injured}}</w:t>
+      </w:r>
+      <w:r>
+        <w:rPr>
+          <w:rFonts w:ascii="Arial" w:eastAsia="Times New Roman" w:hAnsi="Arial" w:cs="Arial" w:hint="cs"/>
+          <w:kern w:val="0"/>
+          <w:sz w:val="26"/>
+          <w:szCs w:val="26"/>
+          <w:rtl/>
+          <w:lang w:eastAsia="he-IL" w:bidi="he-IL"/>
+          <w14:ligatures w14:val="none"/>
+        </w:rPr>
+        <w:t xml:space="preserve">  </w:t>
+      </w:r>
+      <w:r>
+        <w:rPr>
+          <w:rFonts w:ascii="Arial" w:eastAsia="Times New Roman" w:hAnsi="Arial" w:cs="Arial"/>
+          <w:kern w:val="0"/>
+          <w:sz w:val="26"/>
+          <w:szCs w:val="26"/>
+          <w:rtl/>
+          <w:lang w:eastAsia="he-IL" w:bidi="he-IL"/>
+          <w14:ligatures w14:val="none"/>
+        </w:rPr>
+        <w:tab/>
+      </w:r>
+      <w:r>
+        <w:rPr>
+          <w:rFonts w:ascii="Arial" w:eastAsia="Times New Roman" w:hAnsi="Arial" w:cs="Arial" w:hint="cs"/>
+          <w:kern w:val="0"/>
+          <w:sz w:val="26"/>
+          <w:szCs w:val="26"/>
+          <w:rtl/>
+          <w:lang w:eastAsia="he-IL" w:bidi="he-IL"/>
+          <w14:ligatures w14:val="none"/>
+        </w:rPr>
+        <w:t xml:space="preserve">:  </w:t>
+      </w:r>
+      <w:r>
+        <w:rPr>
+          <w:rFonts w:ascii="Arial" w:eastAsia="Times New Roman" w:hAnsi="Arial" w:cs="Arial" w:hint="cs"/>
+          <w:kern w:val="0"/>
+          <w:sz w:val="26"/>
+          <w:szCs w:val="26"/>
+          <w:rtl/>
+          <w:lang w:eastAsia="he-IL" w:bidi="he-IL"/>
+          <w14:ligatures w14:val="none"/>
+        </w:rPr>
         <w:t xml:space="preserve"> </w:t>
       </w:r>
       <w:r>
         <w:rPr>
+          <w:rFonts w:ascii="Arial" w:eastAsia="Times New Roman" w:hAnsi="Arial" w:cs="Arial"/>
+          <w:kern w:val="0"/>
+          <w:sz w:val="26"/>
+          <w:szCs w:val="26"/>
+          <w:lang w:eastAsia="he-IL" w:bidi="he-IL"/>
+          <w14:ligatures w14:val="none"/>
+        </w:rPr>
+        <w:t>{{db.full_name}}</w:t>
+      </w:r>
+      <w:r>
+        <w:rPr>
           <w:rFonts w:ascii="Arial" w:eastAsia="Times New Roman" w:hAnsi="Arial" w:cs="Arial" w:hint="cs"/>
           <w:kern w:val="0"/>
           <w:sz w:val="26"/>
@@ -496,7 +510,7 @@
           <w:lang w:eastAsia="he-IL" w:bidi="he-IL"/>
           <w14:ligatures w14:val="none"/>
         </w:rPr>
-        <w:t xml:space="preserve">הנפגע  </w:t>
+        <w:t xml:space="preserve">. </w:t>
       </w:r>
       <w:r>
         <w:rPr>
@@ -504,35 +518,10 @@
           <w:kern w:val="0"/>
           <w:sz w:val="26"/>
           <w:szCs w:val="26"/>
-          <w:rtl/>
-          <w:lang w:eastAsia="he-IL" w:bidi="he-IL"/>
-          <w14:ligatures w14:val="none"/>
-        </w:rPr>
-        <w:tab/>
-      </w:r>
-      <w:r>
-        <w:rPr>
-          <w:rFonts w:ascii="Arial" w:eastAsia="Times New Roman" w:hAnsi="Arial" w:cs="Arial" w:hint="cs"/>
-          <w:kern w:val="0"/>
-          <w:sz w:val="26"/>
-          <w:szCs w:val="26"/>
-          <w:rtl/>
-          <w:lang w:eastAsia="he-IL" w:bidi="he-IL"/>
-          <w14:ligatures w14:val="none"/>
-        </w:rPr>
-        <w:t xml:space="preserve">  :  </w:t>
-      </w:r>
-      <w:r>
-        <w:rPr>
-          <w:rFonts w:ascii="Arial" w:eastAsia="Times New Roman" w:hAnsi="Arial" w:cs="Arial" w:hint="cs"/>
-          <w:kern w:val="0"/>
-          <w:sz w:val="26"/>
-          <w:szCs w:val="26"/>
-          <w:rtl/>
-          <w:lang w:eastAsia="he-IL" w:bidi="he-IL"/>
-          <w14:ligatures w14:val="none"/>
-        </w:rPr>
-        <w:t xml:space="preserve"> </w:t>
+          <w:lang w:eastAsia="he-IL" w:bidi="he-IL"/>
+          <w14:ligatures w14:val="none"/>
+        </w:rPr>
+        <w:t>{{db.address}}</w:t>
       </w:r>
       <w:r>
         <w:rPr>
@@ -540,131 +529,10 @@
           <w:kern w:val="0"/>
           <w:sz w:val="26"/>
           <w:szCs w:val="26"/>
-          <w:lang w:eastAsia="he-IL" w:bidi="he-IL"/>
-          <w14:ligatures w14:val="none"/>
-        </w:rPr>
-        <w:t>{{</w:t>
-      </w:r>
-      <w:proofErr w:type="spellStart"/>
-      <w:r>
-        <w:rPr>
-          <w:rFonts w:ascii="Arial" w:eastAsia="Times New Roman" w:hAnsi="Arial" w:cs="Arial"/>
-          <w:kern w:val="0"/>
-          <w:sz w:val="26"/>
-          <w:szCs w:val="26"/>
-          <w:lang w:eastAsia="he-IL" w:bidi="he-IL"/>
-          <w14:ligatures w14:val="none"/>
-        </w:rPr>
-        <w:t>db.full_name</w:t>
-      </w:r>
-      <w:proofErr w:type="spellEnd"/>
-      <w:r>
-        <w:rPr>
-          <w:rFonts w:ascii="Arial" w:eastAsia="Times New Roman" w:hAnsi="Arial" w:cs="Arial"/>
-          <w:kern w:val="0"/>
-          <w:sz w:val="26"/>
-          <w:szCs w:val="26"/>
-          <w:lang w:eastAsia="he-IL" w:bidi="he-IL"/>
-          <w14:ligatures w14:val="none"/>
-        </w:rPr>
-        <w:t>}}</w:t>
-      </w:r>
-      <w:r>
-        <w:rPr>
-          <w:rFonts w:ascii="Arial" w:eastAsia="Times New Roman" w:hAnsi="Arial" w:cs="Arial" w:hint="cs"/>
-          <w:kern w:val="0"/>
-          <w:sz w:val="26"/>
-          <w:szCs w:val="26"/>
-          <w:rtl/>
-          <w:lang w:eastAsia="he-IL" w:bidi="he-IL"/>
-          <w14:ligatures w14:val="none"/>
-        </w:rPr>
-        <w:t xml:space="preserve">. </w:t>
-      </w:r>
-      <w:r>
-        <w:rPr>
-          <w:rFonts w:ascii="Arial" w:eastAsia="Times New Roman" w:hAnsi="Arial" w:cs="Arial"/>
-          <w:kern w:val="0"/>
-          <w:sz w:val="26"/>
-          <w:szCs w:val="26"/>
-          <w:lang w:eastAsia="he-IL" w:bidi="he-IL"/>
-          <w14:ligatures w14:val="none"/>
-        </w:rPr>
-        <w:t>{{</w:t>
-      </w:r>
-      <w:proofErr w:type="spellStart"/>
-      <w:proofErr w:type="gramStart"/>
-      <w:r>
-        <w:rPr>
-          <w:rFonts w:ascii="Arial" w:eastAsia="Times New Roman" w:hAnsi="Arial" w:cs="Arial"/>
-          <w:kern w:val="0"/>
-          <w:sz w:val="26"/>
-          <w:szCs w:val="26"/>
-          <w:lang w:eastAsia="he-IL" w:bidi="he-IL"/>
-          <w14:ligatures w14:val="none"/>
-        </w:rPr>
-        <w:t>db.address</w:t>
-      </w:r>
-      <w:proofErr w:type="spellEnd"/>
-      <w:r>
-        <w:rPr>
-          <w:rFonts w:ascii="Arial" w:eastAsia="Times New Roman" w:hAnsi="Arial" w:cs="Arial"/>
-          <w:kern w:val="0"/>
-          <w:sz w:val="26"/>
-          <w:szCs w:val="26"/>
-          <w:lang w:eastAsia="he-IL" w:bidi="he-IL"/>
-          <w14:ligatures w14:val="none"/>
-        </w:rPr>
-        <w:t>}}</w:t>
-      </w:r>
-      <w:r>
-        <w:rPr>
-          <w:rFonts w:ascii="Arial" w:eastAsia="Times New Roman" w:hAnsi="Arial" w:cs="Arial"/>
-          <w:kern w:val="0"/>
-          <w:sz w:val="26"/>
-          <w:szCs w:val="26"/>
           <w:lang w:val="en-ZA" w:eastAsia="he-IL" w:bidi="he-IL"/>
           <w14:ligatures w14:val="none"/>
         </w:rPr>
-        <w:t xml:space="preserve">  {</w:t>
-      </w:r>
-      <w:proofErr w:type="gramEnd"/>
-      <w:r>
-        <w:rPr>
-          <w:rFonts w:ascii="Arial" w:eastAsia="Times New Roman" w:hAnsi="Arial" w:cs="Arial"/>
-          <w:kern w:val="0"/>
-          <w:sz w:val="26"/>
-          <w:szCs w:val="26"/>
-          <w:lang w:val="en-ZA" w:eastAsia="he-IL" w:bidi="he-IL"/>
-          <w14:ligatures w14:val="none"/>
-        </w:rPr>
-        <w:t>{</w:t>
-      </w:r>
-      <w:proofErr w:type="spellStart"/>
-      <w:proofErr w:type="gramStart"/>
-      <w:r>
-        <w:rPr>
-          <w:rFonts w:ascii="Arial" w:eastAsia="Times New Roman" w:hAnsi="Arial" w:cs="Arial"/>
-          <w:kern w:val="0"/>
-          <w:sz w:val="26"/>
-          <w:szCs w:val="26"/>
-          <w:lang w:val="en-ZA" w:eastAsia="he-IL" w:bidi="he-IL"/>
-          <w14:ligatures w14:val="none"/>
-        </w:rPr>
-        <w:t>db.city</w:t>
-      </w:r>
-      <w:proofErr w:type="spellEnd"/>
-      <w:proofErr w:type="gramEnd"/>
-      <w:r>
-        <w:rPr>
-          <w:rFonts w:ascii="Arial" w:eastAsia="Times New Roman" w:hAnsi="Arial" w:cs="Arial"/>
-          <w:kern w:val="0"/>
-          <w:sz w:val="26"/>
-          <w:szCs w:val="26"/>
-          <w:lang w:val="en-ZA" w:eastAsia="he-IL" w:bidi="he-IL"/>
-          <w14:ligatures w14:val="none"/>
-        </w:rPr>
-        <w:t>}}</w:t>
+        <w:t xml:space="preserve">  {{db.city}}</w:t>
       </w:r>
     </w:p>
     <w:p>
@@ -762,31 +630,7 @@
           <w:lang w:eastAsia="he-IL" w:bidi="he-IL"/>
           <w14:ligatures w14:val="none"/>
         </w:rPr>
-        <w:t>{{</w:t>
-      </w:r>
-      <w:proofErr w:type="spellStart"/>
-      <w:r>
-        <w:rPr>
-          <w:rFonts w:ascii="Arial" w:eastAsia="Times New Roman" w:hAnsi="Arial" w:cs="Arial"/>
-          <w:kern w:val="0"/>
-          <w:sz w:val="26"/>
-          <w:szCs w:val="26"/>
-          <w:lang w:eastAsia="he-IL" w:bidi="he-IL"/>
-          <w14:ligatures w14:val="none"/>
-        </w:rPr>
-        <w:t>db.id_number</w:t>
-      </w:r>
-      <w:proofErr w:type="spellEnd"/>
-      <w:r>
-        <w:rPr>
-          <w:rFonts w:ascii="Arial" w:eastAsia="Times New Roman" w:hAnsi="Arial" w:cs="Arial"/>
-          <w:kern w:val="0"/>
-          <w:sz w:val="26"/>
-          <w:szCs w:val="26"/>
-          <w:lang w:eastAsia="he-IL" w:bidi="he-IL"/>
-          <w14:ligatures w14:val="none"/>
-        </w:rPr>
-        <w:t>}}</w:t>
+        <w:t>{{db.id_number}}</w:t>
       </w:r>
     </w:p>
     <w:p>
@@ -884,31 +728,7 @@
           <w:lang w:eastAsia="he-IL" w:bidi="he-IL"/>
           <w14:ligatures w14:val="none"/>
         </w:rPr>
-        <w:t>{{</w:t>
-      </w:r>
-      <w:proofErr w:type="spellStart"/>
-      <w:r>
-        <w:rPr>
-          <w:rFonts w:ascii="Arial" w:eastAsia="Times New Roman" w:hAnsi="Arial" w:cs="Arial"/>
-          <w:kern w:val="0"/>
-          <w:sz w:val="26"/>
-          <w:szCs w:val="26"/>
-          <w:lang w:eastAsia="he-IL" w:bidi="he-IL"/>
-          <w14:ligatures w14:val="none"/>
-        </w:rPr>
-        <w:t>db.claim_number</w:t>
-      </w:r>
-      <w:proofErr w:type="spellEnd"/>
-      <w:r>
-        <w:rPr>
-          <w:rFonts w:ascii="Arial" w:eastAsia="Times New Roman" w:hAnsi="Arial" w:cs="Arial"/>
-          <w:kern w:val="0"/>
-          <w:sz w:val="26"/>
-          <w:szCs w:val="26"/>
-          <w:lang w:eastAsia="he-IL" w:bidi="he-IL"/>
-          <w14:ligatures w14:val="none"/>
-        </w:rPr>
-        <w:t>}}</w:t>
+        <w:t>{{db.claim_number}}</w:t>
       </w:r>
       <w:r>
         <w:rPr>
@@ -1058,7 +878,6 @@
         <w:tab/>
         <w:t xml:space="preserve">  :  {{ </w:t>
       </w:r>
-      <w:proofErr w:type="spellStart"/>
       <w:r>
         <w:rPr>
           <w:rFonts w:ascii="Arial" w:eastAsia="Times New Roman" w:hAnsi="Arial" w:cs="Arial"/>
@@ -1068,33 +887,8 @@
           <w:lang w:eastAsia="he-IL"/>
           <w14:ligatures w14:val="none"/>
         </w:rPr>
-        <w:t>ctx.injury_type</w:t>
-      </w:r>
-      <w:proofErr w:type="spellEnd"/>
-      <w:r>
-        <w:rPr>
-          <w:rFonts w:ascii="Arial" w:eastAsia="Times New Roman" w:hAnsi="Arial" w:cs="Arial"/>
-          <w:kern w:val="0"/>
-          <w:sz w:val="26"/>
-          <w:szCs w:val="26"/>
-          <w:lang w:eastAsia="he-IL"/>
-          <w14:ligatures w14:val="none"/>
-        </w:rPr>
-        <w:t xml:space="preserve"> or </w:t>
-      </w:r>
-      <w:proofErr w:type="spellStart"/>
-      <w:r>
-        <w:rPr>
-          <w:rFonts w:ascii="Arial" w:eastAsia="Times New Roman" w:hAnsi="Arial" w:cs="Arial"/>
-          <w:kern w:val="0"/>
-          <w:sz w:val="26"/>
-          <w:szCs w:val="26"/>
-          <w:lang w:eastAsia="he-IL"/>
-          <w14:ligatures w14:val="none"/>
-        </w:rPr>
-        <w:t>db.injury_type</w:t>
-      </w:r>
-      <w:proofErr w:type="spellEnd"/>
+        <w:t>ctx.injury_type or db.injury_type</w:t>
+      </w:r>
       <w:r>
         <w:rPr>
           <w:rFonts w:ascii="Arial" w:eastAsia="Times New Roman" w:hAnsi="Arial" w:cs="Arial"/>
@@ -1238,7 +1032,6 @@
         </w:rPr>
         <w:t xml:space="preserve">{{ </w:t>
       </w:r>
-      <w:proofErr w:type="spellStart"/>
       <w:r>
         <w:rPr>
           <w:rFonts w:ascii="Arial" w:eastAsia="Times New Roman" w:hAnsi="Arial" w:cs="Arial"/>
@@ -1250,7 +1043,6 @@
         </w:rPr>
         <w:t>db.phone</w:t>
       </w:r>
-      <w:proofErr w:type="spellEnd"/>
       <w:r>
         <w:rPr>
           <w:rFonts w:ascii="Arial" w:eastAsia="Times New Roman" w:hAnsi="Arial" w:cs="Arial"/>
@@ -1312,7 +1104,6 @@
           <w:rFonts w:ascii="Arial" w:hAnsi="Arial" w:cs="Arial"/>
           <w:sz w:val="26"/>
           <w:szCs w:val="26"/>
-          <w:rtl/>
           <w:lang w:bidi="he-IL"/>
         </w:rPr>
       </w:pPr>
@@ -1324,7 +1115,7 @@
           <w:rtl/>
           <w:lang w:bidi="he-IL"/>
         </w:rPr>
-        <w:t>לבקשתכם פעלנו לביצוע מעקב אחר הנפגע, על מנת לבדוק באם הוא עובד ואופי תפקוד</w:t>
+        <w:t>לבקשתכם פעלנו לביצוע מעקב אחר</w:t>
       </w:r>
       <w:r>
         <w:rPr>
@@ -1334,7 +1125,18 @@
           <w:rtl/>
           <w:lang w:bidi="he-IL"/>
         </w:rPr>
-        <w:t>ו</w:t>
+        <w:t xml:space="preserve"> </w:t>
+      </w:r>
+      <w:r>
+        <w:rPr>
+          <w:rFonts w:ascii="Arial" w:eastAsia="Times New Roman" w:hAnsi="Arial" w:cs="Arial"/>
+          <w:kern w:val="0"/>
+          <w:sz w:val="26"/>
+          <w:szCs w:val="26"/>
+          <w:lang w:eastAsia="he-IL" w:bidi="he-IL"/>
+          <w14:ligatures w14:val="none"/>
+        </w:rPr>
+        <w:t>{{lex.injured}}</w:t>
       </w:r>
       <w:r>
         <w:rPr>
@@ -1344,6 +1146,105 @@
           <w:rtl/>
           <w:lang w:bidi="he-IL"/>
         </w:rPr>
+        <w:t xml:space="preserve">, על מנת לבדוק באם </w:t>
+      </w:r>
+      <w:r>
+        <w:rPr>
+          <w:rFonts w:ascii="Arial" w:hAnsi="Arial" w:cs="Arial"/>
+          <w:sz w:val="26"/>
+          <w:szCs w:val="26"/>
+          <w:lang w:bidi="he-IL"/>
+        </w:rPr>
+        <w:t>{{lex.</w:t>
+      </w:r>
+      <w:r>
+        <w:rPr>
+          <w:rFonts w:ascii="Courier New" w:eastAsia="Times New Roman" w:hAnsi="Courier New" w:cs="Courier New"/>
+          <w:color w:val="6AAB73"/>
+          <w:kern w:val="0"/>
+          <w:sz w:val="20"/>
+          <w:szCs w:val="20"/>
+          <w:lang w:bidi="he-IL"/>
+          <w14:ligatures w14:val="none"/>
+        </w:rPr>
+        <w:t xml:space="preserve"> </w:t>
+      </w:r>
+      <w:r>
+        <w:rPr>
+          <w:rFonts w:ascii="Arial" w:hAnsi="Arial" w:cs="Arial"/>
+          <w:sz w:val="26"/>
+          <w:szCs w:val="26"/>
+          <w:lang w:bidi="he-IL"/>
+        </w:rPr>
+        <w:t>pronoun_subj</w:t>
+      </w:r>
+    </w:p>
+    <w:p>
+      <w:pPr>
+        <w:spacing w:line="360" w:lineRule="auto"/>
+        <w:rPr>
+          <w:rFonts w:ascii="Arial" w:hAnsi="Arial" w:cs="Arial"/>
+          <w:sz w:val="26"/>
+          <w:szCs w:val="26"/>
+          <w:rtl/>
+          <w:lang w:bidi="he-IL"/>
+        </w:rPr>
+      </w:pPr>
+      <w:r>
+        <w:rPr>
+          <w:rFonts w:ascii="Arial" w:hAnsi="Arial" w:cs="Arial"/>
+          <w:sz w:val="26"/>
+          <w:szCs w:val="26"/>
+          <w:lang w:bidi="he-IL"/>
+        </w:rPr>
+        <w:t>}}</w:t>
+      </w:r>
+      <w:r>
+        <w:rPr>
+          <w:rFonts w:ascii="Arial" w:hAnsi="Arial" w:cs="Arial" w:hint="cs"/>
+          <w:sz w:val="26"/>
+          <w:szCs w:val="26"/>
+          <w:rtl/>
+          <w:lang w:bidi="he-IL"/>
+        </w:rPr>
+        <w:t xml:space="preserve"> </w:t>
+      </w:r>
+      <w:r>
+        <w:rPr>
+          <w:rFonts w:ascii="Arial" w:hAnsi="Arial" w:cs="Arial"/>
+          <w:sz w:val="26"/>
+          <w:szCs w:val="26"/>
+          <w:lang w:bidi="he-IL"/>
+        </w:rPr>
+        <w:t>{{lex.work}}</w:t>
+      </w:r>
+      <w:r>
+        <w:rPr>
+          <w:rFonts w:ascii="Arial" w:hAnsi="Arial" w:cs="Arial" w:hint="cs"/>
+          <w:sz w:val="26"/>
+          <w:szCs w:val="26"/>
+          <w:rtl/>
+          <w:lang w:bidi="he-IL"/>
+        </w:rPr>
+        <w:t xml:space="preserve"> ואופי </w:t>
+      </w:r>
+      <w:r>
+        <w:rPr>
+          <w:rFonts w:ascii="Arial" w:hAnsi="Arial" w:cs="Arial"/>
+          <w:sz w:val="26"/>
+          <w:szCs w:val="26"/>
+          <w:lang w:bidi="he-IL"/>
+        </w:rPr>
+        <w:t>{{lex.functioning}}</w:t>
+      </w:r>
+      <w:r>
+        <w:rPr>
+          <w:rFonts w:ascii="Arial" w:hAnsi="Arial" w:cs="Arial" w:hint="cs"/>
+          <w:sz w:val="26"/>
+          <w:szCs w:val="26"/>
+          <w:rtl/>
+          <w:lang w:bidi="he-IL"/>
+        </w:rPr>
         <w:t>.</w:t>
       </w:r>
     </w:p>
@@ -1463,13 +1364,31 @@
       </w:pPr>
       <w:r>
         <w:rPr>
+          <w:rFonts w:ascii="Arial" w:hAnsi="Arial" w:cs="Arial"/>
+          <w:sz w:val="26"/>
+          <w:szCs w:val="26"/>
+          <w:lang w:bidi="he-IL"/>
+        </w:rPr>
+        <w:t>{{lex.injured}}</w:t>
+      </w:r>
+      <w:r>
+        <w:rPr>
           <w:rFonts w:ascii="Arial" w:hAnsi="Arial" w:cs="Arial" w:hint="cs"/>
           <w:sz w:val="26"/>
           <w:szCs w:val="26"/>
           <w:rtl/>
           <w:lang w:bidi="he-IL"/>
         </w:rPr>
-        <w:t>הנפגע יליד</w:t>
+        <w:t xml:space="preserve"> </w:t>
+      </w:r>
+      <w:r>
+        <w:rPr>
+          <w:rFonts w:ascii="Arial" w:hAnsi="Arial" w:cs="Arial"/>
+          <w:sz w:val="26"/>
+          <w:szCs w:val="26"/>
+          <w:lang w:bidi="he-IL"/>
+        </w:rPr>
+        <w:t>{{lex.born_word}}</w:t>
       </w:r>
       <w:r>
         <w:rPr>
@@ -1488,38 +1407,100 @@
           <w:szCs w:val="26"/>
           <w:lang w:bidi="he-IL"/>
         </w:rPr>
+        <w:t>{{ db.birth_year }}</w:t>
+      </w:r>
+      <w:r>
+        <w:rPr>
+          <w:rFonts w:ascii="Arial" w:hAnsi="Arial" w:cs="Arial" w:hint="cs"/>
+          <w:sz w:val="26"/>
+          <w:szCs w:val="26"/>
+          <w:rtl/>
+          <w:lang w:bidi="he-IL"/>
+        </w:rPr>
+        <w:t>,</w:t>
+      </w:r>
+      <w:r>
+        <w:rPr>
+          <w:rFonts w:ascii="Arial" w:hAnsi="Arial" w:cs="Arial" w:hint="cs"/>
+          <w:sz w:val="26"/>
+          <w:szCs w:val="26"/>
+          <w:rtl/>
+          <w:lang w:bidi="he-IL"/>
+        </w:rPr>
+        <w:t xml:space="preserve"> </w:t>
+      </w:r>
+      <w:r>
+        <w:rPr>
+          <w:rFonts w:ascii="Arial" w:hAnsi="Arial" w:cs="Arial"/>
+          <w:sz w:val="26"/>
+          <w:szCs w:val="26"/>
+          <w:rtl/>
+          <w:lang w:bidi="he-IL"/>
+        </w:rPr>
         <w:t xml:space="preserve">{{ </w:t>
       </w:r>
-      <w:proofErr w:type="spellStart"/>
-      <w:r>
-        <w:rPr>
-          <w:rFonts w:ascii="Arial" w:hAnsi="Arial" w:cs="Arial"/>
-          <w:sz w:val="26"/>
-          <w:szCs w:val="26"/>
-          <w:lang w:bidi="he-IL"/>
-        </w:rPr>
-        <w:t>db.birth_year</w:t>
-      </w:r>
-      <w:proofErr w:type="spellEnd"/>
-      <w:r>
-        <w:rPr>
-          <w:rFonts w:ascii="Arial" w:hAnsi="Arial" w:cs="Arial"/>
-          <w:sz w:val="26"/>
-          <w:szCs w:val="26"/>
+      <w:r>
+        <w:rPr>
+          <w:rFonts w:ascii="Arial" w:hAnsi="Arial" w:cs="Arial"/>
+          <w:sz w:val="26"/>
+          <w:szCs w:val="26"/>
+          <w:lang w:bidi="he-IL"/>
+        </w:rPr>
+        <w:t>db.background</w:t>
+      </w:r>
+      <w:r>
+        <w:rPr>
+          <w:rFonts w:ascii="Arial" w:hAnsi="Arial" w:cs="Arial"/>
+          <w:sz w:val="26"/>
+          <w:szCs w:val="26"/>
+          <w:rtl/>
           <w:lang w:bidi="he-IL"/>
         </w:rPr>
         <w:t xml:space="preserve"> }}</w:t>
       </w:r>
       <w:r>
         <w:rPr>
+          <w:rFonts w:ascii="Arial" w:hAnsi="Arial" w:cs="Arial"/>
+          <w:sz w:val="26"/>
+          <w:szCs w:val="26"/>
+          <w:lang w:bidi="he-IL"/>
+        </w:rPr>
+        <w:t>.</w:t>
+      </w:r>
+    </w:p>
+    <w:p>
+      <w:pPr>
+        <w:spacing w:line="360" w:lineRule="auto"/>
+        <w:rPr>
+          <w:rFonts w:ascii="Arial" w:hAnsi="Arial" w:cs="Arial"/>
+          <w:sz w:val="26"/>
+          <w:szCs w:val="26"/>
+          <w:rtl/>
+          <w:lang w:bidi="he-IL"/>
+        </w:rPr>
+      </w:pPr>
+      <w:r>
+        <w:rPr>
           <w:rFonts w:ascii="Arial" w:hAnsi="Arial" w:cs="Arial" w:hint="cs"/>
           <w:sz w:val="26"/>
           <w:szCs w:val="26"/>
           <w:rtl/>
           <w:lang w:bidi="he-IL"/>
         </w:rPr>
-        <w:t>,</w:t>
-      </w:r>
+        <w:t xml:space="preserve"> </w:t>
+      </w:r>
+    </w:p>
+    <w:p>
+      <w:pPr>
+        <w:spacing w:line="360" w:lineRule="auto"/>
+        <w:rPr>
+          <w:rFonts w:ascii="Arial" w:hAnsi="Arial" w:cs="Arial"/>
+          <w:sz w:val="26"/>
+          <w:szCs w:val="26"/>
+          <w:rtl/>
+          <w:lang w:bidi="he-IL"/>
+        </w:rPr>
+      </w:pPr>
       <w:r>
         <w:rPr>
           <w:rFonts w:ascii="Arial" w:hAnsi="Arial" w:cs="Arial" w:hint="cs"/>
@@ -1532,6 +1513,56 @@
       </w:r>
       <w:r>
         <w:rPr>
+          <w:rFonts w:ascii="Arial" w:hAnsi="Arial" w:cs="Arial" w:hint="cs"/>
+          <w:sz w:val="26"/>
+          <w:szCs w:val="26"/>
+          <w:rtl/>
+          <w:lang w:bidi="he-IL"/>
+        </w:rPr>
+        <w:t xml:space="preserve"> </w:t>
+      </w:r>
+    </w:p>
+    <w:p>
+      <w:pPr>
+        <w:spacing w:line="360" w:lineRule="auto"/>
+        <w:rPr>
+          <w:rFonts w:ascii="Arial" w:hAnsi="Arial" w:cs="Arial"/>
+          <w:b/>
+          <w:bCs/>
+          <w:sz w:val="26"/>
+          <w:szCs w:val="26"/>
+          <w:u w:val="single"/>
+          <w:rtl/>
+          <w:lang w:bidi="he-IL"/>
+        </w:rPr>
+      </w:pPr>
+      <w:r>
+        <w:rPr>
+          <w:rFonts w:ascii="Arial" w:hAnsi="Arial" w:cs="Arial" w:hint="cs"/>
+          <w:b/>
+          <w:bCs/>
+          <w:sz w:val="26"/>
+          <w:szCs w:val="26"/>
+          <w:u w:val="single"/>
+          <w:rtl/>
+          <w:lang w:bidi="he-IL"/>
+        </w:rPr>
+        <w:t>עיסוק</w:t>
+      </w:r>
+    </w:p>
+    <w:p>
+      <w:pPr>
+        <w:spacing w:line="360" w:lineRule="auto"/>
+        <w:rPr>
+          <w:rFonts w:ascii="Arial" w:hAnsi="Arial" w:cs="Arial"/>
+          <w:sz w:val="26"/>
+          <w:szCs w:val="26"/>
+          <w:rtl/>
+          <w:lang w:bidi="he-IL"/>
+        </w:rPr>
+      </w:pPr>
+      <w:r>
+        <w:rPr>
           <w:rFonts w:ascii="Arial" w:hAnsi="Arial" w:cs="Arial"/>
           <w:sz w:val="26"/>
           <w:szCs w:val="26"/>
@@ -1540,17 +1571,15 @@
         </w:rPr>
         <w:t xml:space="preserve">{{ </w:t>
       </w:r>
-      <w:proofErr w:type="spellStart"/>
-      <w:r>
-        <w:rPr>
-          <w:rFonts w:ascii="Arial" w:hAnsi="Arial" w:cs="Arial"/>
-          <w:sz w:val="26"/>
-          <w:szCs w:val="26"/>
-          <w:lang w:bidi="he-IL"/>
-        </w:rPr>
-        <w:t>db.background</w:t>
-      </w:r>
-      <w:proofErr w:type="spellEnd"/>
+      <w:r>
+        <w:rPr>
+          <w:rFonts w:ascii="Arial" w:hAnsi="Arial" w:cs="Arial"/>
+          <w:sz w:val="26"/>
+          <w:szCs w:val="26"/>
+          <w:lang w:bidi="he-IL"/>
+        </w:rPr>
+        <w:t>db.occupation</w:t>
+      </w:r>
       <w:r>
         <w:rPr>
           <w:rFonts w:ascii="Arial" w:hAnsi="Arial" w:cs="Arial"/>
@@ -1582,15 +1611,54 @@
           <w:lang w:bidi="he-IL"/>
         </w:rPr>
       </w:pPr>
+    </w:p>
+    <w:p>
+      <w:pPr>
+        <w:spacing w:line="360" w:lineRule="auto"/>
+        <w:rPr>
+          <w:rFonts w:ascii="Arial" w:hAnsi="Arial" w:cs="Arial"/>
+          <w:sz w:val="26"/>
+          <w:szCs w:val="26"/>
+          <w:rtl/>
+          <w:lang w:bidi="he-IL"/>
+        </w:rPr>
+      </w:pPr>
+    </w:p>
+    <w:p>
+      <w:pPr>
+        <w:spacing w:line="360" w:lineRule="auto"/>
+        <w:rPr>
+          <w:rFonts w:ascii="Arial" w:hAnsi="Arial" w:cs="Arial"/>
+          <w:sz w:val="26"/>
+          <w:szCs w:val="26"/>
+          <w:rtl/>
+          <w:lang w:bidi="he-IL"/>
+        </w:rPr>
+      </w:pPr>
+    </w:p>
+    <w:p>
+      <w:pPr>
+        <w:spacing w:line="360" w:lineRule="auto"/>
+        <w:rPr>
+          <w:rFonts w:ascii="Arial" w:hAnsi="Arial" w:cs="Arial"/>
+          <w:sz w:val="26"/>
+          <w:szCs w:val="26"/>
+          <w:rtl/>
+          <w:lang w:bidi="he-IL"/>
+        </w:rPr>
+      </w:pPr>
       <w:r>
         <w:rPr>
           <w:rFonts w:ascii="Arial" w:hAnsi="Arial" w:cs="Arial" w:hint="cs"/>
-          <w:sz w:val="26"/>
-          <w:szCs w:val="26"/>
-          <w:rtl/>
-          <w:lang w:bidi="he-IL"/>
-        </w:rPr>
-        <w:t xml:space="preserve"> </w:t>
+          <w:b/>
+          <w:bCs/>
+          <w:sz w:val="26"/>
+          <w:szCs w:val="26"/>
+          <w:u w:val="single"/>
+          <w:rtl/>
+          <w:lang w:bidi="he-IL"/>
+        </w:rPr>
+        <w:t>חקירת רשויות</w:t>
       </w:r>
     </w:p>
     <w:p>
@@ -1606,23 +1674,266 @@
       </w:pPr>
       <w:r>
         <w:rPr>
+          <w:rFonts w:ascii="Arial" w:hAnsi="Arial" w:cs="Arial"/>
+          <w:sz w:val="26"/>
+          <w:szCs w:val="26"/>
+          <w:lang w:bidi="he-IL"/>
+        </w:rPr>
+        <w:t>{{ db.authorities_1 }}</w:t>
+      </w:r>
+      <w:r>
+        <w:rPr>
+          <w:rFonts w:ascii="Arial" w:hAnsi="Arial" w:cs="Arial"/>
+          <w:sz w:val="26"/>
+          <w:szCs w:val="26"/>
+          <w:lang w:bidi="he-IL"/>
+        </w:rPr>
+        <w:br/>
+      </w:r>
+      <w:r>
+        <w:rPr>
+          <w:rFonts w:ascii="Arial" w:hAnsi="Arial" w:cs="Arial"/>
+          <w:sz w:val="26"/>
+          <w:szCs w:val="26"/>
+          <w:rtl/>
+          <w:lang w:bidi="he-IL"/>
+        </w:rPr>
+        <w:t xml:space="preserve">{{ </w:t>
+      </w:r>
+      <w:r>
+        <w:rPr>
+          <w:rFonts w:ascii="Arial" w:hAnsi="Arial" w:cs="Arial"/>
+          <w:sz w:val="26"/>
+          <w:szCs w:val="26"/>
+          <w:lang w:bidi="he-IL"/>
+        </w:rPr>
+        <w:t>authorities_table_photo</w:t>
+      </w:r>
+      <w:r>
+        <w:rPr>
+          <w:rFonts w:ascii="Arial" w:hAnsi="Arial" w:cs="Arial"/>
+          <w:sz w:val="26"/>
+          <w:szCs w:val="26"/>
+          <w:rtl/>
+          <w:lang w:bidi="he-IL"/>
+        </w:rPr>
+        <w:t xml:space="preserve"> }}</w:t>
+      </w:r>
+    </w:p>
+    <w:p>
+      <w:pPr>
+        <w:spacing w:line="360" w:lineRule="auto"/>
+        <w:rPr>
+          <w:rFonts w:ascii="Arial" w:hAnsi="Arial" w:cs="Arial"/>
+          <w:sz w:val="26"/>
+          <w:szCs w:val="26"/>
+          <w:rtl/>
+          <w:lang w:bidi="he-IL"/>
+        </w:rPr>
+      </w:pPr>
+    </w:p>
+    <w:p>
+      <w:pPr>
+        <w:spacing w:line="360" w:lineRule="auto"/>
+        <w:rPr>
+          <w:rFonts w:ascii="Arial" w:hAnsi="Arial" w:cs="Arial"/>
+          <w:sz w:val="26"/>
+          <w:szCs w:val="26"/>
+          <w:lang w:bidi="he-IL"/>
+        </w:rPr>
+      </w:pPr>
+      <w:r>
+        <w:rPr>
+          <w:rFonts w:ascii="Arial" w:hAnsi="Arial" w:cs="Arial"/>
+          <w:sz w:val="26"/>
+          <w:szCs w:val="26"/>
+          <w:lang w:bidi="he-IL"/>
+        </w:rPr>
+        <w:t>{{db.dnb}}</w:t>
+      </w:r>
+    </w:p>
+    <w:p>
+      <w:pPr>
+        <w:spacing w:line="360" w:lineRule="auto"/>
+        <w:rPr>
+          <w:rFonts w:ascii="Arial" w:hAnsi="Arial" w:cs="Arial"/>
+          <w:sz w:val="26"/>
+          <w:szCs w:val="26"/>
+          <w:rtl/>
+          <w:lang w:bidi="he-IL"/>
+        </w:rPr>
+      </w:pPr>
+    </w:p>
+    <w:p>
+      <w:pPr>
+        <w:spacing w:line="360" w:lineRule="auto"/>
+        <w:rPr>
+          <w:rFonts w:ascii="Arial" w:hAnsi="Arial" w:cs="Arial"/>
+          <w:sz w:val="26"/>
+          <w:szCs w:val="26"/>
+          <w:rtl/>
+          <w:lang w:bidi="he-IL"/>
+        </w:rPr>
+      </w:pPr>
+      <w:r>
+        <w:rPr>
           <w:rFonts w:ascii="Arial" w:hAnsi="Arial" w:cs="Arial" w:hint="cs"/>
-          <w:sz w:val="26"/>
-          <w:szCs w:val="26"/>
-          <w:rtl/>
-          <w:lang w:bidi="he-IL"/>
-        </w:rPr>
-        <w:t xml:space="preserve"> </w:t>
-      </w:r>
+          <w:b/>
+          <w:bCs/>
+          <w:sz w:val="26"/>
+          <w:szCs w:val="26"/>
+          <w:u w:val="single"/>
+          <w:rtl/>
+          <w:lang w:bidi="he-IL"/>
+        </w:rPr>
+        <w:t>חקירת רשויות</w:t>
+      </w:r>
+    </w:p>
+    <w:p>
+      <w:pPr>
+        <w:spacing w:line="360" w:lineRule="auto"/>
+        <w:rPr>
+          <w:rFonts w:ascii="Arial" w:hAnsi="Arial" w:cs="Arial"/>
+          <w:sz w:val="26"/>
+          <w:szCs w:val="26"/>
+          <w:rtl/>
+          <w:lang w:bidi="he-IL"/>
+        </w:rPr>
+      </w:pPr>
+      <w:r>
+        <w:rPr>
+          <w:rFonts w:ascii="Arial" w:hAnsi="Arial" w:cs="Arial"/>
+          <w:sz w:val="26"/>
+          <w:szCs w:val="26"/>
+          <w:lang w:bidi="he-IL"/>
+        </w:rPr>
+        <w:t xml:space="preserve">{{ </w:t>
+      </w:r>
+      <w:r>
+        <w:rPr>
+          <w:rFonts w:ascii="Arial" w:hAnsi="Arial" w:cs="Arial"/>
+          <w:sz w:val="26"/>
+          <w:szCs w:val="26"/>
+          <w:lang w:bidi="he-IL"/>
+        </w:rPr>
+        <w:t xml:space="preserve">db.authorities_2 </w:t>
+      </w:r>
+      <w:r>
+        <w:rPr>
+          <w:rFonts w:ascii="Arial" w:hAnsi="Arial" w:cs="Arial"/>
+          <w:sz w:val="26"/>
+          <w:szCs w:val="26"/>
+          <w:lang w:bidi="he-IL"/>
+        </w:rPr>
+        <w:t>}}</w:t>
+      </w:r>
+      <w:r>
+        <w:rPr>
+          <w:rFonts w:ascii="Arial" w:hAnsi="Arial" w:cs="Arial"/>
+          <w:sz w:val="26"/>
+          <w:szCs w:val="26"/>
+          <w:lang w:bidi="he-IL"/>
+        </w:rPr>
+        <w:br/>
+      </w:r>
+      <w:r>
+        <w:rPr>
+          <w:rFonts w:ascii="Arial" w:hAnsi="Arial" w:cs="Arial"/>
+          <w:sz w:val="26"/>
+          <w:szCs w:val="26"/>
+          <w:lang w:bidi="he-IL"/>
+        </w:rPr>
+        <w:br/>
+      </w:r>
+      <w:r>
+        <w:rPr>
+          <w:rFonts w:ascii="Arial" w:hAnsi="Arial" w:cs="Arial"/>
+          <w:sz w:val="26"/>
+          <w:szCs w:val="26"/>
+          <w:rtl/>
+          <w:lang w:bidi="he-IL"/>
+        </w:rPr>
+        <w:t xml:space="preserve">{{ </w:t>
+      </w:r>
+      <w:r>
+        <w:rPr>
+          <w:rFonts w:ascii="Arial" w:hAnsi="Arial" w:cs="Arial"/>
+          <w:sz w:val="26"/>
+          <w:szCs w:val="26"/>
+          <w:lang w:bidi="he-IL"/>
+        </w:rPr>
+        <w:t>authorities_table_photo_2</w:t>
+      </w:r>
+      <w:r>
+        <w:rPr>
+          <w:rFonts w:ascii="Arial" w:hAnsi="Arial" w:cs="Arial"/>
+          <w:sz w:val="26"/>
+          <w:szCs w:val="26"/>
+          <w:rtl/>
+          <w:lang w:bidi="he-IL"/>
+        </w:rPr>
+        <w:t xml:space="preserve"> }}</w:t>
+      </w:r>
+      <w:r>
+        <w:rPr>
+          <w:rFonts w:ascii="Arial" w:hAnsi="Arial" w:cs="Arial"/>
+          <w:sz w:val="26"/>
+          <w:szCs w:val="26"/>
+          <w:rtl/>
+          <w:lang w:bidi="he-IL"/>
+        </w:rPr>
+        <w:br/>
+      </w:r>
+      <w:r>
+        <w:rPr>
+          <w:rFonts w:ascii="Arial" w:hAnsi="Arial" w:cs="Arial"/>
+          <w:sz w:val="26"/>
+          <w:szCs w:val="26"/>
+          <w:rtl/>
+          <w:lang w:bidi="he-IL"/>
+        </w:rPr>
+        <w:br/>
+      </w:r>
+    </w:p>
+    <w:p>
+      <w:pPr>
+        <w:spacing w:line="360" w:lineRule="auto"/>
+        <w:rPr>
+          <w:rFonts w:ascii="Arial" w:hAnsi="Arial" w:cs="Arial"/>
+          <w:b/>
+          <w:bCs/>
+          <w:sz w:val="26"/>
+          <w:szCs w:val="26"/>
+          <w:u w:val="single"/>
+          <w:rtl/>
+          <w:lang w:bidi="he-IL"/>
+        </w:rPr>
+      </w:pPr>
       <w:r>
         <w:rPr>
           <w:rFonts w:ascii="Arial" w:hAnsi="Arial" w:cs="Arial" w:hint="cs"/>
-          <w:sz w:val="26"/>
-          <w:szCs w:val="26"/>
-          <w:rtl/>
-          <w:lang w:bidi="he-IL"/>
-        </w:rPr>
-        <w:t xml:space="preserve"> </w:t>
+          <w:b/>
+          <w:bCs/>
+          <w:sz w:val="26"/>
+          <w:szCs w:val="26"/>
+          <w:u w:val="single"/>
+          <w:rtl/>
+          <w:lang w:bidi="he-IL"/>
+        </w:rPr>
+        <w:t>ח</w:t>
+      </w:r>
+      <w:r>
+        <w:rPr>
+          <w:rFonts w:ascii="Arial" w:hAnsi="Arial" w:cs="Arial" w:hint="cs"/>
+          <w:b/>
+          <w:bCs/>
+          <w:sz w:val="26"/>
+          <w:szCs w:val="26"/>
+          <w:u w:val="single"/>
+          <w:rtl/>
+          <w:lang w:bidi="he-IL"/>
+        </w:rPr>
+        <w:t>קירות במאגרי מידע</w:t>
       </w:r>
     </w:p>
     <w:p>
@@ -1630,517 +1941,14 @@
         <w:spacing w:line="360" w:lineRule="auto"/>
         <w:rPr>
           <w:rFonts w:ascii="Arial" w:hAnsi="Arial" w:cs="Arial"/>
-          <w:b/>
-          <w:bCs/>
-          <w:sz w:val="26"/>
-          <w:szCs w:val="26"/>
-          <w:u w:val="single"/>
-          <w:rtl/>
+          <w:sz w:val="26"/>
+          <w:szCs w:val="26"/>
           <w:lang w:bidi="he-IL"/>
         </w:rPr>
       </w:pPr>
       <w:r>
         <w:rPr>
           <w:rFonts w:ascii="Arial" w:hAnsi="Arial" w:cs="Arial" w:hint="cs"/>
-          <w:b/>
-          <w:bCs/>
-          <w:sz w:val="26"/>
-          <w:szCs w:val="26"/>
-          <w:u w:val="single"/>
-          <w:rtl/>
-          <w:lang w:bidi="he-IL"/>
-        </w:rPr>
-        <w:t>עיסוק</w:t>
-      </w:r>
-    </w:p>
-    <w:p>
-      <w:pPr>
-        <w:spacing w:line="360" w:lineRule="auto"/>
-        <w:rPr>
-          <w:rFonts w:ascii="Arial" w:hAnsi="Arial" w:cs="Arial"/>
-          <w:sz w:val="26"/>
-          <w:szCs w:val="26"/>
-          <w:rtl/>
-          <w:lang w:bidi="he-IL"/>
-        </w:rPr>
-      </w:pPr>
-      <w:r>
-        <w:rPr>
-          <w:rFonts w:ascii="Arial" w:hAnsi="Arial" w:cs="Arial"/>
-          <w:sz w:val="26"/>
-          <w:szCs w:val="26"/>
-          <w:rtl/>
-          <w:lang w:bidi="he-IL"/>
-        </w:rPr>
-        <w:t xml:space="preserve">{{ </w:t>
-      </w:r>
-      <w:proofErr w:type="spellStart"/>
-      <w:r>
-        <w:rPr>
-          <w:rFonts w:ascii="Arial" w:hAnsi="Arial" w:cs="Arial"/>
-          <w:sz w:val="26"/>
-          <w:szCs w:val="26"/>
-          <w:lang w:bidi="he-IL"/>
-        </w:rPr>
-        <w:t>db.occupation</w:t>
-      </w:r>
-      <w:proofErr w:type="spellEnd"/>
-      <w:r>
-        <w:rPr>
-          <w:rFonts w:ascii="Arial" w:hAnsi="Arial" w:cs="Arial"/>
-          <w:sz w:val="26"/>
-          <w:szCs w:val="26"/>
-          <w:rtl/>
-          <w:lang w:bidi="he-IL"/>
-        </w:rPr>
-        <w:t xml:space="preserve"> }}</w:t>
-      </w:r>
-      <w:r>
-        <w:rPr>
-          <w:rFonts w:ascii="Arial" w:hAnsi="Arial" w:cs="Arial"/>
-          <w:sz w:val="26"/>
-          <w:szCs w:val="26"/>
-          <w:lang w:bidi="he-IL"/>
-        </w:rPr>
-        <w:t>.</w:t>
-      </w:r>
-    </w:p>
-    <w:p>
-      <w:pPr>
-        <w:spacing w:line="360" w:lineRule="auto"/>
-        <w:rPr>
-          <w:rFonts w:ascii="Arial" w:hAnsi="Arial" w:cs="Arial"/>
-          <w:sz w:val="26"/>
-          <w:szCs w:val="26"/>
-          <w:rtl/>
-          <w:lang w:bidi="he-IL"/>
-        </w:rPr>
-      </w:pPr>
-    </w:p>
-    <w:p>
-      <w:pPr>
-        <w:spacing w:line="360" w:lineRule="auto"/>
-        <w:rPr>
-          <w:rFonts w:ascii="Arial" w:hAnsi="Arial" w:cs="Arial"/>
-          <w:sz w:val="26"/>
-          <w:szCs w:val="26"/>
-          <w:rtl/>
-          <w:lang w:bidi="he-IL"/>
-        </w:rPr>
-      </w:pPr>
-    </w:p>
-    <w:p>
-      <w:pPr>
-        <w:spacing w:line="360" w:lineRule="auto"/>
-        <w:rPr>
-          <w:rFonts w:ascii="Arial" w:hAnsi="Arial" w:cs="Arial"/>
-          <w:sz w:val="26"/>
-          <w:szCs w:val="26"/>
-          <w:rtl/>
-          <w:lang w:bidi="he-IL"/>
-        </w:rPr>
-      </w:pPr>
-    </w:p>
-    <w:p>
-      <w:pPr>
-        <w:spacing w:line="360" w:lineRule="auto"/>
-        <w:rPr>
-          <w:rFonts w:ascii="Arial" w:hAnsi="Arial" w:cs="Arial"/>
-          <w:sz w:val="26"/>
-          <w:szCs w:val="26"/>
-          <w:rtl/>
-          <w:lang w:bidi="he-IL"/>
-        </w:rPr>
-      </w:pPr>
-      <w:r>
-        <w:rPr>
-          <w:rFonts w:ascii="Arial" w:hAnsi="Arial" w:cs="Arial" w:hint="cs"/>
-          <w:b/>
-          <w:bCs/>
-          <w:sz w:val="26"/>
-          <w:szCs w:val="26"/>
-          <w:u w:val="single"/>
-          <w:rtl/>
-          <w:lang w:bidi="he-IL"/>
-        </w:rPr>
-        <w:t>חקירת רשויות</w:t>
-      </w:r>
-    </w:p>
-    <w:p>
-      <w:pPr>
-        <w:spacing w:line="360" w:lineRule="auto"/>
-        <w:rPr>
-          <w:rFonts w:ascii="Arial" w:hAnsi="Arial" w:cs="Arial"/>
-          <w:sz w:val="26"/>
-          <w:szCs w:val="26"/>
-          <w:rtl/>
-          <w:lang w:bidi="he-IL"/>
-        </w:rPr>
-      </w:pPr>
-      <w:proofErr w:type="gramStart"/>
-      <w:r>
-        <w:rPr>
-          <w:rFonts w:ascii="Arial" w:hAnsi="Arial" w:cs="Arial"/>
-          <w:sz w:val="26"/>
-          <w:szCs w:val="26"/>
-          <w:lang w:bidi="he-IL"/>
-        </w:rPr>
-        <w:t>{{ db</w:t>
-      </w:r>
-      <w:proofErr w:type="gramEnd"/>
-      <w:r>
-        <w:rPr>
-          <w:rFonts w:ascii="Arial" w:hAnsi="Arial" w:cs="Arial"/>
-          <w:sz w:val="26"/>
-          <w:szCs w:val="26"/>
-          <w:lang w:bidi="he-IL"/>
-        </w:rPr>
-        <w:t>.authorities_1 }}</w:t>
-      </w:r>
-      <w:r>
-        <w:rPr>
-          <w:rFonts w:ascii="Arial" w:hAnsi="Arial" w:cs="Arial"/>
-          <w:sz w:val="26"/>
-          <w:szCs w:val="26"/>
-          <w:lang w:bidi="he-IL"/>
-        </w:rPr>
-        <w:br/>
-      </w:r>
-      <w:proofErr w:type="gramStart"/>
-      <w:r>
-        <w:rPr>
-          <w:rFonts w:ascii="Arial" w:hAnsi="Arial" w:cs="Arial"/>
-          <w:sz w:val="26"/>
-          <w:szCs w:val="26"/>
-          <w:rtl/>
-          <w:lang w:bidi="he-IL"/>
-        </w:rPr>
-        <w:t xml:space="preserve">{{ </w:t>
-      </w:r>
-      <w:proofErr w:type="spellStart"/>
-      <w:r>
-        <w:rPr>
-          <w:rFonts w:ascii="Arial" w:hAnsi="Arial" w:cs="Arial"/>
-          <w:sz w:val="26"/>
-          <w:szCs w:val="26"/>
-          <w:lang w:bidi="he-IL"/>
-        </w:rPr>
-        <w:t>authorities</w:t>
-      </w:r>
-      <w:proofErr w:type="gramEnd"/>
-      <w:r>
-        <w:rPr>
-          <w:rFonts w:ascii="Arial" w:hAnsi="Arial" w:cs="Arial"/>
-          <w:sz w:val="26"/>
-          <w:szCs w:val="26"/>
-          <w:lang w:bidi="he-IL"/>
-        </w:rPr>
-        <w:t>_table_</w:t>
-      </w:r>
-      <w:proofErr w:type="gramStart"/>
-      <w:r>
-        <w:rPr>
-          <w:rFonts w:ascii="Arial" w:hAnsi="Arial" w:cs="Arial"/>
-          <w:sz w:val="26"/>
-          <w:szCs w:val="26"/>
-          <w:lang w:bidi="he-IL"/>
-        </w:rPr>
-        <w:t>photo</w:t>
-      </w:r>
-      <w:proofErr w:type="spellEnd"/>
-      <w:r>
-        <w:rPr>
-          <w:rFonts w:ascii="Arial" w:hAnsi="Arial" w:cs="Arial"/>
-          <w:sz w:val="26"/>
-          <w:szCs w:val="26"/>
-          <w:rtl/>
-          <w:lang w:bidi="he-IL"/>
-        </w:rPr>
-        <w:t xml:space="preserve"> }</w:t>
-      </w:r>
-      <w:proofErr w:type="gramEnd"/>
-      <w:r>
-        <w:rPr>
-          <w:rFonts w:ascii="Arial" w:hAnsi="Arial" w:cs="Arial"/>
-          <w:sz w:val="26"/>
-          <w:szCs w:val="26"/>
-          <w:rtl/>
-          <w:lang w:bidi="he-IL"/>
-        </w:rPr>
-        <w:t>}</w:t>
-      </w:r>
-    </w:p>
-    <w:p>
-      <w:pPr>
-        <w:spacing w:line="360" w:lineRule="auto"/>
-        <w:rPr>
-          <w:rFonts w:ascii="Arial" w:hAnsi="Arial" w:cs="Arial"/>
-          <w:sz w:val="26"/>
-          <w:szCs w:val="26"/>
-          <w:rtl/>
-          <w:lang w:bidi="he-IL"/>
-        </w:rPr>
-      </w:pPr>
-    </w:p>
-    <w:p>
-      <w:pPr>
-        <w:spacing w:line="360" w:lineRule="auto"/>
-        <w:rPr>
-          <w:rFonts w:ascii="Arial" w:hAnsi="Arial" w:cs="Arial"/>
-          <w:sz w:val="26"/>
-          <w:szCs w:val="26"/>
-          <w:lang w:bidi="he-IL"/>
-        </w:rPr>
-      </w:pPr>
-      <w:r>
-        <w:rPr>
-          <w:rFonts w:ascii="Arial" w:hAnsi="Arial" w:cs="Arial"/>
-          <w:sz w:val="26"/>
-          <w:szCs w:val="26"/>
-          <w:lang w:bidi="he-IL"/>
-        </w:rPr>
-        <w:t>{{</w:t>
-      </w:r>
-      <w:proofErr w:type="spellStart"/>
-      <w:r>
-        <w:rPr>
-          <w:rFonts w:ascii="Arial" w:hAnsi="Arial" w:cs="Arial"/>
-          <w:sz w:val="26"/>
-          <w:szCs w:val="26"/>
-          <w:lang w:bidi="he-IL"/>
-        </w:rPr>
-        <w:t>db.dnb</w:t>
-      </w:r>
-      <w:proofErr w:type="spellEnd"/>
-      <w:r>
-        <w:rPr>
-          <w:rFonts w:ascii="Arial" w:hAnsi="Arial" w:cs="Arial"/>
-          <w:sz w:val="26"/>
-          <w:szCs w:val="26"/>
-          <w:lang w:bidi="he-IL"/>
-        </w:rPr>
-        <w:t>}}</w:t>
-      </w:r>
-    </w:p>
-    <w:p>
-      <w:pPr>
-        <w:spacing w:line="360" w:lineRule="auto"/>
-        <w:rPr>
-          <w:rFonts w:ascii="Arial" w:hAnsi="Arial" w:cs="Arial"/>
-          <w:sz w:val="26"/>
-          <w:szCs w:val="26"/>
-          <w:rtl/>
-          <w:lang w:bidi="he-IL"/>
-        </w:rPr>
-      </w:pPr>
-    </w:p>
-    <w:p>
-      <w:pPr>
-        <w:spacing w:line="360" w:lineRule="auto"/>
-        <w:rPr>
-          <w:rFonts w:ascii="Arial" w:hAnsi="Arial" w:cs="Arial"/>
-          <w:sz w:val="26"/>
-          <w:szCs w:val="26"/>
-          <w:rtl/>
-          <w:lang w:bidi="he-IL"/>
-        </w:rPr>
-      </w:pPr>
-      <w:r>
-        <w:rPr>
-          <w:rFonts w:ascii="Arial" w:hAnsi="Arial" w:cs="Arial" w:hint="cs"/>
-          <w:b/>
-          <w:bCs/>
-          <w:sz w:val="26"/>
-          <w:szCs w:val="26"/>
-          <w:u w:val="single"/>
-          <w:rtl/>
-          <w:lang w:bidi="he-IL"/>
-        </w:rPr>
-        <w:t>חקירת רשויות</w:t>
-      </w:r>
-    </w:p>
-    <w:p>
-      <w:pPr>
-        <w:spacing w:line="360" w:lineRule="auto"/>
-        <w:rPr>
-          <w:rFonts w:ascii="Arial" w:hAnsi="Arial" w:cs="Arial"/>
-          <w:sz w:val="26"/>
-          <w:szCs w:val="26"/>
-          <w:rtl/>
-          <w:lang w:bidi="he-IL"/>
-        </w:rPr>
-      </w:pPr>
-      <w:proofErr w:type="gramStart"/>
-      <w:r>
-        <w:rPr>
-          <w:rFonts w:ascii="Arial" w:hAnsi="Arial" w:cs="Arial"/>
-          <w:sz w:val="26"/>
-          <w:szCs w:val="26"/>
-          <w:lang w:bidi="he-IL"/>
-        </w:rPr>
-        <w:t xml:space="preserve">{{ </w:t>
-      </w:r>
-      <w:r>
-        <w:rPr>
-          <w:rFonts w:ascii="Arial" w:hAnsi="Arial" w:cs="Arial"/>
-          <w:sz w:val="26"/>
-          <w:szCs w:val="26"/>
-          <w:lang w:bidi="he-IL"/>
-        </w:rPr>
-        <w:t>db</w:t>
-      </w:r>
-      <w:proofErr w:type="gramEnd"/>
-      <w:r>
-        <w:rPr>
-          <w:rFonts w:ascii="Arial" w:hAnsi="Arial" w:cs="Arial"/>
-          <w:sz w:val="26"/>
-          <w:szCs w:val="26"/>
-          <w:lang w:bidi="he-IL"/>
-        </w:rPr>
-        <w:t xml:space="preserve">.authorities_2 </w:t>
-      </w:r>
-      <w:r>
-        <w:rPr>
-          <w:rFonts w:ascii="Arial" w:hAnsi="Arial" w:cs="Arial"/>
-          <w:sz w:val="26"/>
-          <w:szCs w:val="26"/>
-          <w:lang w:bidi="he-IL"/>
-        </w:rPr>
-        <w:t>}}</w:t>
-      </w:r>
-      <w:r>
-        <w:rPr>
-          <w:rFonts w:ascii="Arial" w:hAnsi="Arial" w:cs="Arial"/>
-          <w:sz w:val="26"/>
-          <w:szCs w:val="26"/>
-          <w:lang w:bidi="he-IL"/>
-        </w:rPr>
-        <w:br/>
-      </w:r>
-      <w:r>
-        <w:rPr>
-          <w:rFonts w:ascii="Arial" w:hAnsi="Arial" w:cs="Arial"/>
-          <w:sz w:val="26"/>
-          <w:szCs w:val="26"/>
-          <w:lang w:bidi="he-IL"/>
-        </w:rPr>
-        <w:br/>
-      </w:r>
-      <w:proofErr w:type="gramStart"/>
-      <w:r>
-        <w:rPr>
-          <w:rFonts w:ascii="Arial" w:hAnsi="Arial" w:cs="Arial"/>
-          <w:sz w:val="26"/>
-          <w:szCs w:val="26"/>
-          <w:rtl/>
-          <w:lang w:bidi="he-IL"/>
-        </w:rPr>
-        <w:t xml:space="preserve">{{ </w:t>
-      </w:r>
-      <w:r>
-        <w:rPr>
-          <w:rFonts w:ascii="Arial" w:hAnsi="Arial" w:cs="Arial"/>
-          <w:sz w:val="26"/>
-          <w:szCs w:val="26"/>
-          <w:lang w:bidi="he-IL"/>
-        </w:rPr>
-        <w:t>authorities</w:t>
-      </w:r>
-      <w:proofErr w:type="gramEnd"/>
-      <w:r>
-        <w:rPr>
-          <w:rFonts w:ascii="Arial" w:hAnsi="Arial" w:cs="Arial"/>
-          <w:sz w:val="26"/>
-          <w:szCs w:val="26"/>
-          <w:lang w:bidi="he-IL"/>
-        </w:rPr>
-        <w:t>_table_photo_2</w:t>
-      </w:r>
-      <w:r>
-        <w:rPr>
-          <w:rFonts w:ascii="Arial" w:hAnsi="Arial" w:cs="Arial"/>
-          <w:sz w:val="26"/>
-          <w:szCs w:val="26"/>
-          <w:rtl/>
-          <w:lang w:bidi="he-IL"/>
-        </w:rPr>
-        <w:t xml:space="preserve"> }}</w:t>
-      </w:r>
-      <w:r>
-        <w:rPr>
-          <w:rFonts w:ascii="Arial" w:hAnsi="Arial" w:cs="Arial"/>
-          <w:sz w:val="26"/>
-          <w:szCs w:val="26"/>
-          <w:rtl/>
-          <w:lang w:bidi="he-IL"/>
-        </w:rPr>
-        <w:br/>
-      </w:r>
-      <w:r>
-        <w:rPr>
-          <w:rFonts w:ascii="Arial" w:hAnsi="Arial" w:cs="Arial"/>
-          <w:sz w:val="26"/>
-          <w:szCs w:val="26"/>
-          <w:rtl/>
-          <w:lang w:bidi="he-IL"/>
-        </w:rPr>
-        <w:br/>
-      </w:r>
-    </w:p>
-    <w:p>
-      <w:pPr>
-        <w:spacing w:line="360" w:lineRule="auto"/>
-        <w:rPr>
-          <w:rFonts w:ascii="Arial" w:hAnsi="Arial" w:cs="Arial"/>
-          <w:b/>
-          <w:bCs/>
-          <w:sz w:val="26"/>
-          <w:szCs w:val="26"/>
-          <w:u w:val="single"/>
-          <w:rtl/>
-          <w:lang w:bidi="he-IL"/>
-        </w:rPr>
-      </w:pPr>
-      <w:r>
-        <w:rPr>
-          <w:rFonts w:ascii="Arial" w:hAnsi="Arial" w:cs="Arial" w:hint="cs"/>
-          <w:b/>
-          <w:bCs/>
-          <w:sz w:val="26"/>
-          <w:szCs w:val="26"/>
-          <w:u w:val="single"/>
-          <w:rtl/>
-          <w:lang w:bidi="he-IL"/>
-        </w:rPr>
-        <w:t>ח</w:t>
-      </w:r>
-      <w:r>
-        <w:rPr>
-          <w:rFonts w:ascii="Arial" w:hAnsi="Arial" w:cs="Arial" w:hint="cs"/>
-          <w:b/>
-          <w:bCs/>
-          <w:sz w:val="26"/>
-          <w:szCs w:val="26"/>
-          <w:u w:val="single"/>
-          <w:rtl/>
-          <w:lang w:bidi="he-IL"/>
-        </w:rPr>
-        <w:t>קירות במאגרי מידע</w:t>
-      </w:r>
-    </w:p>
-    <w:p>
-      <w:pPr>
-        <w:spacing w:line="360" w:lineRule="auto"/>
-        <w:rPr>
-          <w:rFonts w:ascii="Arial" w:hAnsi="Arial" w:cs="Arial"/>
-          <w:sz w:val="26"/>
-          <w:szCs w:val="26"/>
-          <w:lang w:bidi="he-IL"/>
-        </w:rPr>
-      </w:pPr>
-      <w:r>
-        <w:rPr>
-          <w:rFonts w:ascii="Arial" w:hAnsi="Arial" w:cs="Arial" w:hint="cs"/>
           <w:sz w:val="26"/>
           <w:szCs w:val="26"/>
           <w:rtl/>
@@ -2155,27 +1963,7 @@
           <w:szCs w:val="26"/>
           <w:lang w:bidi="he-IL"/>
         </w:rPr>
-        <w:t>{{</w:t>
-      </w:r>
-      <w:proofErr w:type="spellStart"/>
-      <w:r>
-        <w:rPr>
-          <w:rFonts w:ascii="Arial" w:hAnsi="Arial" w:cs="Arial"/>
-          <w:sz w:val="26"/>
-          <w:szCs w:val="26"/>
-          <w:lang w:bidi="he-IL"/>
-        </w:rPr>
-        <w:t>db.social_media</w:t>
-      </w:r>
-      <w:proofErr w:type="spellEnd"/>
-      <w:r>
-        <w:rPr>
-          <w:rFonts w:ascii="Arial" w:hAnsi="Arial" w:cs="Arial"/>
-          <w:sz w:val="26"/>
-          <w:szCs w:val="26"/>
-          <w:lang w:bidi="he-IL"/>
-        </w:rPr>
-        <w:t>}}</w:t>
+        <w:t>{{db.social_media}}</w:t>
       </w:r>
       <w:r>
         <w:rPr>
@@ -2215,19 +2003,8 @@
           <w:szCs w:val="26"/>
           <w:lang w:bidi="he-IL"/>
         </w:rPr>
-        <w:t xml:space="preserve">for page in </w:t>
-      </w:r>
-      <w:proofErr w:type="spellStart"/>
-      <w:r>
-        <w:rPr>
-          <w:rFonts w:ascii="Arial" w:hAnsi="Arial" w:cs="Arial"/>
-          <w:sz w:val="26"/>
-          <w:szCs w:val="26"/>
-          <w:lang w:bidi="he-IL"/>
-        </w:rPr>
-        <w:t>photo_pages</w:t>
-      </w:r>
-      <w:proofErr w:type="spellEnd"/>
+        <w:t>for page in photo_pages</w:t>
+      </w:r>
       <w:r>
         <w:rPr>
           <w:rFonts w:ascii="Arial" w:hAnsi="Arial" w:cs="Arial"/>
@@ -2267,27 +2044,7 @@
           <w:szCs w:val="26"/>
           <w:lang w:bidi="he-IL"/>
         </w:rPr>
-        <w:t xml:space="preserve">if </w:t>
-      </w:r>
-      <w:proofErr w:type="spellStart"/>
-      <w:r>
-        <w:rPr>
-          <w:rFonts w:ascii="Arial" w:hAnsi="Arial" w:cs="Arial"/>
-          <w:sz w:val="26"/>
-          <w:szCs w:val="26"/>
-          <w:lang w:bidi="he-IL"/>
-        </w:rPr>
-        <w:t>page.layout</w:t>
-      </w:r>
-      <w:proofErr w:type="spellEnd"/>
-      <w:r>
-        <w:rPr>
-          <w:rFonts w:ascii="Arial" w:hAnsi="Arial" w:cs="Arial"/>
-          <w:sz w:val="26"/>
-          <w:szCs w:val="26"/>
-          <w:lang w:bidi="he-IL"/>
-        </w:rPr>
-        <w:t xml:space="preserve"> == 'row</w:t>
+        <w:t>if page.layout == 'row</w:t>
       </w:r>
       <w:r>
         <w:rPr>
@@ -2311,189 +2068,52 @@
           <w:lang w:bidi="he-IL"/>
         </w:rPr>
       </w:pPr>
-      <w:proofErr w:type="gramStart"/>
-      <w:r>
-        <w:rPr>
-          <w:rFonts w:ascii="Arial" w:hAnsi="Arial" w:cs="Arial"/>
-          <w:sz w:val="26"/>
-          <w:szCs w:val="26"/>
-          <w:lang w:bidi="he-IL"/>
-        </w:rPr>
-        <w:t xml:space="preserve">{{ </w:t>
-      </w:r>
-      <w:proofErr w:type="spellStart"/>
-      <w:r>
-        <w:rPr>
-          <w:rFonts w:ascii="Arial" w:hAnsi="Arial" w:cs="Arial"/>
-          <w:sz w:val="26"/>
-          <w:szCs w:val="26"/>
-          <w:lang w:bidi="he-IL"/>
-        </w:rPr>
-        <w:t>page</w:t>
-      </w:r>
-      <w:proofErr w:type="gramEnd"/>
-      <w:r>
-        <w:rPr>
-          <w:rFonts w:ascii="Arial" w:hAnsi="Arial" w:cs="Arial"/>
-          <w:sz w:val="26"/>
-          <w:szCs w:val="26"/>
-          <w:lang w:bidi="he-IL"/>
-        </w:rPr>
-        <w:t>.</w:t>
-      </w:r>
-      <w:proofErr w:type="gramStart"/>
-      <w:r>
-        <w:rPr>
-          <w:rFonts w:ascii="Arial" w:hAnsi="Arial" w:cs="Arial"/>
-          <w:sz w:val="26"/>
-          <w:szCs w:val="26"/>
-          <w:lang w:bidi="he-IL"/>
-        </w:rPr>
-        <w:t>photos</w:t>
-      </w:r>
-      <w:proofErr w:type="spellEnd"/>
-      <w:r>
-        <w:rPr>
-          <w:rFonts w:ascii="Arial" w:hAnsi="Arial" w:cs="Arial"/>
-          <w:sz w:val="26"/>
-          <w:szCs w:val="26"/>
-          <w:rtl/>
-          <w:lang w:bidi="he-IL"/>
-        </w:rPr>
-        <w:t>[</w:t>
-      </w:r>
-      <w:proofErr w:type="gramEnd"/>
-      <w:r>
-        <w:rPr>
-          <w:rFonts w:ascii="Arial" w:hAnsi="Arial" w:cs="Arial"/>
-          <w:sz w:val="26"/>
-          <w:szCs w:val="26"/>
-          <w:rtl/>
-          <w:lang w:bidi="he-IL"/>
-        </w:rPr>
-        <w:t>0</w:t>
-      </w:r>
-      <w:proofErr w:type="gramStart"/>
-      <w:r>
-        <w:rPr>
-          <w:rFonts w:ascii="Arial" w:hAnsi="Arial" w:cs="Arial"/>
-          <w:sz w:val="26"/>
-          <w:szCs w:val="26"/>
-          <w:rtl/>
-          <w:lang w:bidi="he-IL"/>
-        </w:rPr>
-        <w:t xml:space="preserve">] </w:t>
-      </w:r>
-      <w:r>
-        <w:rPr>
-          <w:rFonts w:ascii="Arial" w:hAnsi="Arial" w:cs="Arial"/>
-          <w:sz w:val="26"/>
-          <w:szCs w:val="26"/>
-          <w:lang w:bidi="he-IL"/>
-        </w:rPr>
-        <w:t>}</w:t>
-      </w:r>
-      <w:proofErr w:type="gramEnd"/>
-      <w:r>
-        <w:rPr>
-          <w:rFonts w:ascii="Arial" w:hAnsi="Arial" w:cs="Arial"/>
-          <w:sz w:val="26"/>
-          <w:szCs w:val="26"/>
-          <w:lang w:bidi="he-IL"/>
-        </w:rPr>
-        <w:t xml:space="preserve">} </w:t>
-      </w:r>
-      <w:proofErr w:type="gramStart"/>
-      <w:r>
-        <w:rPr>
-          <w:rFonts w:ascii="Arial" w:hAnsi="Arial" w:cs="Arial"/>
-          <w:sz w:val="26"/>
-          <w:szCs w:val="26"/>
-          <w:lang w:bidi="he-IL"/>
-        </w:rPr>
-        <w:t xml:space="preserve">{{ </w:t>
-      </w:r>
-      <w:proofErr w:type="spellStart"/>
-      <w:r>
-        <w:rPr>
-          <w:rFonts w:ascii="Arial" w:hAnsi="Arial" w:cs="Arial"/>
-          <w:sz w:val="26"/>
-          <w:szCs w:val="26"/>
-          <w:lang w:bidi="he-IL"/>
-        </w:rPr>
-        <w:t>page</w:t>
-      </w:r>
-      <w:proofErr w:type="gramEnd"/>
-      <w:r>
-        <w:rPr>
-          <w:rFonts w:ascii="Arial" w:hAnsi="Arial" w:cs="Arial"/>
-          <w:sz w:val="26"/>
-          <w:szCs w:val="26"/>
-          <w:lang w:bidi="he-IL"/>
-        </w:rPr>
-        <w:t>.</w:t>
-      </w:r>
-      <w:proofErr w:type="gramStart"/>
-      <w:r>
-        <w:rPr>
-          <w:rFonts w:ascii="Arial" w:hAnsi="Arial" w:cs="Arial"/>
-          <w:sz w:val="26"/>
-          <w:szCs w:val="26"/>
-          <w:lang w:bidi="he-IL"/>
-        </w:rPr>
-        <w:t>photos</w:t>
-      </w:r>
-      <w:proofErr w:type="spellEnd"/>
-      <w:r>
-        <w:rPr>
-          <w:rFonts w:ascii="Arial" w:hAnsi="Arial" w:cs="Arial"/>
-          <w:sz w:val="26"/>
-          <w:szCs w:val="26"/>
-          <w:rtl/>
-          <w:lang w:bidi="he-IL"/>
-        </w:rPr>
-        <w:t>[</w:t>
-      </w:r>
-      <w:proofErr w:type="gramEnd"/>
-      <w:r>
-        <w:rPr>
-          <w:rFonts w:ascii="Arial" w:hAnsi="Arial" w:cs="Arial"/>
-          <w:sz w:val="26"/>
-          <w:szCs w:val="26"/>
-          <w:rtl/>
-          <w:lang w:bidi="he-IL"/>
-        </w:rPr>
-        <w:t>1</w:t>
-      </w:r>
-      <w:proofErr w:type="gramStart"/>
-      <w:r>
-        <w:rPr>
-          <w:rFonts w:ascii="Arial" w:hAnsi="Arial" w:cs="Arial"/>
-          <w:sz w:val="26"/>
-          <w:szCs w:val="26"/>
-          <w:rtl/>
-          <w:lang w:bidi="he-IL"/>
-        </w:rPr>
-        <w:t xml:space="preserve">] </w:t>
-      </w:r>
-      <w:r>
-        <w:rPr>
-          <w:rFonts w:ascii="Arial" w:hAnsi="Arial" w:cs="Arial"/>
-          <w:sz w:val="26"/>
-          <w:szCs w:val="26"/>
-          <w:lang w:bidi="he-IL"/>
-        </w:rPr>
-        <w:t>}</w:t>
-      </w:r>
-      <w:proofErr w:type="gramEnd"/>
-      <w:r>
-        <w:rPr>
-          <w:rFonts w:ascii="Arial" w:hAnsi="Arial" w:cs="Arial"/>
-          <w:sz w:val="26"/>
-          <w:szCs w:val="26"/>
-          <w:lang w:bidi="he-IL"/>
-        </w:rPr>
-        <w:t>}</w:t>
+      <w:r>
+        <w:rPr>
+          <w:rFonts w:ascii="Arial" w:hAnsi="Arial" w:cs="Arial"/>
+          <w:sz w:val="26"/>
+          <w:szCs w:val="26"/>
+          <w:lang w:bidi="he-IL"/>
+        </w:rPr>
+        <w:t>{{ page.photos</w:t>
+      </w:r>
+      <w:r>
+        <w:rPr>
+          <w:rFonts w:ascii="Arial" w:hAnsi="Arial" w:cs="Arial"/>
+          <w:sz w:val="26"/>
+          <w:szCs w:val="26"/>
+          <w:rtl/>
+          <w:lang w:bidi="he-IL"/>
+        </w:rPr>
+        <w:t xml:space="preserve">[0] </w:t>
+      </w:r>
+      <w:r>
+        <w:rPr>
+          <w:rFonts w:ascii="Arial" w:hAnsi="Arial" w:cs="Arial"/>
+          <w:sz w:val="26"/>
+          <w:szCs w:val="26"/>
+          <w:lang w:bidi="he-IL"/>
+        </w:rPr>
+        <w:t>}} {{ page.photos</w:t>
+      </w:r>
+      <w:r>
+        <w:rPr>
+          <w:rFonts w:ascii="Arial" w:hAnsi="Arial" w:cs="Arial"/>
+          <w:sz w:val="26"/>
+          <w:szCs w:val="26"/>
+          <w:rtl/>
+          <w:lang w:bidi="he-IL"/>
+        </w:rPr>
+        <w:t xml:space="preserve">[1] </w:t>
+      </w:r>
+      <w:r>
+        <w:rPr>
+          <w:rFonts w:ascii="Arial" w:hAnsi="Arial" w:cs="Arial"/>
+          <w:sz w:val="26"/>
+          <w:szCs w:val="26"/>
+          <w:lang w:bidi="he-IL"/>
+        </w:rPr>
+        <w:t>}}</w:t>
       </w:r>
     </w:p>
     <w:p>
@@ -2517,45 +2137,14 @@
         </w:rPr>
         <w:t xml:space="preserve">{% </w:t>
       </w:r>
-      <w:proofErr w:type="spellStart"/>
-      <w:r>
-        <w:rPr>
-          <w:rFonts w:ascii="Arial" w:hAnsi="Arial" w:cs="Arial"/>
-          <w:sz w:val="26"/>
-          <w:szCs w:val="26"/>
-          <w:lang w:bidi="he-IL"/>
-        </w:rPr>
-        <w:t>elif</w:t>
-      </w:r>
-      <w:proofErr w:type="spellEnd"/>
-      <w:r>
-        <w:rPr>
-          <w:rFonts w:ascii="Arial" w:hAnsi="Arial" w:cs="Arial"/>
-          <w:sz w:val="26"/>
-          <w:szCs w:val="26"/>
-          <w:lang w:bidi="he-IL"/>
-        </w:rPr>
-        <w:t xml:space="preserve"> </w:t>
-      </w:r>
-      <w:proofErr w:type="spellStart"/>
-      <w:r>
-        <w:rPr>
-          <w:rFonts w:ascii="Arial" w:hAnsi="Arial" w:cs="Arial"/>
-          <w:sz w:val="26"/>
-          <w:szCs w:val="26"/>
-          <w:lang w:bidi="he-IL"/>
-        </w:rPr>
-        <w:t>page.layout</w:t>
-      </w:r>
-      <w:proofErr w:type="spellEnd"/>
-      <w:r>
-        <w:rPr>
-          <w:rFonts w:ascii="Arial" w:hAnsi="Arial" w:cs="Arial"/>
-          <w:sz w:val="26"/>
-          <w:szCs w:val="26"/>
-          <w:lang w:bidi="he-IL"/>
-        </w:rPr>
-        <w:t xml:space="preserve"> == 'column</w:t>
+      <w:r>
+        <w:rPr>
+          <w:rFonts w:ascii="Arial" w:hAnsi="Arial" w:cs="Arial"/>
+          <w:sz w:val="26"/>
+          <w:szCs w:val="26"/>
+          <w:lang w:bidi="he-IL"/>
+        </w:rPr>
+        <w:t>elif page.layout == 'column</w:t>
       </w:r>
       <w:r>
         <w:rPr>
@@ -2589,7 +2178,6 @@
         </w:rPr>
         <w:t xml:space="preserve">{{ </w:t>
       </w:r>
-      <w:proofErr w:type="spellStart"/>
       <w:r>
         <w:rPr>
           <w:rFonts w:ascii="Arial" w:hAnsi="Arial" w:cs="Arial"/>
@@ -2599,7 +2187,6 @@
         </w:rPr>
         <w:t>page.photos</w:t>
       </w:r>
-      <w:proofErr w:type="spellEnd"/>
       <w:r>
         <w:rPr>
           <w:rFonts w:ascii="Arial" w:hAnsi="Arial" w:cs="Arial"/>
@@ -2632,7 +2219,6 @@
         </w:rPr>
         <w:t xml:space="preserve">{{ </w:t>
       </w:r>
-      <w:proofErr w:type="spellStart"/>
       <w:r>
         <w:rPr>
           <w:rFonts w:ascii="Arial" w:hAnsi="Arial" w:cs="Arial"/>
@@ -2642,7 +2228,6 @@
         </w:rPr>
         <w:t>page.photos</w:t>
       </w:r>
-      <w:proofErr w:type="spellEnd"/>
       <w:r>
         <w:rPr>
           <w:rFonts w:ascii="Arial" w:hAnsi="Arial" w:cs="Arial"/>
@@ -2716,7 +2301,6 @@
         </w:rPr>
         <w:t xml:space="preserve">{{ </w:t>
       </w:r>
-      <w:proofErr w:type="spellStart"/>
       <w:r>
         <w:rPr>
           <w:rFonts w:ascii="Arial" w:hAnsi="Arial" w:cs="Arial"/>
@@ -2726,7 +2310,6 @@
         </w:rPr>
         <w:t>page.photos</w:t>
       </w:r>
-      <w:proofErr w:type="spellEnd"/>
       <w:r>
         <w:rPr>
           <w:rFonts w:ascii="Arial" w:hAnsi="Arial" w:cs="Arial"/>
@@ -2800,7 +2383,6 @@
         </w:rPr>
         <w:t xml:space="preserve">{% </w:t>
       </w:r>
-      <w:proofErr w:type="spellStart"/>
       <w:r>
         <w:rPr>
           <w:rFonts w:ascii="Arial" w:hAnsi="Arial" w:cs="Arial"/>
@@ -2810,7 +2392,6 @@
         </w:rPr>
         <w:t>endfor</w:t>
       </w:r>
-      <w:proofErr w:type="spellEnd"/>
       <w:r>
         <w:rPr>
           <w:rFonts w:ascii="Arial" w:hAnsi="Arial" w:cs="Arial"/>
@@ -2867,7 +2448,16 @@
           <w:rtl/>
           <w:lang w:bidi="he-IL"/>
         </w:rPr>
-        <w:t xml:space="preserve"> הנפגע זוהה ע</w:t>
+        <w:t xml:space="preserve"> </w:t>
+      </w:r>
+      <w:r>
+        <w:rPr>
+          <w:rFonts w:ascii="Arial" w:hAnsi="Arial" w:cs="Arial"/>
+          <w:sz w:val="26"/>
+          <w:szCs w:val="26"/>
+          <w:lang w:bidi="he-IL"/>
+        </w:rPr>
+        <w:t>{{lex.injured}}</w:t>
       </w:r>
       <w:r>
         <w:rPr>
@@ -2877,6 +2467,16 @@
           <w:rtl/>
           <w:lang w:bidi="he-IL"/>
         </w:rPr>
+        <w:t xml:space="preserve"> זוהה ע</w:t>
+      </w:r>
+      <w:r>
+        <w:rPr>
+          <w:rFonts w:ascii="Arial" w:hAnsi="Arial" w:cs="Arial" w:hint="cs"/>
+          <w:sz w:val="26"/>
+          <w:szCs w:val="26"/>
+          <w:rtl/>
+          <w:lang w:bidi="he-IL"/>
+        </w:rPr>
         <w:t xml:space="preserve">פ"י </w:t>
       </w:r>
       <w:r>
@@ -2886,36 +2486,16 @@
           <w:szCs w:val="26"/>
           <w:lang w:bidi="he-IL"/>
         </w:rPr>
-        <w:t>{{</w:t>
-      </w:r>
-      <w:proofErr w:type="spellStart"/>
-      <w:r>
-        <w:rPr>
-          <w:rFonts w:ascii="Arial" w:hAnsi="Arial" w:cs="Arial"/>
-          <w:sz w:val="26"/>
-          <w:szCs w:val="26"/>
-          <w:lang w:bidi="he-IL"/>
-        </w:rPr>
-        <w:t>db.social_media</w:t>
-      </w:r>
-      <w:r>
-        <w:rPr>
-          <w:rFonts w:ascii="Arial" w:hAnsi="Arial" w:cs="Arial"/>
-          <w:sz w:val="26"/>
-          <w:szCs w:val="26"/>
-          <w:lang w:bidi="he-IL"/>
-        </w:rPr>
-        <w:t>_identification</w:t>
-      </w:r>
-      <w:proofErr w:type="spellEnd"/>
-      <w:r>
-        <w:rPr>
-          <w:rFonts w:ascii="Arial" w:hAnsi="Arial" w:cs="Arial"/>
-          <w:sz w:val="26"/>
-          <w:szCs w:val="26"/>
-          <w:lang w:bidi="he-IL"/>
-        </w:rPr>
-        <w:t>}}</w:t>
+        <w:t>{{db.social_media</w:t>
+      </w:r>
+      <w:r>
+        <w:rPr>
+          <w:rFonts w:ascii="Arial" w:hAnsi="Arial" w:cs="Arial"/>
+          <w:sz w:val="26"/>
+          <w:szCs w:val="26"/>
+          <w:lang w:bidi="he-IL"/>
+        </w:rPr>
+        <w:t>_identification}}</w:t>
       </w:r>
     </w:p>
     <w:p>
@@ -3006,42 +2586,83 @@
           <w:u w:val="single"/>
           <w:lang w:bidi="he-IL"/>
         </w:rPr>
-        <w:t>{{</w:t>
-      </w:r>
-      <w:proofErr w:type="spellStart"/>
-      <w:r>
-        <w:rPr>
-          <w:rFonts w:ascii="Arial" w:hAnsi="Arial" w:cs="Arial"/>
+        <w:t>{{db.tracking_date}}</w:t>
+      </w:r>
+      <w:r>
+        <w:rPr>
+          <w:rFonts w:ascii="Arial" w:hAnsi="Arial" w:cs="Arial" w:hint="cs"/>
           <w:b/>
           <w:bCs/>
           <w:sz w:val="26"/>
           <w:szCs w:val="26"/>
           <w:u w:val="single"/>
-          <w:lang w:bidi="he-IL"/>
-        </w:rPr>
-        <w:t>db.tracking_date</w:t>
-      </w:r>
-      <w:proofErr w:type="spellEnd"/>
-      <w:r>
-        <w:rPr>
-          <w:rFonts w:ascii="Arial" w:hAnsi="Arial" w:cs="Arial"/>
+          <w:rtl/>
+          <w:lang w:bidi="he-IL"/>
+        </w:rPr>
+        <w:t xml:space="preserve"> </w:t>
+      </w:r>
+      <w:r>
+        <w:rPr>
+          <w:rFonts w:ascii="Arial" w:hAnsi="Arial" w:cs="Arial" w:hint="cs"/>
           <w:b/>
           <w:bCs/>
           <w:sz w:val="26"/>
           <w:szCs w:val="26"/>
           <w:u w:val="single"/>
-          <w:lang w:bidi="he-IL"/>
-        </w:rPr>
-        <w:t>}}</w:t>
-      </w:r>
+          <w:rtl/>
+          <w:lang w:bidi="he-IL"/>
+        </w:rPr>
+        <w:t xml:space="preserve"> </w:t>
+      </w:r>
+    </w:p>
+    <w:p>
+      <w:pPr>
+        <w:rPr>
+          <w:rFonts w:ascii="Arial" w:hAnsi="Arial" w:cs="Arial"/>
+          <w:b/>
+          <w:bCs/>
+          <w:sz w:val="26"/>
+          <w:szCs w:val="26"/>
+          <w:u w:val="single"/>
+          <w:rtl/>
+          <w:lang w:val="en-ZA" w:bidi="he-IL"/>
+        </w:rPr>
+      </w:pPr>
+    </w:p>
+    <w:p>
+      <w:pPr>
+        <w:spacing w:line="360" w:lineRule="auto"/>
+        <w:rPr>
+          <w:rFonts w:ascii="Arial" w:hAnsi="Arial" w:cs="Arial"/>
+          <w:sz w:val="26"/>
+          <w:szCs w:val="26"/>
+          <w:lang w:bidi="he-IL"/>
+        </w:rPr>
+      </w:pPr>
       <w:r>
         <w:rPr>
           <w:rFonts w:ascii="Arial" w:hAnsi="Arial" w:cs="Arial" w:hint="cs"/>
-          <w:b/>
-          <w:bCs/>
-          <w:sz w:val="26"/>
-          <w:szCs w:val="26"/>
-          <w:u w:val="single"/>
+          <w:sz w:val="26"/>
+          <w:szCs w:val="26"/>
+          <w:rtl/>
+          <w:lang w:bidi="he-IL"/>
+        </w:rPr>
+        <w:t xml:space="preserve">  </w:t>
+      </w:r>
+      <w:r>
+        <w:rPr>
+          <w:rFonts w:ascii="Arial" w:hAnsi="Arial" w:cs="Arial"/>
+          <w:sz w:val="26"/>
+          <w:szCs w:val="26"/>
+          <w:lang w:bidi="he-IL"/>
+        </w:rPr>
+        <w:t>{{db.start_time}}</w:t>
+      </w:r>
+      <w:r>
+        <w:rPr>
+          <w:rFonts w:ascii="Arial" w:hAnsi="Arial" w:cs="Arial" w:hint="cs"/>
+          <w:sz w:val="26"/>
+          <w:szCs w:val="26"/>
           <w:rtl/>
           <w:lang w:bidi="he-IL"/>
         </w:rPr>
@@ -3049,132 +2670,34 @@
       </w:r>
       <w:r>
         <w:rPr>
+          <w:rFonts w:ascii="Arial" w:hAnsi="Arial" w:cs="Arial"/>
+          <w:sz w:val="26"/>
+          <w:szCs w:val="26"/>
+          <w:rtl/>
+          <w:lang w:bidi="he-IL"/>
+        </w:rPr>
+        <w:tab/>
+      </w:r>
+      <w:r>
+        <w:rPr>
           <w:rFonts w:ascii="Arial" w:hAnsi="Arial" w:cs="Arial" w:hint="cs"/>
-          <w:b/>
-          <w:bCs/>
-          <w:sz w:val="26"/>
-          <w:szCs w:val="26"/>
-          <w:u w:val="single"/>
+          <w:sz w:val="26"/>
+          <w:szCs w:val="26"/>
+          <w:rtl/>
+          <w:lang w:bidi="he-IL"/>
+        </w:rPr>
+        <w:t>תחילת פעילות.</w:t>
+      </w:r>
+      <w:r>
+        <w:rPr>
+          <w:rFonts w:ascii="Arial" w:hAnsi="Arial" w:cs="Arial" w:hint="cs"/>
+          <w:sz w:val="26"/>
+          <w:szCs w:val="26"/>
           <w:rtl/>
           <w:lang w:bidi="he-IL"/>
         </w:rPr>
         <w:t xml:space="preserve"> </w:t>
       </w:r>
-    </w:p>
-    <w:p>
-      <w:pPr>
-        <w:rPr>
-          <w:rFonts w:ascii="Arial" w:hAnsi="Arial" w:cs="Arial"/>
-          <w:b/>
-          <w:bCs/>
-          <w:sz w:val="26"/>
-          <w:szCs w:val="26"/>
-          <w:u w:val="single"/>
-          <w:rtl/>
-          <w:lang w:val="en-ZA" w:bidi="he-IL"/>
-        </w:rPr>
-      </w:pPr>
-    </w:p>
-    <w:p>
-      <w:pPr>
-        <w:spacing w:line="360" w:lineRule="auto"/>
-        <w:rPr>
-          <w:rFonts w:ascii="Arial" w:hAnsi="Arial" w:cs="Arial"/>
-          <w:sz w:val="26"/>
-          <w:szCs w:val="26"/>
-          <w:lang w:bidi="he-IL"/>
-        </w:rPr>
-      </w:pPr>
-      <w:r>
-        <w:rPr>
-          <w:rFonts w:ascii="Arial" w:hAnsi="Arial" w:cs="Arial" w:hint="cs"/>
-          <w:sz w:val="26"/>
-          <w:szCs w:val="26"/>
-          <w:rtl/>
-          <w:lang w:bidi="he-IL"/>
-        </w:rPr>
-        <w:t xml:space="preserve">  </w:t>
-      </w:r>
-      <w:r>
-        <w:rPr>
-          <w:rFonts w:ascii="Arial" w:hAnsi="Arial" w:cs="Arial"/>
-          <w:sz w:val="26"/>
-          <w:szCs w:val="26"/>
-          <w:lang w:bidi="he-IL"/>
-        </w:rPr>
-        <w:t>{{</w:t>
-      </w:r>
-      <w:proofErr w:type="spellStart"/>
-      <w:proofErr w:type="gramStart"/>
-      <w:r>
-        <w:rPr>
-          <w:rFonts w:ascii="Arial" w:hAnsi="Arial" w:cs="Arial"/>
-          <w:sz w:val="26"/>
-          <w:szCs w:val="26"/>
-          <w:lang w:bidi="he-IL"/>
-        </w:rPr>
-        <w:t>db.start</w:t>
-      </w:r>
-      <w:proofErr w:type="gramEnd"/>
-      <w:r>
-        <w:rPr>
-          <w:rFonts w:ascii="Arial" w:hAnsi="Arial" w:cs="Arial"/>
-          <w:sz w:val="26"/>
-          <w:szCs w:val="26"/>
-          <w:lang w:bidi="he-IL"/>
-        </w:rPr>
-        <w:t>_time</w:t>
-      </w:r>
-      <w:proofErr w:type="spellEnd"/>
-      <w:r>
-        <w:rPr>
-          <w:rFonts w:ascii="Arial" w:hAnsi="Arial" w:cs="Arial"/>
-          <w:sz w:val="26"/>
-          <w:szCs w:val="26"/>
-          <w:lang w:bidi="he-IL"/>
-        </w:rPr>
-        <w:t>}}</w:t>
-      </w:r>
-      <w:r>
-        <w:rPr>
-          <w:rFonts w:ascii="Arial" w:hAnsi="Arial" w:cs="Arial" w:hint="cs"/>
-          <w:sz w:val="26"/>
-          <w:szCs w:val="26"/>
-          <w:rtl/>
-          <w:lang w:bidi="he-IL"/>
-        </w:rPr>
-        <w:t xml:space="preserve"> </w:t>
-      </w:r>
-      <w:r>
-        <w:rPr>
-          <w:rFonts w:ascii="Arial" w:hAnsi="Arial" w:cs="Arial"/>
-          <w:sz w:val="26"/>
-          <w:szCs w:val="26"/>
-          <w:rtl/>
-          <w:lang w:bidi="he-IL"/>
-        </w:rPr>
-        <w:tab/>
-      </w:r>
-      <w:r>
-        <w:rPr>
-          <w:rFonts w:ascii="Arial" w:hAnsi="Arial" w:cs="Arial" w:hint="cs"/>
-          <w:sz w:val="26"/>
-          <w:szCs w:val="26"/>
-          <w:rtl/>
-          <w:lang w:bidi="he-IL"/>
-        </w:rPr>
-        <w:t>תחילת פעילות.</w:t>
-      </w:r>
-      <w:r>
-        <w:rPr>
-          <w:rFonts w:ascii="Arial" w:hAnsi="Arial" w:cs="Arial" w:hint="cs"/>
-          <w:sz w:val="26"/>
-          <w:szCs w:val="26"/>
-          <w:rtl/>
-          <w:lang w:bidi="he-IL"/>
-        </w:rPr>
-        <w:t xml:space="preserve"> </w:t>
-      </w:r>
       <w:r>
         <w:rPr>
           <w:rFonts w:ascii="Arial" w:hAnsi="Arial" w:cs="Arial"/>
@@ -3201,19 +2724,8 @@
           <w:szCs w:val="26"/>
           <w:lang w:bidi="he-IL"/>
         </w:rPr>
-        <w:t xml:space="preserve">for row in </w:t>
-      </w:r>
-      <w:proofErr w:type="spellStart"/>
-      <w:r>
-        <w:rPr>
-          <w:rFonts w:ascii="Arial" w:hAnsi="Arial" w:cs="Arial"/>
-          <w:sz w:val="26"/>
-          <w:szCs w:val="26"/>
-          <w:lang w:bidi="he-IL"/>
-        </w:rPr>
-        <w:t>tracking_rows</w:t>
-      </w:r>
-      <w:proofErr w:type="spellEnd"/>
+        <w:t>for row in tracking_rows</w:t>
+      </w:r>
       <w:r>
         <w:rPr>
           <w:rFonts w:ascii="Arial" w:hAnsi="Arial" w:cs="Arial"/>
@@ -3271,7 +2783,6 @@
               </w:rPr>
               <w:t xml:space="preserve">{{ </w:t>
             </w:r>
-            <w:proofErr w:type="spellStart"/>
             <w:r>
               <w:rPr>
                 <w:rFonts w:ascii="Arial" w:hAnsi="Arial" w:cs="Arial"/>
@@ -3281,7 +2792,6 @@
               </w:rPr>
               <w:t>row.time</w:t>
             </w:r>
-            <w:proofErr w:type="spellEnd"/>
             <w:r>
               <w:rPr>
                 <w:rFonts w:ascii="Arial" w:hAnsi="Arial" w:cs="Arial"/>
@@ -3318,7 +2828,6 @@
               </w:rPr>
               <w:t xml:space="preserve">{{ </w:t>
             </w:r>
-            <w:proofErr w:type="spellStart"/>
             <w:r>
               <w:rPr>
                 <w:rFonts w:ascii="Arial" w:hAnsi="Arial" w:cs="Arial"/>
@@ -3328,7 +2837,6 @@
               </w:rPr>
               <w:t>row.text</w:t>
             </w:r>
-            <w:proofErr w:type="spellEnd"/>
             <w:r>
               <w:rPr>
                 <w:rFonts w:ascii="Arial" w:hAnsi="Arial" w:cs="Arial"/>
@@ -3364,7 +2872,6 @@
         </w:rPr>
         <w:t xml:space="preserve">{% </w:t>
       </w:r>
-      <w:proofErr w:type="spellStart"/>
       <w:r>
         <w:rPr>
           <w:rFonts w:ascii="Arial" w:hAnsi="Arial" w:cs="Arial"/>
@@ -3374,7 +2881,6 @@
         </w:rPr>
         <w:t>endfor</w:t>
       </w:r>
-      <w:proofErr w:type="spellEnd"/>
       <w:r>
         <w:rPr>
           <w:rFonts w:ascii="Arial" w:hAnsi="Arial" w:cs="Arial"/>
@@ -3413,18 +2919,8 @@
           <w:sz w:val="26"/>
           <w:szCs w:val="26"/>
         </w:rPr>
-        <w:t>{{</w:t>
-      </w:r>
-      <w:proofErr w:type="spellStart"/>
-      <w:r>
-        <w:rPr>
-          <w:rFonts w:asciiTheme="minorBidi" w:hAnsiTheme="minorBidi"/>
-          <w:sz w:val="26"/>
-          <w:szCs w:val="26"/>
-        </w:rPr>
-        <w:t>db.end_time</w:t>
-      </w:r>
-      <w:proofErr w:type="spellEnd"/>
+        <w:t>{{db.end_time</w:t>
+      </w:r>
       <w:r>
         <w:rPr>
           <w:rFonts w:asciiTheme="minorBidi" w:hAnsiTheme="minorBidi"/>
@@ -3569,29 +3065,7 @@
           <w:szCs w:val="26"/>
           <w:lang w:bidi="he-IL"/>
         </w:rPr>
-        <w:t>{{</w:t>
-      </w:r>
-      <w:proofErr w:type="spellStart"/>
-      <w:proofErr w:type="gramStart"/>
-      <w:r>
-        <w:rPr>
-          <w:rFonts w:ascii="Arial" w:hAnsi="Arial" w:cs="Arial"/>
-          <w:sz w:val="26"/>
-          <w:szCs w:val="26"/>
-          <w:lang w:bidi="he-IL"/>
-        </w:rPr>
-        <w:t>db.summary</w:t>
-      </w:r>
-      <w:proofErr w:type="spellEnd"/>
-      <w:proofErr w:type="gramEnd"/>
-      <w:r>
-        <w:rPr>
-          <w:rFonts w:ascii="Arial" w:hAnsi="Arial" w:cs="Arial"/>
-          <w:sz w:val="26"/>
-          <w:szCs w:val="26"/>
-          <w:lang w:bidi="he-IL"/>
-        </w:rPr>
-        <w:t>}}</w:t>
+        <w:t>{{db.summary}}</w:t>
       </w:r>
       <w:r>
         <w:rPr>
@@ -5409,7 +4883,6 @@
   <w:style w:type="character" w:default="1" w:styleId="DefaultParagraphFont">
     <w:name w:val="Default Paragraph Font"/>
     <w:uiPriority w:val="1"/>
-    <w:semiHidden/>
     <w:unhideWhenUsed/>
   </w:style>
   <w:style w:type="table" w:default="1" w:styleId="TableNormal">
@@ -5803,6 +5276,33 @@
       </w:tblBorders>
     </w:tblPr>
   </w:style>
+  <w:style w:type="paragraph" w:styleId="HTMLPreformatted">
+    <w:name w:val="HTML Preformatted"/>
+    <w:basedOn w:val="Normal"/>
+    <w:link w:val="HTMLPreformattedChar"/>
+    <w:uiPriority w:val="99"/>
+    <w:semiHidden/>
+    <w:unhideWhenUsed/>
+    <w:rsid w:val="00AA0A7F"/>
+    <w:rPr>
+      <w:rFonts w:ascii="Consolas" w:hAnsi="Consolas"/>
+      <w:sz w:val="20"/>
+      <w:szCs w:val="20"/>
+    </w:rPr>
+  </w:style>
+  <w:style w:type="character" w:customStyle="1" w:styleId="HTMLPreformattedChar">
+    <w:name w:val="HTML Preformatted Char"/>
+    <w:basedOn w:val="DefaultParagraphFont"/>
+    <w:link w:val="HTMLPreformatted"/>
+    <w:uiPriority w:val="99"/>
+    <w:semiHidden/>
+    <w:rsid w:val="00AA0A7F"/>
+    <w:rPr>
+      <w:rFonts w:ascii="Consolas" w:hAnsi="Consolas"/>
+      <w:sz w:val="20"/>
+      <w:szCs w:val="20"/>
+    </w:rPr>
+  </w:style>
 </w:styles>
 </file>
 

</xml_diff>

<commit_message>
Include investigator report in the final report
</commit_message>
<xml_diff>
--- a/app/docx_templates/menora_life_followup.docx
+++ b/app/docx_templates/menora_life_followup.docx
@@ -145,19 +145,49 @@
         </w:rPr>
         <w:t xml:space="preserve">{{ </w:t>
       </w:r>
-      <w:r>
-        <w:rPr>
-          <w:rFonts w:ascii="Arial" w:eastAsia="Times New Roman" w:hAnsi="Arial" w:cs="Arial"/>
-          <w:b/>
-          <w:bCs/>
-          <w:kern w:val="0"/>
-          <w:sz w:val="26"/>
-          <w:szCs w:val="26"/>
-          <w:lang w:eastAsia="he-IL" w:bidi="he-IL"/>
-          <w14:ligatures w14:val="none"/>
-        </w:rPr>
-        <w:t>reference_no or db.ref_number</w:t>
-      </w:r>
+      <w:proofErr w:type="spellStart"/>
+      <w:r>
+        <w:rPr>
+          <w:rFonts w:ascii="Arial" w:eastAsia="Times New Roman" w:hAnsi="Arial" w:cs="Arial"/>
+          <w:b/>
+          <w:bCs/>
+          <w:kern w:val="0"/>
+          <w:sz w:val="26"/>
+          <w:szCs w:val="26"/>
+          <w:lang w:eastAsia="he-IL" w:bidi="he-IL"/>
+          <w14:ligatures w14:val="none"/>
+        </w:rPr>
+        <w:t>reference_no</w:t>
+      </w:r>
+      <w:proofErr w:type="spellEnd"/>
+      <w:r>
+        <w:rPr>
+          <w:rFonts w:ascii="Arial" w:eastAsia="Times New Roman" w:hAnsi="Arial" w:cs="Arial"/>
+          <w:b/>
+          <w:bCs/>
+          <w:kern w:val="0"/>
+          <w:sz w:val="26"/>
+          <w:szCs w:val="26"/>
+          <w:lang w:eastAsia="he-IL" w:bidi="he-IL"/>
+          <w14:ligatures w14:val="none"/>
+        </w:rPr>
+        <w:t xml:space="preserve"> or </w:t>
+      </w:r>
+      <w:proofErr w:type="spellStart"/>
+      <w:r>
+        <w:rPr>
+          <w:rFonts w:ascii="Arial" w:eastAsia="Times New Roman" w:hAnsi="Arial" w:cs="Arial"/>
+          <w:b/>
+          <w:bCs/>
+          <w:kern w:val="0"/>
+          <w:sz w:val="26"/>
+          <w:szCs w:val="26"/>
+          <w:lang w:eastAsia="he-IL" w:bidi="he-IL"/>
+          <w14:ligatures w14:val="none"/>
+        </w:rPr>
+        <w:t>db.ref_number</w:t>
+      </w:r>
+      <w:proofErr w:type="spellEnd"/>
       <w:r>
         <w:rPr>
           <w:rFonts w:ascii="Arial" w:eastAsia="Times New Roman" w:hAnsi="Arial" w:cs="Arial"/>
@@ -439,7 +469,31 @@
           <w:lang w:eastAsia="he-IL" w:bidi="he-IL"/>
           <w14:ligatures w14:val="none"/>
         </w:rPr>
-        <w:t>{{lex.injured}}</w:t>
+        <w:t>{{</w:t>
+      </w:r>
+      <w:proofErr w:type="spellStart"/>
+      <w:r>
+        <w:rPr>
+          <w:rFonts w:ascii="Arial" w:eastAsia="Times New Roman" w:hAnsi="Arial" w:cs="Arial"/>
+          <w:kern w:val="0"/>
+          <w:sz w:val="26"/>
+          <w:szCs w:val="26"/>
+          <w:lang w:eastAsia="he-IL" w:bidi="he-IL"/>
+          <w14:ligatures w14:val="none"/>
+        </w:rPr>
+        <w:t>lex.injured</w:t>
+      </w:r>
+      <w:proofErr w:type="spellEnd"/>
+      <w:r>
+        <w:rPr>
+          <w:rFonts w:ascii="Arial" w:eastAsia="Times New Roman" w:hAnsi="Arial" w:cs="Arial"/>
+          <w:kern w:val="0"/>
+          <w:sz w:val="26"/>
+          <w:szCs w:val="26"/>
+          <w:lang w:eastAsia="he-IL" w:bidi="he-IL"/>
+          <w14:ligatures w14:val="none"/>
+        </w:rPr>
+        <w:t>}}</w:t>
       </w:r>
       <w:r>
         <w:rPr>
@@ -498,7 +552,31 @@
           <w:lang w:eastAsia="he-IL" w:bidi="he-IL"/>
           <w14:ligatures w14:val="none"/>
         </w:rPr>
-        <w:t>{{db.full_name}}</w:t>
+        <w:t>{{</w:t>
+      </w:r>
+      <w:proofErr w:type="spellStart"/>
+      <w:r>
+        <w:rPr>
+          <w:rFonts w:ascii="Arial" w:eastAsia="Times New Roman" w:hAnsi="Arial" w:cs="Arial"/>
+          <w:kern w:val="0"/>
+          <w:sz w:val="26"/>
+          <w:szCs w:val="26"/>
+          <w:lang w:eastAsia="he-IL" w:bidi="he-IL"/>
+          <w14:ligatures w14:val="none"/>
+        </w:rPr>
+        <w:t>db.full_name</w:t>
+      </w:r>
+      <w:proofErr w:type="spellEnd"/>
+      <w:r>
+        <w:rPr>
+          <w:rFonts w:ascii="Arial" w:eastAsia="Times New Roman" w:hAnsi="Arial" w:cs="Arial"/>
+          <w:kern w:val="0"/>
+          <w:sz w:val="26"/>
+          <w:szCs w:val="26"/>
+          <w:lang w:eastAsia="he-IL" w:bidi="he-IL"/>
+          <w14:ligatures w14:val="none"/>
+        </w:rPr>
+        <w:t>}}</w:t>
       </w:r>
       <w:r>
         <w:rPr>
@@ -521,7 +599,31 @@
           <w:lang w:eastAsia="he-IL" w:bidi="he-IL"/>
           <w14:ligatures w14:val="none"/>
         </w:rPr>
-        <w:t>{{db.address}}</w:t>
+        <w:t>{{</w:t>
+      </w:r>
+      <w:proofErr w:type="spellStart"/>
+      <w:r>
+        <w:rPr>
+          <w:rFonts w:ascii="Arial" w:eastAsia="Times New Roman" w:hAnsi="Arial" w:cs="Arial"/>
+          <w:kern w:val="0"/>
+          <w:sz w:val="26"/>
+          <w:szCs w:val="26"/>
+          <w:lang w:eastAsia="he-IL" w:bidi="he-IL"/>
+          <w14:ligatures w14:val="none"/>
+        </w:rPr>
+        <w:t>db.address</w:t>
+      </w:r>
+      <w:proofErr w:type="spellEnd"/>
+      <w:r>
+        <w:rPr>
+          <w:rFonts w:ascii="Arial" w:eastAsia="Times New Roman" w:hAnsi="Arial" w:cs="Arial"/>
+          <w:kern w:val="0"/>
+          <w:sz w:val="26"/>
+          <w:szCs w:val="26"/>
+          <w:lang w:eastAsia="he-IL" w:bidi="he-IL"/>
+          <w14:ligatures w14:val="none"/>
+        </w:rPr>
+        <w:t>}}</w:t>
       </w:r>
       <w:r>
         <w:rPr>
@@ -532,7 +634,31 @@
           <w:lang w:val="en-ZA" w:eastAsia="he-IL" w:bidi="he-IL"/>
           <w14:ligatures w14:val="none"/>
         </w:rPr>
-        <w:t xml:space="preserve">  {{db.city}}</w:t>
+        <w:t xml:space="preserve">  {{</w:t>
+      </w:r>
+      <w:proofErr w:type="spellStart"/>
+      <w:r>
+        <w:rPr>
+          <w:rFonts w:ascii="Arial" w:eastAsia="Times New Roman" w:hAnsi="Arial" w:cs="Arial"/>
+          <w:kern w:val="0"/>
+          <w:sz w:val="26"/>
+          <w:szCs w:val="26"/>
+          <w:lang w:val="en-ZA" w:eastAsia="he-IL" w:bidi="he-IL"/>
+          <w14:ligatures w14:val="none"/>
+        </w:rPr>
+        <w:t>db.city</w:t>
+      </w:r>
+      <w:proofErr w:type="spellEnd"/>
+      <w:r>
+        <w:rPr>
+          <w:rFonts w:ascii="Arial" w:eastAsia="Times New Roman" w:hAnsi="Arial" w:cs="Arial"/>
+          <w:kern w:val="0"/>
+          <w:sz w:val="26"/>
+          <w:szCs w:val="26"/>
+          <w:lang w:val="en-ZA" w:eastAsia="he-IL" w:bidi="he-IL"/>
+          <w14:ligatures w14:val="none"/>
+        </w:rPr>
+        <w:t>}}</w:t>
       </w:r>
     </w:p>
     <w:p>
@@ -630,7 +756,31 @@
           <w:lang w:eastAsia="he-IL" w:bidi="he-IL"/>
           <w14:ligatures w14:val="none"/>
         </w:rPr>
-        <w:t>{{db.id_number}}</w:t>
+        <w:t>{{</w:t>
+      </w:r>
+      <w:proofErr w:type="spellStart"/>
+      <w:r>
+        <w:rPr>
+          <w:rFonts w:ascii="Arial" w:eastAsia="Times New Roman" w:hAnsi="Arial" w:cs="Arial"/>
+          <w:kern w:val="0"/>
+          <w:sz w:val="26"/>
+          <w:szCs w:val="26"/>
+          <w:lang w:eastAsia="he-IL" w:bidi="he-IL"/>
+          <w14:ligatures w14:val="none"/>
+        </w:rPr>
+        <w:t>db.id_number</w:t>
+      </w:r>
+      <w:proofErr w:type="spellEnd"/>
+      <w:r>
+        <w:rPr>
+          <w:rFonts w:ascii="Arial" w:eastAsia="Times New Roman" w:hAnsi="Arial" w:cs="Arial"/>
+          <w:kern w:val="0"/>
+          <w:sz w:val="26"/>
+          <w:szCs w:val="26"/>
+          <w:lang w:eastAsia="he-IL" w:bidi="he-IL"/>
+          <w14:ligatures w14:val="none"/>
+        </w:rPr>
+        <w:t>}}</w:t>
       </w:r>
     </w:p>
     <w:p>
@@ -728,7 +878,31 @@
           <w:lang w:eastAsia="he-IL" w:bidi="he-IL"/>
           <w14:ligatures w14:val="none"/>
         </w:rPr>
-        <w:t>{{db.claim_number}}</w:t>
+        <w:t>{{</w:t>
+      </w:r>
+      <w:proofErr w:type="spellStart"/>
+      <w:r>
+        <w:rPr>
+          <w:rFonts w:ascii="Arial" w:eastAsia="Times New Roman" w:hAnsi="Arial" w:cs="Arial"/>
+          <w:kern w:val="0"/>
+          <w:sz w:val="26"/>
+          <w:szCs w:val="26"/>
+          <w:lang w:eastAsia="he-IL" w:bidi="he-IL"/>
+          <w14:ligatures w14:val="none"/>
+        </w:rPr>
+        <w:t>db.claim_number</w:t>
+      </w:r>
+      <w:proofErr w:type="spellEnd"/>
+      <w:r>
+        <w:rPr>
+          <w:rFonts w:ascii="Arial" w:eastAsia="Times New Roman" w:hAnsi="Arial" w:cs="Arial"/>
+          <w:kern w:val="0"/>
+          <w:sz w:val="26"/>
+          <w:szCs w:val="26"/>
+          <w:lang w:eastAsia="he-IL" w:bidi="he-IL"/>
+          <w14:ligatures w14:val="none"/>
+        </w:rPr>
+        <w:t>}}</w:t>
       </w:r>
       <w:r>
         <w:rPr>
@@ -878,6 +1052,7 @@
         <w:tab/>
         <w:t xml:space="preserve">  :  {{ </w:t>
       </w:r>
+      <w:proofErr w:type="spellStart"/>
       <w:r>
         <w:rPr>
           <w:rFonts w:ascii="Arial" w:eastAsia="Times New Roman" w:hAnsi="Arial" w:cs="Arial"/>
@@ -887,8 +1062,33 @@
           <w:lang w:eastAsia="he-IL"/>
           <w14:ligatures w14:val="none"/>
         </w:rPr>
-        <w:t>ctx.injury_type or db.injury_type</w:t>
-      </w:r>
+        <w:t>ctx.injury_type</w:t>
+      </w:r>
+      <w:proofErr w:type="spellEnd"/>
+      <w:r>
+        <w:rPr>
+          <w:rFonts w:ascii="Arial" w:eastAsia="Times New Roman" w:hAnsi="Arial" w:cs="Arial"/>
+          <w:kern w:val="0"/>
+          <w:sz w:val="26"/>
+          <w:szCs w:val="26"/>
+          <w:lang w:eastAsia="he-IL"/>
+          <w14:ligatures w14:val="none"/>
+        </w:rPr>
+        <w:t xml:space="preserve"> or </w:t>
+      </w:r>
+      <w:proofErr w:type="spellStart"/>
+      <w:r>
+        <w:rPr>
+          <w:rFonts w:ascii="Arial" w:eastAsia="Times New Roman" w:hAnsi="Arial" w:cs="Arial"/>
+          <w:kern w:val="0"/>
+          <w:sz w:val="26"/>
+          <w:szCs w:val="26"/>
+          <w:lang w:eastAsia="he-IL"/>
+          <w14:ligatures w14:val="none"/>
+        </w:rPr>
+        <w:t>db.injury_type</w:t>
+      </w:r>
+      <w:proofErr w:type="spellEnd"/>
       <w:r>
         <w:rPr>
           <w:rFonts w:ascii="Arial" w:eastAsia="Times New Roman" w:hAnsi="Arial" w:cs="Arial"/>
@@ -1032,6 +1232,7 @@
         </w:rPr>
         <w:t xml:space="preserve">{{ </w:t>
       </w:r>
+      <w:proofErr w:type="spellStart"/>
       <w:r>
         <w:rPr>
           <w:rFonts w:ascii="Arial" w:eastAsia="Times New Roman" w:hAnsi="Arial" w:cs="Arial"/>
@@ -1043,6 +1244,7 @@
         </w:rPr>
         <w:t>db.phone</w:t>
       </w:r>
+      <w:proofErr w:type="spellEnd"/>
       <w:r>
         <w:rPr>
           <w:rFonts w:ascii="Arial" w:eastAsia="Times New Roman" w:hAnsi="Arial" w:cs="Arial"/>
@@ -1136,7 +1338,31 @@
           <w:lang w:eastAsia="he-IL" w:bidi="he-IL"/>
           <w14:ligatures w14:val="none"/>
         </w:rPr>
-        <w:t>{{lex.injured}}</w:t>
+        <w:t>{{</w:t>
+      </w:r>
+      <w:proofErr w:type="spellStart"/>
+      <w:r>
+        <w:rPr>
+          <w:rFonts w:ascii="Arial" w:eastAsia="Times New Roman" w:hAnsi="Arial" w:cs="Arial"/>
+          <w:kern w:val="0"/>
+          <w:sz w:val="26"/>
+          <w:szCs w:val="26"/>
+          <w:lang w:eastAsia="he-IL" w:bidi="he-IL"/>
+          <w14:ligatures w14:val="none"/>
+        </w:rPr>
+        <w:t>lex.injured</w:t>
+      </w:r>
+      <w:proofErr w:type="spellEnd"/>
+      <w:r>
+        <w:rPr>
+          <w:rFonts w:ascii="Arial" w:eastAsia="Times New Roman" w:hAnsi="Arial" w:cs="Arial"/>
+          <w:kern w:val="0"/>
+          <w:sz w:val="26"/>
+          <w:szCs w:val="26"/>
+          <w:lang w:eastAsia="he-IL" w:bidi="he-IL"/>
+          <w14:ligatures w14:val="none"/>
+        </w:rPr>
+        <w:t>}}</w:t>
       </w:r>
       <w:r>
         <w:rPr>
@@ -1169,6 +1395,7 @@
         </w:rPr>
         <w:t xml:space="preserve"> </w:t>
       </w:r>
+      <w:proofErr w:type="spellStart"/>
       <w:r>
         <w:rPr>
           <w:rFonts w:ascii="Arial" w:hAnsi="Arial" w:cs="Arial"/>
@@ -1178,6 +1405,7 @@
         </w:rPr>
         <w:t>pronoun_subj</w:t>
       </w:r>
+      <w:proofErr w:type="spellEnd"/>
     </w:p>
     <w:p>
       <w:pPr>
@@ -1216,7 +1444,27 @@
           <w:szCs w:val="26"/>
           <w:lang w:bidi="he-IL"/>
         </w:rPr>
-        <w:t>{{lex.work}}</w:t>
+        <w:t>{{</w:t>
+      </w:r>
+      <w:proofErr w:type="spellStart"/>
+      <w:r>
+        <w:rPr>
+          <w:rFonts w:ascii="Arial" w:hAnsi="Arial" w:cs="Arial"/>
+          <w:sz w:val="26"/>
+          <w:szCs w:val="26"/>
+          <w:lang w:bidi="he-IL"/>
+        </w:rPr>
+        <w:t>lex.work</w:t>
+      </w:r>
+      <w:proofErr w:type="spellEnd"/>
+      <w:r>
+        <w:rPr>
+          <w:rFonts w:ascii="Arial" w:hAnsi="Arial" w:cs="Arial"/>
+          <w:sz w:val="26"/>
+          <w:szCs w:val="26"/>
+          <w:lang w:bidi="he-IL"/>
+        </w:rPr>
+        <w:t>}}</w:t>
       </w:r>
       <w:r>
         <w:rPr>
@@ -1235,7 +1483,27 @@
           <w:szCs w:val="26"/>
           <w:lang w:bidi="he-IL"/>
         </w:rPr>
-        <w:t>{{lex.functioning}}</w:t>
+        <w:t>{{</w:t>
+      </w:r>
+      <w:proofErr w:type="spellStart"/>
+      <w:r>
+        <w:rPr>
+          <w:rFonts w:ascii="Arial" w:hAnsi="Arial" w:cs="Arial"/>
+          <w:sz w:val="26"/>
+          <w:szCs w:val="26"/>
+          <w:lang w:bidi="he-IL"/>
+        </w:rPr>
+        <w:t>lex.functioning</w:t>
+      </w:r>
+      <w:proofErr w:type="spellEnd"/>
+      <w:r>
+        <w:rPr>
+          <w:rFonts w:ascii="Arial" w:hAnsi="Arial" w:cs="Arial"/>
+          <w:sz w:val="26"/>
+          <w:szCs w:val="26"/>
+          <w:lang w:bidi="he-IL"/>
+        </w:rPr>
+        <w:t>}}</w:t>
       </w:r>
       <w:r>
         <w:rPr>
@@ -1369,7 +1637,27 @@
           <w:szCs w:val="26"/>
           <w:lang w:bidi="he-IL"/>
         </w:rPr>
-        <w:t>{{lex.injured}}</w:t>
+        <w:t>{{</w:t>
+      </w:r>
+      <w:proofErr w:type="spellStart"/>
+      <w:r>
+        <w:rPr>
+          <w:rFonts w:ascii="Arial" w:hAnsi="Arial" w:cs="Arial"/>
+          <w:sz w:val="26"/>
+          <w:szCs w:val="26"/>
+          <w:lang w:bidi="he-IL"/>
+        </w:rPr>
+        <w:t>lex.injured</w:t>
+      </w:r>
+      <w:proofErr w:type="spellEnd"/>
+      <w:r>
+        <w:rPr>
+          <w:rFonts w:ascii="Arial" w:hAnsi="Arial" w:cs="Arial"/>
+          <w:sz w:val="26"/>
+          <w:szCs w:val="26"/>
+          <w:lang w:bidi="he-IL"/>
+        </w:rPr>
+        <w:t>}}</w:t>
       </w:r>
       <w:r>
         <w:rPr>
@@ -1388,7 +1676,27 @@
           <w:szCs w:val="26"/>
           <w:lang w:bidi="he-IL"/>
         </w:rPr>
-        <w:t>{{lex.born_word}}</w:t>
+        <w:t>{{</w:t>
+      </w:r>
+      <w:proofErr w:type="spellStart"/>
+      <w:r>
+        <w:rPr>
+          <w:rFonts w:ascii="Arial" w:hAnsi="Arial" w:cs="Arial"/>
+          <w:sz w:val="26"/>
+          <w:szCs w:val="26"/>
+          <w:lang w:bidi="he-IL"/>
+        </w:rPr>
+        <w:t>lex.born_word</w:t>
+      </w:r>
+      <w:proofErr w:type="spellEnd"/>
+      <w:r>
+        <w:rPr>
+          <w:rFonts w:ascii="Arial" w:hAnsi="Arial" w:cs="Arial"/>
+          <w:sz w:val="26"/>
+          <w:szCs w:val="26"/>
+          <w:lang w:bidi="he-IL"/>
+        </w:rPr>
+        <w:t>}}</w:t>
       </w:r>
       <w:r>
         <w:rPr>
@@ -1407,7 +1715,27 @@
           <w:szCs w:val="26"/>
           <w:lang w:bidi="he-IL"/>
         </w:rPr>
-        <w:t>{{ db.birth_year }}</w:t>
+        <w:t xml:space="preserve">{{ </w:t>
+      </w:r>
+      <w:proofErr w:type="spellStart"/>
+      <w:r>
+        <w:rPr>
+          <w:rFonts w:ascii="Arial" w:hAnsi="Arial" w:cs="Arial"/>
+          <w:sz w:val="26"/>
+          <w:szCs w:val="26"/>
+          <w:lang w:bidi="he-IL"/>
+        </w:rPr>
+        <w:t>db.birth_year</w:t>
+      </w:r>
+      <w:proofErr w:type="spellEnd"/>
+      <w:r>
+        <w:rPr>
+          <w:rFonts w:ascii="Arial" w:hAnsi="Arial" w:cs="Arial"/>
+          <w:sz w:val="26"/>
+          <w:szCs w:val="26"/>
+          <w:lang w:bidi="he-IL"/>
+        </w:rPr>
+        <w:t xml:space="preserve"> }}</w:t>
       </w:r>
       <w:r>
         <w:rPr>
@@ -1439,6 +1767,7 @@
         </w:rPr>
         <w:t xml:space="preserve">{{ </w:t>
       </w:r>
+      <w:proofErr w:type="spellStart"/>
       <w:r>
         <w:rPr>
           <w:rFonts w:ascii="Arial" w:hAnsi="Arial" w:cs="Arial"/>
@@ -1448,6 +1777,7 @@
         </w:rPr>
         <w:t>db.background</w:t>
       </w:r>
+      <w:proofErr w:type="spellEnd"/>
       <w:r>
         <w:rPr>
           <w:rFonts w:ascii="Arial" w:hAnsi="Arial" w:cs="Arial"/>
@@ -1571,6 +1901,7 @@
         </w:rPr>
         <w:t xml:space="preserve">{{ </w:t>
       </w:r>
+      <w:proofErr w:type="spellStart"/>
       <w:r>
         <w:rPr>
           <w:rFonts w:ascii="Arial" w:hAnsi="Arial" w:cs="Arial"/>
@@ -1580,6 +1911,7 @@
         </w:rPr>
         <w:t>db.occupation</w:t>
       </w:r>
+      <w:proofErr w:type="spellEnd"/>
       <w:r>
         <w:rPr>
           <w:rFonts w:ascii="Arial" w:hAnsi="Arial" w:cs="Arial"/>
@@ -1700,6 +2032,7 @@
         </w:rPr>
         <w:t xml:space="preserve">{{ </w:t>
       </w:r>
+      <w:proofErr w:type="spellStart"/>
       <w:r>
         <w:rPr>
           <w:rFonts w:ascii="Arial" w:hAnsi="Arial" w:cs="Arial"/>
@@ -1709,6 +2042,7 @@
         </w:rPr>
         <w:t>authorities_table_photo</w:t>
       </w:r>
+      <w:proofErr w:type="spellEnd"/>
       <w:r>
         <w:rPr>
           <w:rFonts w:ascii="Arial" w:hAnsi="Arial" w:cs="Arial"/>
@@ -1749,7 +2083,27 @@
           <w:szCs w:val="26"/>
           <w:lang w:bidi="he-IL"/>
         </w:rPr>
-        <w:t>{{db.dnb}}</w:t>
+        <w:t>{{</w:t>
+      </w:r>
+      <w:proofErr w:type="spellStart"/>
+      <w:r>
+        <w:rPr>
+          <w:rFonts w:ascii="Arial" w:hAnsi="Arial" w:cs="Arial"/>
+          <w:sz w:val="26"/>
+          <w:szCs w:val="26"/>
+          <w:lang w:bidi="he-IL"/>
+        </w:rPr>
+        <w:t>db.dnb</w:t>
+      </w:r>
+      <w:proofErr w:type="spellEnd"/>
+      <w:r>
+        <w:rPr>
+          <w:rFonts w:ascii="Arial" w:hAnsi="Arial" w:cs="Arial"/>
+          <w:sz w:val="26"/>
+          <w:szCs w:val="26"/>
+          <w:lang w:bidi="he-IL"/>
+        </w:rPr>
+        <w:t>}}</w:t>
       </w:r>
     </w:p>
     <w:p>
@@ -1963,7 +2317,27 @@
           <w:szCs w:val="26"/>
           <w:lang w:bidi="he-IL"/>
         </w:rPr>
-        <w:t>{{db.social_media}}</w:t>
+        <w:t>{{</w:t>
+      </w:r>
+      <w:proofErr w:type="spellStart"/>
+      <w:r>
+        <w:rPr>
+          <w:rFonts w:ascii="Arial" w:hAnsi="Arial" w:cs="Arial"/>
+          <w:sz w:val="26"/>
+          <w:szCs w:val="26"/>
+          <w:lang w:bidi="he-IL"/>
+        </w:rPr>
+        <w:t>db.social_media</w:t>
+      </w:r>
+      <w:proofErr w:type="spellEnd"/>
+      <w:r>
+        <w:rPr>
+          <w:rFonts w:ascii="Arial" w:hAnsi="Arial" w:cs="Arial"/>
+          <w:sz w:val="26"/>
+          <w:szCs w:val="26"/>
+          <w:lang w:bidi="he-IL"/>
+        </w:rPr>
+        <w:t>}}</w:t>
       </w:r>
       <w:r>
         <w:rPr>
@@ -2003,8 +2377,19 @@
           <w:szCs w:val="26"/>
           <w:lang w:bidi="he-IL"/>
         </w:rPr>
-        <w:t>for page in photo_pages</w:t>
-      </w:r>
+        <w:t xml:space="preserve">for page in </w:t>
+      </w:r>
+      <w:proofErr w:type="spellStart"/>
+      <w:r>
+        <w:rPr>
+          <w:rFonts w:ascii="Arial" w:hAnsi="Arial" w:cs="Arial"/>
+          <w:sz w:val="26"/>
+          <w:szCs w:val="26"/>
+          <w:lang w:bidi="he-IL"/>
+        </w:rPr>
+        <w:t>photo_pages</w:t>
+      </w:r>
+      <w:proofErr w:type="spellEnd"/>
       <w:r>
         <w:rPr>
           <w:rFonts w:ascii="Arial" w:hAnsi="Arial" w:cs="Arial"/>
@@ -2044,7 +2429,27 @@
           <w:szCs w:val="26"/>
           <w:lang w:bidi="he-IL"/>
         </w:rPr>
-        <w:t>if page.layout == 'row</w:t>
+        <w:t xml:space="preserve">if </w:t>
+      </w:r>
+      <w:proofErr w:type="spellStart"/>
+      <w:r>
+        <w:rPr>
+          <w:rFonts w:ascii="Arial" w:hAnsi="Arial" w:cs="Arial"/>
+          <w:sz w:val="26"/>
+          <w:szCs w:val="26"/>
+          <w:lang w:bidi="he-IL"/>
+        </w:rPr>
+        <w:t>page.layout</w:t>
+      </w:r>
+      <w:proofErr w:type="spellEnd"/>
+      <w:r>
+        <w:rPr>
+          <w:rFonts w:ascii="Arial" w:hAnsi="Arial" w:cs="Arial"/>
+          <w:sz w:val="26"/>
+          <w:szCs w:val="26"/>
+          <w:lang w:bidi="he-IL"/>
+        </w:rPr>
+        <w:t xml:space="preserve"> == 'row</w:t>
       </w:r>
       <w:r>
         <w:rPr>
@@ -2075,8 +2480,19 @@
           <w:szCs w:val="26"/>
           <w:lang w:bidi="he-IL"/>
         </w:rPr>
-        <w:t>{{ page.photos</w:t>
-      </w:r>
+        <w:t xml:space="preserve">{{ </w:t>
+      </w:r>
+      <w:proofErr w:type="spellStart"/>
+      <w:r>
+        <w:rPr>
+          <w:rFonts w:ascii="Arial" w:hAnsi="Arial" w:cs="Arial"/>
+          <w:sz w:val="26"/>
+          <w:szCs w:val="26"/>
+          <w:lang w:bidi="he-IL"/>
+        </w:rPr>
+        <w:t>page.photos</w:t>
+      </w:r>
+      <w:proofErr w:type="spellEnd"/>
       <w:r>
         <w:rPr>
           <w:rFonts w:ascii="Arial" w:hAnsi="Arial" w:cs="Arial"/>
@@ -2094,8 +2510,19 @@
           <w:szCs w:val="26"/>
           <w:lang w:bidi="he-IL"/>
         </w:rPr>
-        <w:t>}} {{ page.photos</w:t>
-      </w:r>
+        <w:t xml:space="preserve">}} {{ </w:t>
+      </w:r>
+      <w:proofErr w:type="spellStart"/>
+      <w:r>
+        <w:rPr>
+          <w:rFonts w:ascii="Arial" w:hAnsi="Arial" w:cs="Arial"/>
+          <w:sz w:val="26"/>
+          <w:szCs w:val="26"/>
+          <w:lang w:bidi="he-IL"/>
+        </w:rPr>
+        <w:t>page.photos</w:t>
+      </w:r>
+      <w:proofErr w:type="spellEnd"/>
       <w:r>
         <w:rPr>
           <w:rFonts w:ascii="Arial" w:hAnsi="Arial" w:cs="Arial"/>
@@ -2137,14 +2564,45 @@
         </w:rPr>
         <w:t xml:space="preserve">{% </w:t>
       </w:r>
-      <w:r>
-        <w:rPr>
-          <w:rFonts w:ascii="Arial" w:hAnsi="Arial" w:cs="Arial"/>
-          <w:sz w:val="26"/>
-          <w:szCs w:val="26"/>
-          <w:lang w:bidi="he-IL"/>
-        </w:rPr>
-        <w:t>elif page.layout == 'column</w:t>
+      <w:proofErr w:type="spellStart"/>
+      <w:r>
+        <w:rPr>
+          <w:rFonts w:ascii="Arial" w:hAnsi="Arial" w:cs="Arial"/>
+          <w:sz w:val="26"/>
+          <w:szCs w:val="26"/>
+          <w:lang w:bidi="he-IL"/>
+        </w:rPr>
+        <w:t>elif</w:t>
+      </w:r>
+      <w:proofErr w:type="spellEnd"/>
+      <w:r>
+        <w:rPr>
+          <w:rFonts w:ascii="Arial" w:hAnsi="Arial" w:cs="Arial"/>
+          <w:sz w:val="26"/>
+          <w:szCs w:val="26"/>
+          <w:lang w:bidi="he-IL"/>
+        </w:rPr>
+        <w:t xml:space="preserve"> </w:t>
+      </w:r>
+      <w:proofErr w:type="spellStart"/>
+      <w:r>
+        <w:rPr>
+          <w:rFonts w:ascii="Arial" w:hAnsi="Arial" w:cs="Arial"/>
+          <w:sz w:val="26"/>
+          <w:szCs w:val="26"/>
+          <w:lang w:bidi="he-IL"/>
+        </w:rPr>
+        <w:t>page.layout</w:t>
+      </w:r>
+      <w:proofErr w:type="spellEnd"/>
+      <w:r>
+        <w:rPr>
+          <w:rFonts w:ascii="Arial" w:hAnsi="Arial" w:cs="Arial"/>
+          <w:sz w:val="26"/>
+          <w:szCs w:val="26"/>
+          <w:lang w:bidi="he-IL"/>
+        </w:rPr>
+        <w:t xml:space="preserve"> == 'column</w:t>
       </w:r>
       <w:r>
         <w:rPr>
@@ -2178,6 +2636,7 @@
         </w:rPr>
         <w:t xml:space="preserve">{{ </w:t>
       </w:r>
+      <w:proofErr w:type="spellStart"/>
       <w:r>
         <w:rPr>
           <w:rFonts w:ascii="Arial" w:hAnsi="Arial" w:cs="Arial"/>
@@ -2187,6 +2646,7 @@
         </w:rPr>
         <w:t>page.photos</w:t>
       </w:r>
+      <w:proofErr w:type="spellEnd"/>
       <w:r>
         <w:rPr>
           <w:rFonts w:ascii="Arial" w:hAnsi="Arial" w:cs="Arial"/>
@@ -2219,6 +2679,7 @@
         </w:rPr>
         <w:t xml:space="preserve">{{ </w:t>
       </w:r>
+      <w:proofErr w:type="spellStart"/>
       <w:r>
         <w:rPr>
           <w:rFonts w:ascii="Arial" w:hAnsi="Arial" w:cs="Arial"/>
@@ -2228,6 +2689,7 @@
         </w:rPr>
         <w:t>page.photos</w:t>
       </w:r>
+      <w:proofErr w:type="spellEnd"/>
       <w:r>
         <w:rPr>
           <w:rFonts w:ascii="Arial" w:hAnsi="Arial" w:cs="Arial"/>
@@ -2301,6 +2763,7 @@
         </w:rPr>
         <w:t xml:space="preserve">{{ </w:t>
       </w:r>
+      <w:proofErr w:type="spellStart"/>
       <w:r>
         <w:rPr>
           <w:rFonts w:ascii="Arial" w:hAnsi="Arial" w:cs="Arial"/>
@@ -2310,6 +2773,7 @@
         </w:rPr>
         <w:t>page.photos</w:t>
       </w:r>
+      <w:proofErr w:type="spellEnd"/>
       <w:r>
         <w:rPr>
           <w:rFonts w:ascii="Arial" w:hAnsi="Arial" w:cs="Arial"/>
@@ -2383,6 +2847,7 @@
         </w:rPr>
         <w:t xml:space="preserve">{% </w:t>
       </w:r>
+      <w:proofErr w:type="spellStart"/>
       <w:r>
         <w:rPr>
           <w:rFonts w:ascii="Arial" w:hAnsi="Arial" w:cs="Arial"/>
@@ -2392,6 +2857,7 @@
         </w:rPr>
         <w:t>endfor</w:t>
       </w:r>
+      <w:proofErr w:type="spellEnd"/>
       <w:r>
         <w:rPr>
           <w:rFonts w:ascii="Arial" w:hAnsi="Arial" w:cs="Arial"/>
@@ -2457,7 +2923,27 @@
           <w:szCs w:val="26"/>
           <w:lang w:bidi="he-IL"/>
         </w:rPr>
-        <w:t>{{lex.injured}}</w:t>
+        <w:t>{{</w:t>
+      </w:r>
+      <w:proofErr w:type="spellStart"/>
+      <w:r>
+        <w:rPr>
+          <w:rFonts w:ascii="Arial" w:hAnsi="Arial" w:cs="Arial"/>
+          <w:sz w:val="26"/>
+          <w:szCs w:val="26"/>
+          <w:lang w:bidi="he-IL"/>
+        </w:rPr>
+        <w:t>lex.injured</w:t>
+      </w:r>
+      <w:proofErr w:type="spellEnd"/>
+      <w:r>
+        <w:rPr>
+          <w:rFonts w:ascii="Arial" w:hAnsi="Arial" w:cs="Arial"/>
+          <w:sz w:val="26"/>
+          <w:szCs w:val="26"/>
+          <w:lang w:bidi="he-IL"/>
+        </w:rPr>
+        <w:t>}}</w:t>
       </w:r>
       <w:r>
         <w:rPr>
@@ -2486,16 +2972,36 @@
           <w:szCs w:val="26"/>
           <w:lang w:bidi="he-IL"/>
         </w:rPr>
-        <w:t>{{db.social_media</w:t>
-      </w:r>
-      <w:r>
-        <w:rPr>
-          <w:rFonts w:ascii="Arial" w:hAnsi="Arial" w:cs="Arial"/>
-          <w:sz w:val="26"/>
-          <w:szCs w:val="26"/>
-          <w:lang w:bidi="he-IL"/>
-        </w:rPr>
-        <w:t>_identification}}</w:t>
+        <w:t>{{</w:t>
+      </w:r>
+      <w:proofErr w:type="spellStart"/>
+      <w:r>
+        <w:rPr>
+          <w:rFonts w:ascii="Arial" w:hAnsi="Arial" w:cs="Arial"/>
+          <w:sz w:val="26"/>
+          <w:szCs w:val="26"/>
+          <w:lang w:bidi="he-IL"/>
+        </w:rPr>
+        <w:t>db.social_media</w:t>
+      </w:r>
+      <w:r>
+        <w:rPr>
+          <w:rFonts w:ascii="Arial" w:hAnsi="Arial" w:cs="Arial"/>
+          <w:sz w:val="26"/>
+          <w:szCs w:val="26"/>
+          <w:lang w:bidi="he-IL"/>
+        </w:rPr>
+        <w:t>_identification</w:t>
+      </w:r>
+      <w:proofErr w:type="spellEnd"/>
+      <w:r>
+        <w:rPr>
+          <w:rFonts w:ascii="Arial" w:hAnsi="Arial" w:cs="Arial"/>
+          <w:sz w:val="26"/>
+          <w:szCs w:val="26"/>
+          <w:lang w:bidi="he-IL"/>
+        </w:rPr>
+        <w:t>}}</w:t>
       </w:r>
     </w:p>
     <w:p>
@@ -2574,7 +3080,7 @@
           <w:rtl/>
           <w:lang w:bidi="he-IL"/>
         </w:rPr>
-        <w:t xml:space="preserve">ום </w:t>
+        <w:t>ום</w:t>
       </w:r>
       <w:r>
         <w:rPr>
@@ -2586,7 +3092,47 @@
           <w:u w:val="single"/>
           <w:lang w:bidi="he-IL"/>
         </w:rPr>
-        <w:t>{{db.tracking_date}}</w:t>
+        <w:t xml:space="preserve">  </w:t>
+      </w:r>
+      <w:r>
+        <w:rPr>
+          <w:rFonts w:ascii="Arial" w:hAnsi="Arial" w:cs="Arial"/>
+          <w:b/>
+          <w:bCs/>
+          <w:sz w:val="26"/>
+          <w:szCs w:val="26"/>
+          <w:u w:val="single"/>
+          <w:rtl/>
+          <w:lang w:bidi="he-IL"/>
+        </w:rPr>
+        <w:t xml:space="preserve">{{ </w:t>
+      </w:r>
+      <w:proofErr w:type="spellStart"/>
+      <w:r>
+        <w:rPr>
+          <w:rFonts w:ascii="Arial" w:hAnsi="Arial" w:cs="Arial"/>
+          <w:b/>
+          <w:bCs/>
+          <w:sz w:val="26"/>
+          <w:szCs w:val="26"/>
+          <w:u w:val="single"/>
+          <w:lang w:bidi="he-IL"/>
+        </w:rPr>
+        <w:t>tracking_date_ddmmyyyy</w:t>
+      </w:r>
+      <w:proofErr w:type="spellEnd"/>
+      <w:r>
+        <w:rPr>
+          <w:rFonts w:ascii="Arial" w:hAnsi="Arial" w:cs="Arial"/>
+          <w:b/>
+          <w:bCs/>
+          <w:sz w:val="26"/>
+          <w:szCs w:val="26"/>
+          <w:u w:val="single"/>
+          <w:rtl/>
+          <w:lang w:bidi="he-IL"/>
+        </w:rPr>
+        <w:t xml:space="preserve"> }}</w:t>
       </w:r>
       <w:r>
         <w:rPr>
@@ -2630,110 +3176,15 @@
       </w:pPr>
     </w:p>
     <w:p>
-      <w:pPr>
-        <w:spacing w:line="360" w:lineRule="auto"/>
-        <w:rPr>
-          <w:rFonts w:ascii="Arial" w:hAnsi="Arial" w:cs="Arial"/>
-          <w:sz w:val="26"/>
-          <w:szCs w:val="26"/>
-          <w:lang w:bidi="he-IL"/>
-        </w:rPr>
-      </w:pPr>
-      <w:r>
-        <w:rPr>
-          <w:rFonts w:ascii="Arial" w:hAnsi="Arial" w:cs="Arial" w:hint="cs"/>
-          <w:sz w:val="26"/>
-          <w:szCs w:val="26"/>
-          <w:rtl/>
-          <w:lang w:bidi="he-IL"/>
-        </w:rPr>
-        <w:t xml:space="preserve">  </w:t>
-      </w:r>
-      <w:r>
-        <w:rPr>
-          <w:rFonts w:ascii="Arial" w:hAnsi="Arial" w:cs="Arial"/>
-          <w:sz w:val="26"/>
-          <w:szCs w:val="26"/>
-          <w:lang w:bidi="he-IL"/>
-        </w:rPr>
-        <w:t>{{db.start_time}}</w:t>
-      </w:r>
-      <w:r>
-        <w:rPr>
-          <w:rFonts w:ascii="Arial" w:hAnsi="Arial" w:cs="Arial" w:hint="cs"/>
-          <w:sz w:val="26"/>
-          <w:szCs w:val="26"/>
-          <w:rtl/>
-          <w:lang w:bidi="he-IL"/>
-        </w:rPr>
-        <w:t xml:space="preserve"> </w:t>
-      </w:r>
-      <w:r>
-        <w:rPr>
-          <w:rFonts w:ascii="Arial" w:hAnsi="Arial" w:cs="Arial"/>
-          <w:sz w:val="26"/>
-          <w:szCs w:val="26"/>
-          <w:rtl/>
-          <w:lang w:bidi="he-IL"/>
-        </w:rPr>
-        <w:tab/>
-      </w:r>
-      <w:r>
-        <w:rPr>
-          <w:rFonts w:ascii="Arial" w:hAnsi="Arial" w:cs="Arial" w:hint="cs"/>
-          <w:sz w:val="26"/>
-          <w:szCs w:val="26"/>
-          <w:rtl/>
-          <w:lang w:bidi="he-IL"/>
-        </w:rPr>
-        <w:t>תחילת פעילות.</w:t>
-      </w:r>
-      <w:r>
-        <w:rPr>
-          <w:rFonts w:ascii="Arial" w:hAnsi="Arial" w:cs="Arial" w:hint="cs"/>
-          <w:sz w:val="26"/>
-          <w:szCs w:val="26"/>
-          <w:rtl/>
-          <w:lang w:bidi="he-IL"/>
-        </w:rPr>
-        <w:t xml:space="preserve"> </w:t>
-      </w:r>
-      <w:r>
-        <w:rPr>
-          <w:rFonts w:ascii="Arial" w:hAnsi="Arial" w:cs="Arial"/>
-          <w:sz w:val="26"/>
-          <w:szCs w:val="26"/>
-          <w:lang w:bidi="he-IL"/>
-        </w:rPr>
-        <w:br/>
-      </w:r>
-      <w:r>
-        <w:rPr>
-          <w:rFonts w:ascii="Arial" w:hAnsi="Arial" w:cs="Arial"/>
-          <w:sz w:val="26"/>
-          <w:szCs w:val="26"/>
-          <w:rtl/>
-          <w:lang w:bidi="he-IL"/>
-        </w:rPr>
-        <w:t xml:space="preserve">{% </w:t>
-      </w:r>
-      <w:r>
-        <w:rPr>
-          <w:rFonts w:ascii="Arial" w:hAnsi="Arial" w:cs="Arial"/>
-          <w:sz w:val="26"/>
-          <w:szCs w:val="26"/>
-          <w:lang w:bidi="he-IL"/>
-        </w:rPr>
-        <w:t>for row in tracking_rows</w:t>
-      </w:r>
-      <w:r>
-        <w:rPr>
-          <w:rFonts w:ascii="Arial" w:hAnsi="Arial" w:cs="Arial"/>
-          <w:sz w:val="26"/>
-          <w:szCs w:val="26"/>
-          <w:rtl/>
-          <w:lang w:bidi="he-IL"/>
-        </w:rPr>
+      <w:r>
+        <w:t xml:space="preserve">{% for row in </w:t>
+      </w:r>
+      <w:proofErr w:type="spellStart"/>
+      <w:r>
+        <w:t>tracking_rows</w:t>
+      </w:r>
+      <w:proofErr w:type="spellEnd"/>
+      <w:r>
         <w:t xml:space="preserve"> %}</w:t>
       </w:r>
     </w:p>
@@ -2783,6 +3234,7 @@
               </w:rPr>
               <w:t xml:space="preserve">{{ </w:t>
             </w:r>
+            <w:proofErr w:type="spellStart"/>
             <w:r>
               <w:rPr>
                 <w:rFonts w:ascii="Arial" w:hAnsi="Arial" w:cs="Arial"/>
@@ -2792,6 +3244,7 @@
               </w:rPr>
               <w:t>row.time</w:t>
             </w:r>
+            <w:proofErr w:type="spellEnd"/>
             <w:r>
               <w:rPr>
                 <w:rFonts w:ascii="Arial" w:hAnsi="Arial" w:cs="Arial"/>
@@ -2828,6 +3281,7 @@
               </w:rPr>
               <w:t xml:space="preserve">{{ </w:t>
             </w:r>
+            <w:proofErr w:type="spellStart"/>
             <w:r>
               <w:rPr>
                 <w:rFonts w:ascii="Arial" w:hAnsi="Arial" w:cs="Arial"/>
@@ -2837,6 +3291,7 @@
               </w:rPr>
               <w:t>row.text</w:t>
             </w:r>
+            <w:proofErr w:type="spellEnd"/>
             <w:r>
               <w:rPr>
                 <w:rFonts w:ascii="Arial" w:hAnsi="Arial" w:cs="Arial"/>
@@ -2872,6 +3327,7 @@
         </w:rPr>
         <w:t xml:space="preserve">{% </w:t>
       </w:r>
+      <w:proofErr w:type="spellStart"/>
       <w:r>
         <w:rPr>
           <w:rFonts w:ascii="Arial" w:hAnsi="Arial" w:cs="Arial"/>
@@ -2881,6 +3337,7 @@
         </w:rPr>
         <w:t>endfor</w:t>
       </w:r>
+      <w:proofErr w:type="spellEnd"/>
       <w:r>
         <w:rPr>
           <w:rFonts w:ascii="Arial" w:hAnsi="Arial" w:cs="Arial"/>
@@ -2898,97 +3355,6 @@
         <w:spacing w:line="360" w:lineRule="auto"/>
         <w:ind w:left="1440" w:hanging="1440"/>
         <w:rPr>
-          <w:rFonts w:asciiTheme="minorBidi" w:hAnsiTheme="minorBidi"/>
-          <w:sz w:val="26"/>
-          <w:szCs w:val="26"/>
-          <w:rtl/>
-        </w:rPr>
-      </w:pPr>
-      <w:r>
-        <w:rPr>
-          <w:rFonts w:asciiTheme="minorBidi" w:hAnsiTheme="minorBidi" w:hint="cs"/>
-          <w:sz w:val="26"/>
-          <w:szCs w:val="26"/>
-          <w:rtl/>
-        </w:rPr>
-        <w:t xml:space="preserve">   </w:t>
-      </w:r>
-      <w:r>
-        <w:rPr>
-          <w:rFonts w:asciiTheme="minorBidi" w:hAnsiTheme="minorBidi"/>
-          <w:sz w:val="26"/>
-          <w:szCs w:val="26"/>
-        </w:rPr>
-        <w:t>{{db.end_time</w:t>
-      </w:r>
-      <w:r>
-        <w:rPr>
-          <w:rFonts w:asciiTheme="minorBidi" w:hAnsiTheme="minorBidi"/>
-          <w:sz w:val="26"/>
-          <w:szCs w:val="26"/>
-        </w:rPr>
-        <w:t>}}</w:t>
-      </w:r>
-      <w:r>
-        <w:rPr>
-          <w:rFonts w:asciiTheme="minorBidi" w:hAnsiTheme="minorBidi"/>
-          <w:sz w:val="26"/>
-          <w:szCs w:val="26"/>
-          <w:rtl/>
-        </w:rPr>
-        <w:t xml:space="preserve"> </w:t>
-      </w:r>
-      <w:r>
-        <w:rPr>
-          <w:rFonts w:asciiTheme="minorBidi" w:hAnsiTheme="minorBidi"/>
-          <w:sz w:val="26"/>
-          <w:szCs w:val="26"/>
-          <w:rtl/>
-        </w:rPr>
-        <w:tab/>
-      </w:r>
-      <w:r>
-        <w:rPr>
-          <w:rFonts w:asciiTheme="minorBidi" w:hAnsiTheme="minorBidi"/>
-          <w:sz w:val="26"/>
-          <w:szCs w:val="26"/>
-          <w:rtl/>
-        </w:rPr>
-        <w:t>סיום במשרד</w:t>
-      </w:r>
-      <w:r>
-        <w:rPr>
-          <w:rFonts w:asciiTheme="minorBidi" w:hAnsiTheme="minorBidi" w:hint="cs"/>
-          <w:sz w:val="26"/>
-          <w:szCs w:val="26"/>
-          <w:rtl/>
-        </w:rPr>
-        <w:t>.</w:t>
-      </w:r>
-      <w:r>
-        <w:rPr>
-          <w:rFonts w:asciiTheme="minorBidi" w:hAnsiTheme="minorBidi" w:hint="cs"/>
-          <w:sz w:val="26"/>
-          <w:szCs w:val="26"/>
-          <w:rtl/>
-        </w:rPr>
-        <w:t xml:space="preserve"> </w:t>
-      </w:r>
-      <w:r>
-        <w:rPr>
-          <w:rFonts w:asciiTheme="minorBidi" w:hAnsiTheme="minorBidi"/>
-          <w:sz w:val="26"/>
-          <w:szCs w:val="26"/>
-        </w:rPr>
-        <w:br/>
-      </w:r>
-    </w:p>
-    <w:p>
-      <w:pPr>
-        <w:pStyle w:val="NoSpacing"/>
-        <w:spacing w:line="360" w:lineRule="auto"/>
-        <w:ind w:left="1440" w:hanging="1440"/>
-        <w:rPr>
           <w:rFonts w:asciiTheme="minorHAnsi" w:hAnsiTheme="minorHAnsi" w:cstheme="minorHAnsi"/>
           <w:b/>
           <w:bCs/>
@@ -3065,7 +3431,27 @@
           <w:szCs w:val="26"/>
           <w:lang w:bidi="he-IL"/>
         </w:rPr>
-        <w:t>{{db.summary}}</w:t>
+        <w:t>{{</w:t>
+      </w:r>
+      <w:proofErr w:type="spellStart"/>
+      <w:r>
+        <w:rPr>
+          <w:rFonts w:ascii="Arial" w:hAnsi="Arial" w:cs="Arial"/>
+          <w:sz w:val="26"/>
+          <w:szCs w:val="26"/>
+          <w:lang w:bidi="he-IL"/>
+        </w:rPr>
+        <w:t>db.summary</w:t>
+      </w:r>
+      <w:proofErr w:type="spellEnd"/>
+      <w:r>
+        <w:rPr>
+          <w:rFonts w:ascii="Arial" w:hAnsi="Arial" w:cs="Arial"/>
+          <w:sz w:val="26"/>
+          <w:szCs w:val="26"/>
+          <w:lang w:bidi="he-IL"/>
+        </w:rPr>
+        <w:t>}}</w:t>
       </w:r>
       <w:r>
         <w:rPr>
@@ -4883,6 +5269,7 @@
   <w:style w:type="character" w:default="1" w:styleId="DefaultParagraphFont">
     <w:name w:val="Default Paragraph Font"/>
     <w:uiPriority w:val="1"/>
+    <w:semiHidden/>
     <w:unhideWhenUsed/>
   </w:style>
   <w:style w:type="table" w:default="1" w:styleId="TableNormal">

</xml_diff>